<commit_message>
extra aanpassingen gemaakt aan bestand
</commit_message>
<xml_diff>
--- a/O&O/Water raket verslag.docx
+++ b/O&O/Water raket verslag.docx
@@ -2155,7 +2155,6 @@
               <w:pStyle w:val="Text"/>
               <w:rPr>
                 <w:noProof w:val="0"/>
-                <w:lang w:val="en-IE"/>
               </w:rPr>
             </w:pPr>
           </w:p>
@@ -2169,7 +2168,6 @@
             <w:pPr>
               <w:rPr>
                 <w:noProof w:val="0"/>
-                <w:lang w:val="en-IE"/>
               </w:rPr>
             </w:pPr>
           </w:p>
@@ -2180,7 +2178,6 @@
       <w:pPr>
         <w:rPr>
           <w:noProof w:val="0"/>
-          <w:lang w:val="en-IE"/>
         </w:rPr>
       </w:pPr>
     </w:p>
@@ -2188,13 +2185,11 @@
       <w:pPr>
         <w:rPr>
           <w:noProof w:val="0"/>
-          <w:lang w:val="en-IE"/>
         </w:rPr>
       </w:pPr>
       <w:r>
         <w:rPr>
           <w:noProof w:val="0"/>
-          <w:lang w:val="en-IE"/>
         </w:rPr>
         <w:br w:type="page"/>
       </w:r>
@@ -2203,7 +2198,6 @@
       <w:pPr>
         <w:rPr>
           <w:noProof w:val="0"/>
-          <w:lang w:val="en-IE"/>
         </w:rPr>
       </w:pPr>
     </w:p>
@@ -2234,7 +2228,6 @@
               <w:pStyle w:val="GraphicAnchor"/>
               <w:rPr>
                 <w:noProof w:val="0"/>
-                <w:lang w:val="en-IE"/>
               </w:rPr>
             </w:pPr>
           </w:p>
@@ -2251,7 +2244,6 @@
             <w:pPr>
               <w:rPr>
                 <w:noProof w:val="0"/>
-                <w:lang w:val="en-IE"/>
               </w:rPr>
             </w:pPr>
           </w:p>
@@ -2266,7 +2258,6 @@
             <w:pPr>
               <w:rPr>
                 <w:noProof w:val="0"/>
-                <w:lang w:val="en-IE"/>
               </w:rPr>
             </w:pPr>
           </w:p>
@@ -2286,7 +2277,6 @@
             <w:pPr>
               <w:rPr>
                 <w:noProof w:val="0"/>
-                <w:lang w:val="en-IE"/>
               </w:rPr>
             </w:pPr>
           </w:p>
@@ -2412,6 +2402,110 @@
         <w:br w:type="page"/>
       </w:r>
     </w:p>
+    <w:tbl>
+      <w:tblPr>
+        <w:tblStyle w:val="PlainTable2"/>
+        <w:tblpPr w:leftFromText="141" w:rightFromText="141" w:vertAnchor="text" w:horzAnchor="margin" w:tblpY="-148"/>
+        <w:tblW w:w="10800" w:type="dxa"/>
+        <w:tblLook w:val="04A0" w:firstRow="1" w:lastRow="0" w:firstColumn="1" w:lastColumn="0" w:noHBand="0" w:noVBand="1"/>
+      </w:tblPr>
+      <w:tblGrid>
+        <w:gridCol w:w="709"/>
+        <w:gridCol w:w="9356"/>
+        <w:gridCol w:w="735"/>
+      </w:tblGrid>
+      <w:tr>
+        <w:trPr>
+          <w:cnfStyle w:val="100000000000" w:firstRow="1" w:lastRow="0" w:firstColumn="0" w:lastColumn="0" w:oddVBand="0" w:evenVBand="0" w:oddHBand="0" w:evenHBand="0" w:firstRowFirstColumn="0" w:firstRowLastColumn="0" w:lastRowFirstColumn="0" w:lastRowLastColumn="0"/>
+          <w:trHeight w:val="13702"/>
+        </w:trPr>
+        <w:tc>
+          <w:tcPr>
+            <w:cnfStyle w:val="001000000000" w:firstRow="0" w:lastRow="0" w:firstColumn="1" w:lastColumn="0" w:oddVBand="0" w:evenVBand="0" w:oddHBand="0" w:evenHBand="0" w:firstRowFirstColumn="0" w:firstRowLastColumn="0" w:lastRowFirstColumn="0" w:lastRowLastColumn="0"/>
+            <w:tcW w:w="709" w:type="dxa"/>
+            <w:tcBorders>
+              <w:top w:val="single" w:sz="12" w:space="0" w:color="00C1C7" w:themeColor="accent2"/>
+              <w:bottom w:val="single" w:sz="12" w:space="0" w:color="00C1C7" w:themeColor="accent2"/>
+            </w:tcBorders>
+            <w:shd w:val="clear" w:color="auto" w:fill="ECFBFB" w:themeFill="accent4"/>
+          </w:tcPr>
+          <w:p>
+            <w:pPr>
+              <w:tabs>
+                <w:tab w:val="left" w:pos="6530"/>
+              </w:tabs>
+            </w:pPr>
+          </w:p>
+        </w:tc>
+        <w:tc>
+          <w:tcPr>
+            <w:tcW w:w="9356" w:type="dxa"/>
+            <w:tcBorders>
+              <w:top w:val="single" w:sz="12" w:space="0" w:color="00C1C7" w:themeColor="accent2"/>
+              <w:bottom w:val="single" w:sz="12" w:space="0" w:color="00C1C7" w:themeColor="accent2"/>
+            </w:tcBorders>
+            <w:shd w:val="clear" w:color="auto" w:fill="ECFBFB" w:themeFill="accent4"/>
+          </w:tcPr>
+          <w:p>
+            <w:pPr>
+              <w:pStyle w:val="Heading5"/>
+              <w:outlineLvl w:val="4"/>
+              <w:cnfStyle w:val="100000000000" w:firstRow="1" w:lastRow="0" w:firstColumn="0" w:lastColumn="0" w:oddVBand="0" w:evenVBand="0" w:oddHBand="0" w:evenHBand="0" w:firstRowFirstColumn="0" w:firstRowLastColumn="0" w:lastRowFirstColumn="0" w:lastRowLastColumn="0"/>
+              <w:rPr>
+                <w:b/>
+                <w:bCs w:val="0"/>
+              </w:rPr>
+            </w:pPr>
+            <w:r>
+              <w:t>Discussie</w:t>
+            </w:r>
+          </w:p>
+          <w:p>
+            <w:pPr>
+              <w:pStyle w:val="Heading2"/>
+              <w:cnfStyle w:val="100000000000" w:firstRow="1" w:lastRow="0" w:firstColumn="0" w:lastColumn="0" w:oddVBand="0" w:evenVBand="0" w:oddHBand="0" w:evenHBand="0" w:firstRowFirstColumn="0" w:firstRowLastColumn="0" w:lastRowFirstColumn="0" w:lastRowLastColumn="0"/>
+            </w:pPr>
+            <w:r>
+              <w:t xml:space="preserve">Er kan nog wat beter met dit experiment. de resultaten kunnen verkeerd zijn omdat ik alleen met het blote oog keek naar de druk en het nogal lastig te zien was, een andere keer kan de druk mischien gemeten worden met een computer. Verder zouden meer verschilende experimenten beter zijn om de beste verhouding tussen water en </w:t>
+            </w:r>
+            <w:r>
+              <w:t xml:space="preserve">lucht. Ook waren de “kleren” die ik heb gemaakt voor de raket niet erg goed, ze waren erg zwaar en hadden veel beter gekund. </w:t>
+            </w:r>
+          </w:p>
+        </w:tc>
+        <w:tc>
+          <w:tcPr>
+            <w:tcW w:w="735" w:type="dxa"/>
+            <w:tcBorders>
+              <w:top w:val="single" w:sz="12" w:space="0" w:color="00C1C7" w:themeColor="accent2"/>
+              <w:bottom w:val="single" w:sz="12" w:space="0" w:color="00C1C7" w:themeColor="accent2"/>
+            </w:tcBorders>
+            <w:shd w:val="clear" w:color="auto" w:fill="ECFBFB" w:themeFill="accent4"/>
+          </w:tcPr>
+          <w:p>
+            <w:pPr>
+              <w:tabs>
+                <w:tab w:val="left" w:pos="6530"/>
+              </w:tabs>
+              <w:cnfStyle w:val="100000000000" w:firstRow="1" w:lastRow="0" w:firstColumn="0" w:lastColumn="0" w:oddVBand="0" w:evenVBand="0" w:oddHBand="0" w:evenHBand="0" w:firstRowFirstColumn="0" w:firstRowLastColumn="0" w:lastRowFirstColumn="0" w:lastRowLastColumn="0"/>
+            </w:pPr>
+          </w:p>
+        </w:tc>
+      </w:tr>
+    </w:tbl>
+    <w:p>
+      <w:pPr>
+        <w:rPr>
+          <w:noProof w:val="0"/>
+        </w:rPr>
+      </w:pPr>
+      <w:r>
+        <w:rPr>
+          <w:noProof w:val="0"/>
+        </w:rPr>
+        <w:br w:type="page"/>
+      </w:r>
+    </w:p>
     <w:p>
       <w:pPr>
         <w:rPr>
@@ -2447,13 +2541,13 @@
             <mc:AlternateContent>
               <mc:Choice Requires="wps">
                 <w:drawing>
-                  <wp:anchor distT="0" distB="0" distL="114300" distR="114300" simplePos="0" relativeHeight="251661312" behindDoc="1" locked="0" layoutInCell="1" allowOverlap="1" wp14:anchorId="2861E953" wp14:editId="403C9A7A">
+                  <wp:anchor distT="0" distB="0" distL="114300" distR="114300" simplePos="0" relativeHeight="251661312" behindDoc="1" locked="0" layoutInCell="1" allowOverlap="1" wp14:anchorId="2861E953" wp14:editId="5AC59BF6">
                     <wp:simplePos x="0" y="0"/>
                     <wp:positionH relativeFrom="column">
-                      <wp:posOffset>-5988776</wp:posOffset>
+                      <wp:posOffset>-5988685</wp:posOffset>
                     </wp:positionH>
                     <wp:positionV relativeFrom="paragraph">
-                      <wp:posOffset>-2942417</wp:posOffset>
+                      <wp:posOffset>-2941955</wp:posOffset>
                     </wp:positionV>
                     <wp:extent cx="7771130" cy="9039860"/>
                     <wp:effectExtent l="0" t="0" r="1270" b="8890"/>
@@ -2531,7 +2625,7 @@
               </mc:Choice>
               <mc:Fallback>
                 <w:pict>
-                  <v:shape w14:anchorId="69BC0AED" id="Shape" o:spid="_x0000_s1026" alt="&quot;&quot;" style="position:absolute;margin-left:-471.55pt;margin-top:-231.7pt;width:611.9pt;height:711.8pt;z-index:-251655168;visibility:visible;mso-wrap-style:square;mso-wrap-distance-left:9pt;mso-wrap-distance-top:0;mso-wrap-distance-right:9pt;mso-wrap-distance-bottom:0;mso-position-horizontal:absolute;mso-position-horizontal-relative:text;mso-position-vertical:absolute;mso-position-vertical-relative:text;v-text-anchor:middle" coordsize="21600,21600" o:gfxdata="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" path="m,14678r,6922l21600,3032,21600,,17075,,,14678xe" fillcolor="#123869 [3204]" stroked="f" strokeweight="1pt">
+                  <v:shape w14:anchorId="654B0228" id="Shape" o:spid="_x0000_s1026" alt="&quot;&quot;" style="position:absolute;margin-left:-471.55pt;margin-top:-231.65pt;width:611.9pt;height:711.8pt;z-index:-251655168;visibility:visible;mso-wrap-style:square;mso-wrap-distance-left:9pt;mso-wrap-distance-top:0;mso-wrap-distance-right:9pt;mso-wrap-distance-bottom:0;mso-position-horizontal:absolute;mso-position-horizontal-relative:text;mso-position-vertical:absolute;mso-position-vertical-relative:text;v-text-anchor:middle" coordsize="21600,21600" o:gfxdata="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" path="m,14678r,6922l21600,3032,21600,,17075,,,14678xe" fillcolor="#123869 [3204]" stroked="f" strokeweight="1pt">
                     <v:stroke miterlimit="4" joinstyle="miter"/>
                     <v:path arrowok="t" o:extrusionok="f" o:connecttype="custom" o:connectlocs="3885565,4519930;3885565,4519930;3885565,4519930;3885565,4519930" o:connectangles="0,90,180,270"/>
                   </v:shape>
@@ -2657,13 +2751,13 @@
         <mc:AlternateContent>
           <mc:Choice Requires="wps">
             <w:drawing>
-              <wp:anchor distT="0" distB="0" distL="114300" distR="114300" simplePos="0" relativeHeight="251663360" behindDoc="0" locked="0" layoutInCell="1" allowOverlap="1" wp14:anchorId="6A244843" wp14:editId="0E03F906">
+              <wp:anchor distT="0" distB="0" distL="114300" distR="114300" simplePos="0" relativeHeight="251663360" behindDoc="0" locked="0" layoutInCell="1" allowOverlap="1" wp14:anchorId="6A244843" wp14:editId="72A4C6D6">
                 <wp:simplePos x="0" y="0"/>
                 <wp:positionH relativeFrom="column">
-                  <wp:posOffset>4935922</wp:posOffset>
+                  <wp:posOffset>4841262</wp:posOffset>
                 </wp:positionH>
                 <wp:positionV relativeFrom="paragraph">
-                  <wp:posOffset>4518460</wp:posOffset>
+                  <wp:posOffset>4344605</wp:posOffset>
                 </wp:positionV>
                 <wp:extent cx="3908429" cy="7817837"/>
                 <wp:effectExtent l="0" t="0" r="0" b="0"/>
@@ -2729,7 +2823,7 @@
           </mc:Choice>
           <mc:Fallback>
             <w:pict>
-              <v:shape w14:anchorId="351E814B" id="Triangle" o:spid="_x0000_s1026" style="position:absolute;margin-left:388.65pt;margin-top:355.8pt;width:307.75pt;height:615.6pt;rotation:180;z-index:251663360;visibility:visible;mso-wrap-style:square;mso-wrap-distance-left:9pt;mso-wrap-distance-top:0;mso-wrap-distance-right:9pt;mso-wrap-distance-bottom:0;mso-position-horizontal:absolute;mso-position-horizontal-relative:text;mso-position-vertical:absolute;mso-position-vertical-relative:text;v-text-anchor:middle" coordsize="21600,21600" o:gfxdata="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" path="m,21600l21600,10802,,,,21600xe" fillcolor="#00c1c7 [3205]" stroked="f" strokeweight="1pt">
+              <v:shape w14:anchorId="0858B24B" id="Triangle" o:spid="_x0000_s1026" style="position:absolute;margin-left:381.2pt;margin-top:342.1pt;width:307.75pt;height:615.6pt;rotation:180;z-index:251663360;visibility:visible;mso-wrap-style:square;mso-wrap-distance-left:9pt;mso-wrap-distance-top:0;mso-wrap-distance-right:9pt;mso-wrap-distance-bottom:0;mso-position-horizontal:absolute;mso-position-horizontal-relative:text;mso-position-vertical:absolute;mso-position-vertical-relative:text;v-text-anchor:middle" coordsize="21600,21600" o:gfxdata="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" path="m,21600l21600,10802,,,,21600xe" fillcolor="#00c1c7 [3205]" stroked="f" strokeweight="1pt">
                 <v:stroke miterlimit="4" joinstyle="miter"/>
                 <v:path arrowok="t" o:extrusionok="f" o:connecttype="custom" o:connectlocs="1954215,3908919;1954215,3908919;1954215,3908919;1954215,3908919" o:connectangles="0,90,180,270"/>
               </v:shape>
@@ -2845,6 +2939,9 @@
     <w:pPr>
       <w:pStyle w:val="Footer"/>
     </w:pPr>
+    <w:r>
+      <w:t>Verslag Water raket</w:t>
+    </w:r>
     <w:r>
       <w:tab/>
     </w:r>
@@ -11863,6 +11960,7 @@
     <w:rsid w:val="003C427F"/>
     <w:rsid w:val="00467931"/>
     <w:rsid w:val="00623858"/>
+    <w:rsid w:val="00930A2C"/>
     <w:rsid w:val="00A33029"/>
     <w:rsid w:val="00AB4DBD"/>
     <w:rsid w:val="00E365B9"/>
@@ -12470,58 +12568,6 @@
       <w:color w:val="4472C4" w:themeColor="accent1"/>
       <w:sz w:val="80"/>
       <w:szCs w:val="32"/>
-      <w:lang w:eastAsia="en-US"/>
-    </w:rPr>
-  </w:style>
-  <w:style w:type="paragraph" w:customStyle="1" w:styleId="A6C4A299A3E847B2B27ADB49B7A6EA3D1">
-    <w:name w:val="A6C4A299A3E847B2B27ADB49B7A6EA3D1"/>
-    <w:rsid w:val="00623858"/>
-    <w:pPr>
-      <w:keepNext/>
-      <w:keepLines/>
-      <w:spacing w:after="0" w:line="240" w:lineRule="auto"/>
-      <w:outlineLvl w:val="2"/>
-    </w:pPr>
-    <w:rPr>
-      <w:rFonts w:asciiTheme="majorHAnsi" w:eastAsiaTheme="majorEastAsia" w:hAnsiTheme="majorHAnsi" w:cstheme="majorBidi"/>
-      <w:b/>
-      <w:noProof/>
-      <w:color w:val="4472C4" w:themeColor="accent1"/>
-      <w:sz w:val="36"/>
-      <w:szCs w:val="24"/>
-      <w:lang w:eastAsia="en-US"/>
-    </w:rPr>
-  </w:style>
-  <w:style w:type="paragraph" w:customStyle="1" w:styleId="FF27852C0CD84D74AA5BE155620A7BE51">
-    <w:name w:val="FF27852C0CD84D74AA5BE155620A7BE51"/>
-    <w:rsid w:val="00623858"/>
-    <w:pPr>
-      <w:spacing w:after="0" w:line="240" w:lineRule="auto"/>
-    </w:pPr>
-    <w:rPr>
-      <w:rFonts w:eastAsiaTheme="minorHAnsi"/>
-      <w:i/>
-      <w:noProof/>
-      <w:color w:val="000000" w:themeColor="text1"/>
-      <w:sz w:val="28"/>
-      <w:szCs w:val="24"/>
-      <w:lang w:eastAsia="en-US"/>
-    </w:rPr>
-  </w:style>
-  <w:style w:type="paragraph" w:customStyle="1" w:styleId="A57E7A6A4447477F9368D0926F4E218B1">
-    <w:name w:val="A57E7A6A4447477F9368D0926F4E218B1"/>
-    <w:rsid w:val="00623858"/>
-    <w:pPr>
-      <w:spacing w:after="0" w:line="192" w:lineRule="auto"/>
-      <w:jc w:val="center"/>
-    </w:pPr>
-    <w:rPr>
-      <w:rFonts w:asciiTheme="majorHAnsi" w:eastAsiaTheme="minorHAnsi" w:hAnsiTheme="majorHAnsi"/>
-      <w:iCs/>
-      <w:noProof/>
-      <w:color w:val="4472C4" w:themeColor="accent1"/>
-      <w:sz w:val="76"/>
-      <w:szCs w:val="24"/>
       <w:lang w:eastAsia="en-US"/>
     </w:rPr>
   </w:style>
@@ -13618,94 +13664,6 @@
 </file>
 
 <file path=customXml/item1.xml><?xml version="1.0" encoding="utf-8"?>
-<b:Sources xmlns:b="http://schemas.openxmlformats.org/officeDocument/2006/bibliography" xmlns="http://schemas.openxmlformats.org/officeDocument/2006/bibliography" SelectedStyle="\APASixthEditionOfficeOnline.xsl" StyleName="APA" Version="6">
-  <b:Source>
-    <b:Tag>bri21</b:Tag>
-    <b:SourceType>InternetSite</b:SourceType>
-    <b:Guid>{ED1782FF-1F14-425F-BC6D-27919EE46022}</b:Guid>
-    <b:Title>Google search results</b:Title>
-    <b:Year>2021</b:Year>
-    <b:Author>
-      <b:Author>
-        <b:NameList>
-          <b:Person>
-            <b:Last>page</b:Last>
-            <b:First>larry</b:First>
-          </b:Person>
-          <b:Person>
-            <b:Last>brin</b:Last>
-            <b:First>sergey</b:First>
-          </b:Person>
-        </b:NameList>
-      </b:Author>
-    </b:Author>
-    <b:InternetSiteTitle>Google.com</b:InternetSiteTitle>
-    <b:Month>Maart</b:Month>
-    <b:Day>28</b:Day>
-    <b:URL>https://www.google.com/search?q=hoe+maak+je+een+waterraket</b:URL>
-    <b:LCID>nl-NL</b:LCID>
-    <b:RefOrder>1</b:RefOrder>
-  </b:Source>
-  <b:Source>
-    <b:Tag>que17</b:Tag>
-    <b:SourceType>InternetSite</b:SourceType>
-    <b:Guid>{131D1F80-FEA3-42C2-9DB6-4D20EBE9D49B}</b:Guid>
-    <b:Author>
-      <b:Author>
-        <b:NameList>
-          <b:Person>
-            <b:Last>questjunior</b:Last>
-          </b:Person>
-        </b:NameList>
-      </b:Author>
-    </b:Author>
-    <b:Title>Hoe kan je met een fles een raket bouwen?</b:Title>
-    <b:InternetSiteTitle>Youtube</b:InternetSiteTitle>
-    <b:Year>2017</b:Year>
-    <b:Month>october</b:Month>
-    <b:Day>18</b:Day>
-    <b:URL>https://www.youtube.com/watch?v=5el3Gz3C0UY</b:URL>
-    <b:RefOrder>2</b:RefOrder>
-  </b:Source>
-  <b:Source>
-    <b:Tag>wat21</b:Tag>
-    <b:SourceType>InternetSite</b:SourceType>
-    <b:Guid>{A8BB1D49-F80D-423A-BC1B-E2FC52F5DF2F}</b:Guid>
-    <b:Title>Wikipedia water rocket</b:Title>
-    <b:InternetSiteTitle>wikipedia</b:InternetSiteTitle>
-    <b:Year>2021</b:Year>
-    <b:Month>january</b:Month>
-    <b:Day>21</b:Day>
-    <b:URL>https://en.wikipedia.org/wiki/Water_rocket</b:URL>
-    <b:RefOrder>3</b:RefOrder>
-  </b:Source>
-  <b:Source>
-    <b:Tag>Ber21</b:Tag>
-    <b:SourceType>Film</b:SourceType>
-    <b:Guid>{9DC2D7EB-F92D-4402-8299-E06EAF2A302B}</b:Guid>
-    <b:Title>Mijn videos van de lanceringen en opnames van de druk in de fles</b:Title>
-    <b:Year>2021</b:Year>
-    <b:Author>
-      <b:Director>
-        <b:NameList>
-          <b:Person>
-            <b:Last>Berntsen</b:Last>
-            <b:First>Ronan</b:First>
-          </b:Person>
-          <b:Person>
-            <b:Last>Mcgeever</b:Last>
-            <b:First>Anna</b:First>
-          </b:Person>
-        </b:NameList>
-      </b:Director>
-    </b:Author>
-    <b:URL>https://drive.google.com/drive/folders/15EyA3YFQfywEcrgkhPjYxRFPICLKvjt7?usp=sharing</b:URL>
-    <b:RefOrder>4</b:RefOrder>
-  </b:Source>
-</b:Sources>
-</file>
-
-<file path=customXml/item2.xml><?xml version="1.0" encoding="utf-8"?>
 <ct:contentTypeSchema xmlns:ct="http://schemas.microsoft.com/office/2006/metadata/contentType" xmlns:ma="http://schemas.microsoft.com/office/2006/metadata/properties/metaAttributes" ct:_="" ma:_="" ma:contentTypeName="Document" ma:contentTypeID="0x01010079F111ED35F8CC479449609E8A0923A6" ma:contentTypeVersion="12" ma:contentTypeDescription="Create a new document." ma:contentTypeScope="" ma:versionID="fa6e671f1cd7e4d96ff9652be322dd5e">
   <xsd:schema xmlns:xsd="http://www.w3.org/2001/XMLSchema" xmlns:xs="http://www.w3.org/2001/XMLSchema" xmlns:p="http://schemas.microsoft.com/office/2006/metadata/properties" xmlns:ns2="71af3243-3dd4-4a8d-8c0d-dd76da1f02a5" xmlns:ns3="16c05727-aa75-4e4a-9b5f-8a80a1165891" targetNamespace="http://schemas.microsoft.com/office/2006/metadata/properties" ma:root="true" ma:fieldsID="4e2496f70b101db0b8013f30a071bbf7" ns2:_="" ns3:_="">
     <xsd:import namespace="71af3243-3dd4-4a8d-8c0d-dd76da1f02a5"/>
@@ -13926,7 +13884,104 @@
 </ct:contentTypeSchema>
 </file>
 
+<file path=customXml/item2.xml><?xml version="1.0" encoding="utf-8"?>
+<b:Sources xmlns:b="http://schemas.openxmlformats.org/officeDocument/2006/bibliography" xmlns="http://schemas.openxmlformats.org/officeDocument/2006/bibliography" SelectedStyle="\APASixthEditionOfficeOnline.xsl" StyleName="APA" Version="6">
+  <b:Source>
+    <b:Tag>bri21</b:Tag>
+    <b:SourceType>InternetSite</b:SourceType>
+    <b:Guid>{ED1782FF-1F14-425F-BC6D-27919EE46022}</b:Guid>
+    <b:Title>Google search results</b:Title>
+    <b:Year>2021</b:Year>
+    <b:Author>
+      <b:Author>
+        <b:NameList>
+          <b:Person>
+            <b:Last>page</b:Last>
+            <b:First>larry</b:First>
+          </b:Person>
+          <b:Person>
+            <b:Last>brin</b:Last>
+            <b:First>sergey</b:First>
+          </b:Person>
+        </b:NameList>
+      </b:Author>
+    </b:Author>
+    <b:InternetSiteTitle>Google.com</b:InternetSiteTitle>
+    <b:Month>Maart</b:Month>
+    <b:Day>28</b:Day>
+    <b:URL>https://www.google.com/search?q=hoe+maak+je+een+waterraket</b:URL>
+    <b:LCID>nl-NL</b:LCID>
+    <b:RefOrder>1</b:RefOrder>
+  </b:Source>
+  <b:Source>
+    <b:Tag>que17</b:Tag>
+    <b:SourceType>InternetSite</b:SourceType>
+    <b:Guid>{131D1F80-FEA3-42C2-9DB6-4D20EBE9D49B}</b:Guid>
+    <b:Author>
+      <b:Author>
+        <b:NameList>
+          <b:Person>
+            <b:Last>questjunior</b:Last>
+          </b:Person>
+        </b:NameList>
+      </b:Author>
+    </b:Author>
+    <b:Title>Hoe kan je met een fles een raket bouwen?</b:Title>
+    <b:InternetSiteTitle>Youtube</b:InternetSiteTitle>
+    <b:Year>2017</b:Year>
+    <b:Month>october</b:Month>
+    <b:Day>18</b:Day>
+    <b:URL>https://www.youtube.com/watch?v=5el3Gz3C0UY</b:URL>
+    <b:RefOrder>2</b:RefOrder>
+  </b:Source>
+  <b:Source>
+    <b:Tag>wat21</b:Tag>
+    <b:SourceType>InternetSite</b:SourceType>
+    <b:Guid>{A8BB1D49-F80D-423A-BC1B-E2FC52F5DF2F}</b:Guid>
+    <b:Title>Wikipedia water rocket</b:Title>
+    <b:InternetSiteTitle>wikipedia</b:InternetSiteTitle>
+    <b:Year>2021</b:Year>
+    <b:Month>january</b:Month>
+    <b:Day>21</b:Day>
+    <b:URL>https://en.wikipedia.org/wiki/Water_rocket</b:URL>
+    <b:RefOrder>3</b:RefOrder>
+  </b:Source>
+  <b:Source>
+    <b:Tag>Ber21</b:Tag>
+    <b:SourceType>Film</b:SourceType>
+    <b:Guid>{9DC2D7EB-F92D-4402-8299-E06EAF2A302B}</b:Guid>
+    <b:Title>Mijn videos van de lanceringen en opnames van de druk in de fles</b:Title>
+    <b:Year>2021</b:Year>
+    <b:Author>
+      <b:Director>
+        <b:NameList>
+          <b:Person>
+            <b:Last>Berntsen</b:Last>
+            <b:First>Ronan</b:First>
+          </b:Person>
+          <b:Person>
+            <b:Last>Mcgeever</b:Last>
+            <b:First>Anna</b:First>
+          </b:Person>
+        </b:NameList>
+      </b:Director>
+    </b:Author>
+    <b:URL>https://drive.google.com/drive/folders/15EyA3YFQfywEcrgkhPjYxRFPICLKvjt7?usp=sharing</b:URL>
+    <b:RefOrder>4</b:RefOrder>
+  </b:Source>
+</b:Sources>
+</file>
+
 <file path=customXml/item3.xml><?xml version="1.0" encoding="utf-8"?>
+<?mso-contentType ?>
+<FormTemplates xmlns="http://schemas.microsoft.com/sharepoint/v3/contenttype/forms">
+  <Display>DocumentLibraryForm</Display>
+  <Edit>DocumentLibraryForm</Edit>
+  <New>DocumentLibraryForm</New>
+</FormTemplates>
+</file>
+
+<file path=customXml/item4.xml><?xml version="1.0" encoding="utf-8"?>
 <p:properties xmlns:p="http://schemas.microsoft.com/office/2006/metadata/properties" xmlns:xsi="http://www.w3.org/2001/XMLSchema-instance" xmlns:pc="http://schemas.microsoft.com/office/infopath/2007/PartnerControls">
   <documentManagement>
     <Status xmlns="71af3243-3dd4-4a8d-8c0d-dd76da1f02a5">Not started</Status>
@@ -13935,24 +13990,7 @@
 </p:properties>
 </file>
 
-<file path=customXml/item4.xml><?xml version="1.0" encoding="utf-8"?>
-<?mso-contentType ?>
-<FormTemplates xmlns="http://schemas.microsoft.com/sharepoint/v3/contenttype/forms">
-  <Display>DocumentLibraryForm</Display>
-  <Edit>DocumentLibraryForm</Edit>
-  <New>DocumentLibraryForm</New>
-</FormTemplates>
-</file>
-
 <file path=customXml/itemProps1.xml><?xml version="1.0" encoding="utf-8"?>
-<ds:datastoreItem xmlns:ds="http://schemas.openxmlformats.org/officeDocument/2006/customXml" ds:itemID="{5A377DEF-C59E-41D3-8EEF-F8EE12F1FC5E}">
-  <ds:schemaRefs>
-    <ds:schemaRef ds:uri="http://schemas.openxmlformats.org/officeDocument/2006/bibliography"/>
-  </ds:schemaRefs>
-</ds:datastoreItem>
-</file>
-
-<file path=customXml/itemProps2.xml><?xml version="1.0" encoding="utf-8"?>
 <ds:datastoreItem xmlns:ds="http://schemas.openxmlformats.org/officeDocument/2006/customXml" ds:itemID="{507D20CB-E94B-44E8-97C3-44BC9C1AF38A}">
   <ds:schemaRefs>
     <ds:schemaRef ds:uri="http://schemas.microsoft.com/office/2006/metadata/contentType"/>
@@ -13971,7 +14009,23 @@
 </ds:datastoreItem>
 </file>
 
+<file path=customXml/itemProps2.xml><?xml version="1.0" encoding="utf-8"?>
+<ds:datastoreItem xmlns:ds="http://schemas.openxmlformats.org/officeDocument/2006/customXml" ds:itemID="{5A377DEF-C59E-41D3-8EEF-F8EE12F1FC5E}">
+  <ds:schemaRefs>
+    <ds:schemaRef ds:uri="http://schemas.openxmlformats.org/officeDocument/2006/bibliography"/>
+  </ds:schemaRefs>
+</ds:datastoreItem>
+</file>
+
 <file path=customXml/itemProps3.xml><?xml version="1.0" encoding="utf-8"?>
+<ds:datastoreItem xmlns:ds="http://schemas.openxmlformats.org/officeDocument/2006/customXml" ds:itemID="{EF425F07-5221-4468-81DD-0F0C28E7FD98}">
+  <ds:schemaRefs>
+    <ds:schemaRef ds:uri="http://schemas.microsoft.com/sharepoint/v3/contenttype/forms"/>
+  </ds:schemaRefs>
+</ds:datastoreItem>
+</file>
+
+<file path=customXml/itemProps4.xml><?xml version="1.0" encoding="utf-8"?>
 <ds:datastoreItem xmlns:ds="http://schemas.openxmlformats.org/officeDocument/2006/customXml" ds:itemID="{57798B56-5215-4AD8-847F-8A1F1C10FD6F}">
   <ds:schemaRefs>
     <ds:schemaRef ds:uri="http://schemas.microsoft.com/office/2006/metadata/properties"/>
@@ -13979,12 +14033,4 @@
     <ds:schemaRef ds:uri="71af3243-3dd4-4a8d-8c0d-dd76da1f02a5"/>
   </ds:schemaRefs>
 </ds:datastoreItem>
-</file>
-
-<file path=customXml/itemProps4.xml><?xml version="1.0" encoding="utf-8"?>
-<ds:datastoreItem xmlns:ds="http://schemas.openxmlformats.org/officeDocument/2006/customXml" ds:itemID="{EF425F07-5221-4468-81DD-0F0C28E7FD98}">
-  <ds:schemaRefs>
-    <ds:schemaRef ds:uri="http://schemas.microsoft.com/sharepoint/v3/contenttype/forms"/>
-  </ds:schemaRefs>
-</ds:datastoreItem>
 </file>
</xml_diff>

<commit_message>
nog wat aanpassingen gemaakt
</commit_message>
<xml_diff>
--- a/O&O/Water raket verslag.docx
+++ b/O&O/Water raket verslag.docx
@@ -65,7 +65,13 @@
               <w:rPr>
                 <w:noProof w:val="0"/>
               </w:rPr>
-              <w:t>Water raket verslag</w:t>
+              <w:t>Waterraket</w:t>
+            </w:r>
+            <w:r>
+              <w:rPr>
+                <w:noProof w:val="0"/>
+              </w:rPr>
+              <w:t xml:space="preserve"> verslag</w:t>
             </w:r>
           </w:p>
         </w:tc>
@@ -398,7 +404,7 @@
               <w:fldChar w:fldCharType="separate"/>
             </w:r>
             <w:r>
-              <w:t>zondag 28 maart 2021</w:t>
+              <w:t>maandag 29 maart 2021</w:t>
             </w:r>
             <w:r>
               <w:rPr>
@@ -612,9 +618,9 @@
             </w:pPr>
             <w:r>
               <w:drawing>
-                <wp:inline distT="0" distB="0" distL="0" distR="0" wp14:anchorId="1E04FF7C" wp14:editId="40CA066C">
+                <wp:inline distT="0" distB="0" distL="0" distR="0" wp14:anchorId="1E04FF7C" wp14:editId="51AFAC24">
                   <wp:extent cx="9658985" cy="5124450"/>
-                  <wp:effectExtent l="38100" t="38100" r="18415" b="57150"/>
+                  <wp:effectExtent l="0" t="19050" r="18415" b="57150"/>
                   <wp:docPr id="10" name="Diagram 10"/>
                   <wp:cNvGraphicFramePr/>
                   <a:graphic xmlns:a="http://schemas.openxmlformats.org/drawingml/2006/main">
@@ -887,7 +893,13 @@
               </w:sdtContent>
             </w:sdt>
             <w:r>
-              <w:t xml:space="preserve"> leverde een mooi resultaat op. Namelijk een youtube video die goed uitlegde hoe een water raket gemaakt moest worden</w:t>
+              <w:t xml:space="preserve"> leverde een mooi resultaat op. Namelijk een youtube video die goed uitlegde hoe een </w:t>
+            </w:r>
+            <w:r>
+              <w:t>waterraket</w:t>
+            </w:r>
+            <w:r>
+              <w:t xml:space="preserve"> gemaakt moest worden</w:t>
             </w:r>
             <w:sdt>
               <w:sdtPr>
@@ -917,7 +929,13 @@
               <w:t>. Na de video te hebben bekeken</w:t>
             </w:r>
             <w:r>
-              <w:t xml:space="preserve"> werd de water raket gebouwd.</w:t>
+              <w:t xml:space="preserve"> werd de </w:t>
+            </w:r>
+            <w:r>
+              <w:t>waterraket</w:t>
+            </w:r>
+            <w:r>
+              <w:t xml:space="preserve"> gebouwd.</w:t>
             </w:r>
             <w:r>
               <w:t xml:space="preserve"> </w:t>
@@ -929,7 +947,13 @@
               <w:t xml:space="preserve"> werd spoedig Rocketman genoemd</w:t>
             </w:r>
             <w:r>
-              <w:t xml:space="preserve">. Een water raket </w:t>
+              <w:t xml:space="preserve">. Een </w:t>
+            </w:r>
+            <w:r>
+              <w:t>waterraket</w:t>
+            </w:r>
+            <w:r>
+              <w:t xml:space="preserve"> </w:t>
             </w:r>
             <w:r>
               <w:t xml:space="preserve">is een plastic fles gevuld met water en lucht met een kurk erop, door de kurk zit een ventiel waardoor </w:t>
@@ -1050,6 +1074,9 @@
             </w:r>
             <w:r>
               <w:t>innen)</w:t>
+            </w:r>
+            <w:r>
+              <w:t>?</w:t>
             </w:r>
             <w:r>
               <w:t>”</w:t>
@@ -1281,6 +1308,9 @@
         <w:tc>
           <w:tcPr>
             <w:tcW w:w="426" w:type="dxa"/>
+            <w:tcBorders>
+              <w:top w:val="single" w:sz="12" w:space="0" w:color="00C1C7" w:themeColor="accent2"/>
+            </w:tcBorders>
             <w:shd w:val="clear" w:color="auto" w:fill="ECFBFB" w:themeFill="accent4"/>
           </w:tcPr>
           <w:p>
@@ -1295,7 +1325,9 @@
           <w:tcPr>
             <w:tcW w:w="4961" w:type="dxa"/>
             <w:tcBorders>
+              <w:top w:val="single" w:sz="12" w:space="0" w:color="00C1C7" w:themeColor="accent2"/>
               <w:bottom w:val="single" w:sz="18" w:space="0" w:color="00C1C7" w:themeColor="accent2"/>
+              <w:right w:val="single" w:sz="4" w:space="0" w:color="123869" w:themeColor="accent1"/>
             </w:tcBorders>
             <w:shd w:val="clear" w:color="auto" w:fill="ECFBFB" w:themeFill="accent4"/>
           </w:tcPr>
@@ -1303,6 +1335,82 @@
             <w:pPr>
               <w:pStyle w:val="Heading5"/>
             </w:pPr>
+            <w:r>
+              <w:rPr>
+                <w:b w:val="0"/>
+                <w:bCs/>
+              </w:rPr>
+              <w:drawing>
+                <wp:anchor distT="0" distB="0" distL="114300" distR="114300" simplePos="0" relativeHeight="251666432" behindDoc="1" locked="0" layoutInCell="1" allowOverlap="1" wp14:anchorId="612A457A" wp14:editId="214B3C28">
+                  <wp:simplePos x="0" y="0"/>
+                  <wp:positionH relativeFrom="column">
+                    <wp:posOffset>-3928</wp:posOffset>
+                  </wp:positionH>
+                  <wp:positionV relativeFrom="paragraph">
+                    <wp:posOffset>2950019</wp:posOffset>
+                  </wp:positionV>
+                  <wp:extent cx="3083014" cy="3083014"/>
+                  <wp:effectExtent l="0" t="0" r="3175" b="3175"/>
+                  <wp:wrapTight wrapText="bothSides">
+                    <wp:wrapPolygon edited="0">
+                      <wp:start x="0" y="0"/>
+                      <wp:lineTo x="0" y="21489"/>
+                      <wp:lineTo x="21489" y="21489"/>
+                      <wp:lineTo x="21489" y="0"/>
+                      <wp:lineTo x="0" y="0"/>
+                    </wp:wrapPolygon>
+                  </wp:wrapTight>
+                  <wp:docPr id="9" name="Picture 9"/>
+                  <wp:cNvGraphicFramePr>
+                    <a:graphicFrameLocks xmlns:a="http://schemas.openxmlformats.org/drawingml/2006/main" noChangeAspect="1"/>
+                  </wp:cNvGraphicFramePr>
+                  <a:graphic xmlns:a="http://schemas.openxmlformats.org/drawingml/2006/main">
+                    <a:graphicData uri="http://schemas.openxmlformats.org/drawingml/2006/picture">
+                      <pic:pic xmlns:pic="http://schemas.openxmlformats.org/drawingml/2006/picture">
+                        <pic:nvPicPr>
+                          <pic:cNvPr id="0" name="Picture 1"/>
+                          <pic:cNvPicPr>
+                            <a:picLocks noChangeAspect="1" noChangeArrowheads="1"/>
+                          </pic:cNvPicPr>
+                        </pic:nvPicPr>
+                        <pic:blipFill>
+                          <a:blip r:embed="rId17" cstate="print">
+                            <a:extLst>
+                              <a:ext uri="{28A0092B-C50C-407E-A947-70E740481C1C}">
+                                <a14:useLocalDpi xmlns:a14="http://schemas.microsoft.com/office/drawing/2010/main" val="0"/>
+                              </a:ext>
+                            </a:extLst>
+                          </a:blip>
+                          <a:srcRect/>
+                          <a:stretch>
+                            <a:fillRect/>
+                          </a:stretch>
+                        </pic:blipFill>
+                        <pic:spPr bwMode="auto">
+                          <a:xfrm>
+                            <a:off x="0" y="0"/>
+                            <a:ext cx="3088322" cy="3088322"/>
+                          </a:xfrm>
+                          <a:prstGeom prst="rect">
+                            <a:avLst/>
+                          </a:prstGeom>
+                          <a:noFill/>
+                          <a:ln>
+                            <a:noFill/>
+                          </a:ln>
+                        </pic:spPr>
+                      </pic:pic>
+                    </a:graphicData>
+                  </a:graphic>
+                  <wp14:sizeRelH relativeFrom="margin">
+                    <wp14:pctWidth>0</wp14:pctWidth>
+                  </wp14:sizeRelH>
+                  <wp14:sizeRelV relativeFrom="margin">
+                    <wp14:pctHeight>0</wp14:pctHeight>
+                  </wp14:sizeRelV>
+                </wp:anchor>
+              </w:drawing>
+            </w:r>
             <w:sdt>
               <w:sdtPr>
                 <w:id w:val="1918440706"/>
@@ -1332,306 +1440,199 @@
           <w:tcPr>
             <w:tcW w:w="4961" w:type="dxa"/>
             <w:tcBorders>
-              <w:bottom w:val="single" w:sz="18" w:space="0" w:color="00C1C7" w:themeColor="accent2"/>
+              <w:top w:val="single" w:sz="12" w:space="0" w:color="00C1C7" w:themeColor="accent2"/>
+              <w:left w:val="single" w:sz="4" w:space="0" w:color="123869" w:themeColor="accent1"/>
+              <w:bottom w:val="single" w:sz="12" w:space="0" w:color="00C1C7" w:themeColor="accent2"/>
             </w:tcBorders>
             <w:shd w:val="clear" w:color="auto" w:fill="ECFBFB" w:themeFill="accent4"/>
           </w:tcPr>
           <w:p>
             <w:pPr>
-              <w:pStyle w:val="Heading3"/>
+              <w:pStyle w:val="Heading2"/>
               <w:rPr>
                 <w:rFonts w:eastAsiaTheme="minorHAnsi"/>
-                <w:sz w:val="28"/>
-                <w:szCs w:val="28"/>
+                <w:color w:val="123869" w:themeColor="accent1"/>
               </w:rPr>
             </w:pPr>
             <w:r>
               <w:rPr>
                 <w:rFonts w:eastAsiaTheme="minorHAnsi"/>
-                <w:sz w:val="28"/>
-                <w:szCs w:val="28"/>
+                <w:color w:val="123869" w:themeColor="accent1"/>
               </w:rPr>
-              <w:t>Om de water raket te maken is er het volgende nodig:</w:t>
+              <w:t xml:space="preserve">Om de </w:t>
+            </w:r>
+            <w:r>
+              <w:rPr>
+                <w:rFonts w:eastAsiaTheme="minorHAnsi"/>
+                <w:color w:val="123869" w:themeColor="accent1"/>
+              </w:rPr>
+              <w:t>waterraket</w:t>
+            </w:r>
+            <w:r>
+              <w:rPr>
+                <w:rFonts w:eastAsiaTheme="minorHAnsi"/>
+                <w:color w:val="123869" w:themeColor="accent1"/>
+              </w:rPr>
+              <w:t xml:space="preserve"> te maken is er het volgende nodig:</w:t>
+            </w:r>
+          </w:p>
+          <w:p>
+            <w:pPr>
+              <w:pStyle w:val="Heading2"/>
+              <w:numPr>
+                <w:ilvl w:val="0"/>
+                <w:numId w:val="8"/>
+              </w:numPr>
+              <w:rPr>
+                <w:color w:val="123869" w:themeColor="accent1"/>
+                <w:sz w:val="32"/>
+                <w:szCs w:val="32"/>
+              </w:rPr>
+            </w:pPr>
+            <w:r>
+              <w:rPr>
+                <w:color w:val="123869" w:themeColor="accent1"/>
+                <w:sz w:val="32"/>
+                <w:szCs w:val="32"/>
+              </w:rPr>
+              <w:t>Een plastic fles als drukkamer</w:t>
+            </w:r>
+          </w:p>
+          <w:p>
+            <w:pPr>
+              <w:pStyle w:val="Heading2"/>
+              <w:numPr>
+                <w:ilvl w:val="0"/>
+                <w:numId w:val="8"/>
+              </w:numPr>
+              <w:rPr>
+                <w:color w:val="123869" w:themeColor="accent1"/>
+                <w:sz w:val="32"/>
+                <w:szCs w:val="32"/>
+              </w:rPr>
+            </w:pPr>
+            <w:r>
+              <w:rPr>
+                <w:color w:val="123869" w:themeColor="accent1"/>
+                <w:sz w:val="32"/>
+                <w:szCs w:val="32"/>
+              </w:rPr>
+              <w:t>Een kurk om het ventiel doorheen te doen</w:t>
+            </w:r>
+          </w:p>
+          <w:p>
+            <w:pPr>
+              <w:pStyle w:val="Heading2"/>
+              <w:numPr>
+                <w:ilvl w:val="0"/>
+                <w:numId w:val="8"/>
+              </w:numPr>
+              <w:rPr>
+                <w:color w:val="123869" w:themeColor="accent1"/>
+                <w:sz w:val="32"/>
+                <w:szCs w:val="32"/>
+              </w:rPr>
+            </w:pPr>
+            <w:r>
+              <w:rPr>
+                <w:color w:val="123869" w:themeColor="accent1"/>
+                <w:sz w:val="32"/>
+                <w:szCs w:val="32"/>
+              </w:rPr>
+              <w:t>Een ventiel. Een dun lang fietsventiel werkt het best</w:t>
+            </w:r>
+          </w:p>
+          <w:p>
+            <w:pPr>
+              <w:pStyle w:val="Heading2"/>
+              <w:numPr>
+                <w:ilvl w:val="0"/>
+                <w:numId w:val="8"/>
+              </w:numPr>
+              <w:rPr>
+                <w:color w:val="123869" w:themeColor="accent1"/>
+                <w:sz w:val="32"/>
+                <w:szCs w:val="32"/>
+              </w:rPr>
+            </w:pPr>
+            <w:r>
+              <w:rPr>
+                <w:color w:val="123869" w:themeColor="accent1"/>
+                <w:sz w:val="32"/>
+                <w:szCs w:val="32"/>
+              </w:rPr>
+              <w:t>Ducttape om alles aan elkaar te bevestigen om om de kurk groter te maken</w:t>
+            </w:r>
+          </w:p>
+          <w:p>
+            <w:pPr>
+              <w:pStyle w:val="Heading2"/>
+              <w:numPr>
+                <w:ilvl w:val="0"/>
+                <w:numId w:val="8"/>
+              </w:numPr>
+              <w:rPr>
+                <w:color w:val="123869" w:themeColor="accent1"/>
+                <w:sz w:val="32"/>
+                <w:szCs w:val="32"/>
+              </w:rPr>
+            </w:pPr>
+            <w:r>
+              <w:rPr>
+                <w:color w:val="123869" w:themeColor="accent1"/>
+                <w:sz w:val="32"/>
+                <w:szCs w:val="32"/>
+              </w:rPr>
+              <w:t>Water om in de raket te doen</w:t>
+            </w:r>
+          </w:p>
+          <w:p>
+            <w:pPr>
+              <w:pStyle w:val="Heading2"/>
+              <w:numPr>
+                <w:ilvl w:val="0"/>
+                <w:numId w:val="8"/>
+              </w:numPr>
+              <w:rPr>
+                <w:color w:val="123869" w:themeColor="accent1"/>
+                <w:sz w:val="32"/>
+                <w:szCs w:val="32"/>
+              </w:rPr>
+            </w:pPr>
+            <w:r>
+              <w:rPr>
+                <w:color w:val="123869" w:themeColor="accent1"/>
+                <w:sz w:val="32"/>
+                <w:szCs w:val="32"/>
+              </w:rPr>
+              <w:t>Een fietspomp om de raket af te vuren</w:t>
+            </w:r>
+          </w:p>
+          <w:p>
+            <w:pPr>
+              <w:pStyle w:val="Heading2"/>
+              <w:numPr>
+                <w:ilvl w:val="0"/>
+                <w:numId w:val="8"/>
+              </w:numPr>
+              <w:rPr>
+                <w:color w:val="123869" w:themeColor="accent1"/>
+                <w:sz w:val="32"/>
+                <w:szCs w:val="32"/>
+              </w:rPr>
+            </w:pPr>
+            <w:r>
+              <w:rPr>
+                <w:color w:val="123869" w:themeColor="accent1"/>
+                <w:sz w:val="32"/>
+                <w:szCs w:val="32"/>
+              </w:rPr>
+              <w:t>Een lanceerplatform, dit moet gewoon iets zijn dat de kurk kan vasthouden terwijl er gepompt word</w:t>
             </w:r>
           </w:p>
           <w:p>
             <w:pPr>
               <w:pStyle w:val="Heading3"/>
-              <w:rPr>
-                <w:rFonts w:eastAsiaTheme="minorHAnsi"/>
-                <w:sz w:val="28"/>
-                <w:szCs w:val="28"/>
-              </w:rPr>
-            </w:pPr>
-            <w:r>
-              <w:rPr>
-                <w:rFonts w:eastAsiaTheme="minorHAnsi"/>
-                <w:sz w:val="28"/>
-                <w:szCs w:val="28"/>
-              </w:rPr>
-              <w:t>Om de water raket te maken is er het volgende nodig:</w:t>
-            </w:r>
-          </w:p>
-          <w:p>
-            <w:pPr>
-              <w:pStyle w:val="Heading3"/>
-              <w:rPr>
-                <w:rFonts w:eastAsiaTheme="minorHAnsi"/>
-                <w:sz w:val="28"/>
-                <w:szCs w:val="28"/>
-              </w:rPr>
-            </w:pPr>
-            <w:r>
-              <w:rPr>
-                <w:rFonts w:eastAsiaTheme="minorHAnsi"/>
-                <w:sz w:val="28"/>
-                <w:szCs w:val="28"/>
-              </w:rPr>
-              <w:t xml:space="preserve">Een plastic fles als drukkamer </w:t>
-            </w:r>
-          </w:p>
-          <w:p>
-            <w:pPr>
-              <w:pStyle w:val="Heading3"/>
-              <w:rPr>
-                <w:sz w:val="28"/>
-                <w:szCs w:val="28"/>
-              </w:rPr>
-            </w:pPr>
-          </w:p>
-          <w:p>
-            <w:pPr>
-              <w:pStyle w:val="Heading3"/>
-              <w:rPr>
-                <w:rFonts w:eastAsiaTheme="minorHAnsi"/>
-                <w:sz w:val="28"/>
-                <w:szCs w:val="28"/>
-              </w:rPr>
-            </w:pPr>
-            <w:r>
-              <w:rPr>
-                <w:rFonts w:eastAsiaTheme="minorHAnsi"/>
-                <w:sz w:val="28"/>
-                <w:szCs w:val="28"/>
-              </w:rPr>
-              <w:t xml:space="preserve">     </w:t>
-            </w:r>
-            <w:r>
-              <w:rPr>
-                <w:rFonts w:eastAsiaTheme="minorHAnsi"/>
-                <w:sz w:val="28"/>
-                <w:szCs w:val="28"/>
-              </w:rPr>
-              <w:t>2.</w:t>
-            </w:r>
-            <w:r>
-              <w:rPr>
-                <w:rFonts w:eastAsiaTheme="minorHAnsi"/>
-                <w:sz w:val="28"/>
-                <w:szCs w:val="28"/>
-              </w:rPr>
-              <w:tab/>
-              <w:t>Een kurk om het ventiel doorheen te doen</w:t>
-            </w:r>
-          </w:p>
-          <w:p>
-            <w:pPr>
-              <w:pStyle w:val="Heading3"/>
-              <w:rPr>
-                <w:rFonts w:eastAsiaTheme="minorHAnsi"/>
-                <w:sz w:val="28"/>
-                <w:szCs w:val="28"/>
-              </w:rPr>
-            </w:pPr>
-            <w:r>
-              <w:rPr>
-                <w:rFonts w:eastAsiaTheme="minorHAnsi"/>
-                <w:sz w:val="28"/>
-                <w:szCs w:val="28"/>
-              </w:rPr>
-              <w:t xml:space="preserve">     </w:t>
-            </w:r>
-            <w:r>
-              <w:rPr>
-                <w:rFonts w:eastAsiaTheme="minorHAnsi"/>
-                <w:sz w:val="28"/>
-                <w:szCs w:val="28"/>
-              </w:rPr>
-              <w:t>3.</w:t>
-            </w:r>
-            <w:r>
-              <w:rPr>
-                <w:rFonts w:eastAsiaTheme="minorHAnsi"/>
-                <w:sz w:val="28"/>
-                <w:szCs w:val="28"/>
-              </w:rPr>
-              <w:tab/>
-              <w:t>Een ventiel een dun lang fietsventiel werkt het best</w:t>
-            </w:r>
-          </w:p>
-          <w:p>
-            <w:pPr>
-              <w:pStyle w:val="Heading3"/>
-              <w:rPr>
-                <w:rFonts w:eastAsiaTheme="minorHAnsi"/>
-                <w:sz w:val="28"/>
-                <w:szCs w:val="28"/>
-              </w:rPr>
-            </w:pPr>
-            <w:r>
-              <w:rPr>
-                <w:rFonts w:eastAsiaTheme="minorHAnsi"/>
-                <w:sz w:val="28"/>
-                <w:szCs w:val="28"/>
-              </w:rPr>
-              <w:t xml:space="preserve">      </w:t>
-            </w:r>
-            <w:r>
-              <w:rPr>
-                <w:rFonts w:eastAsiaTheme="minorHAnsi"/>
-                <w:sz w:val="28"/>
-                <w:szCs w:val="28"/>
-              </w:rPr>
-              <w:t>4.</w:t>
-            </w:r>
-            <w:r>
-              <w:rPr>
-                <w:rFonts w:eastAsiaTheme="minorHAnsi"/>
-                <w:sz w:val="28"/>
-                <w:szCs w:val="28"/>
-              </w:rPr>
-              <w:tab/>
-              <w:t>Ducttape om alles aan elkaar te bevestigen en om de kurk groter te maken</w:t>
-            </w:r>
-          </w:p>
-          <w:p>
-            <w:pPr>
-              <w:pStyle w:val="Heading3"/>
-              <w:rPr>
-                <w:rFonts w:eastAsiaTheme="minorHAnsi"/>
-                <w:sz w:val="28"/>
-                <w:szCs w:val="28"/>
-              </w:rPr>
-            </w:pPr>
-            <w:r>
-              <w:rPr>
-                <w:rFonts w:eastAsiaTheme="minorHAnsi"/>
-                <w:sz w:val="28"/>
-                <w:szCs w:val="28"/>
-              </w:rPr>
-              <w:t xml:space="preserve">      </w:t>
-            </w:r>
-            <w:r>
-              <w:rPr>
-                <w:rFonts w:eastAsiaTheme="minorHAnsi"/>
-                <w:sz w:val="28"/>
-                <w:szCs w:val="28"/>
-              </w:rPr>
-              <w:t>5.</w:t>
-            </w:r>
-            <w:r>
-              <w:rPr>
-                <w:rFonts w:eastAsiaTheme="minorHAnsi"/>
-                <w:sz w:val="28"/>
-                <w:szCs w:val="28"/>
-              </w:rPr>
-              <w:tab/>
-              <w:t>Water om in de raket te doen</w:t>
-            </w:r>
-          </w:p>
-          <w:p>
-            <w:pPr>
-              <w:pStyle w:val="Heading3"/>
-              <w:rPr>
-                <w:rFonts w:eastAsiaTheme="minorHAnsi"/>
-                <w:sz w:val="28"/>
-                <w:szCs w:val="28"/>
-              </w:rPr>
-            </w:pPr>
-            <w:r>
-              <w:rPr>
-                <w:rFonts w:eastAsiaTheme="minorHAnsi"/>
-                <w:sz w:val="28"/>
-                <w:szCs w:val="28"/>
-              </w:rPr>
-              <w:t xml:space="preserve">      </w:t>
-            </w:r>
-            <w:r>
-              <w:rPr>
-                <w:rFonts w:eastAsiaTheme="minorHAnsi"/>
-                <w:sz w:val="28"/>
-                <w:szCs w:val="28"/>
-              </w:rPr>
-              <w:t>6.</w:t>
-            </w:r>
-            <w:r>
-              <w:rPr>
-                <w:rFonts w:eastAsiaTheme="minorHAnsi"/>
-                <w:sz w:val="28"/>
-                <w:szCs w:val="28"/>
-              </w:rPr>
-              <w:tab/>
-              <w:t>Een fietspomp om de raket af te vuren</w:t>
-            </w:r>
-          </w:p>
-          <w:p>
-            <w:pPr>
-              <w:pStyle w:val="Heading3"/>
-              <w:rPr>
-                <w:rFonts w:eastAsiaTheme="minorHAnsi"/>
-                <w:sz w:val="28"/>
-                <w:szCs w:val="28"/>
-              </w:rPr>
-            </w:pPr>
-            <w:r>
-              <w:rPr>
-                <w:rFonts w:eastAsiaTheme="minorHAnsi"/>
-                <w:sz w:val="28"/>
-                <w:szCs w:val="28"/>
-              </w:rPr>
-              <w:t xml:space="preserve">      </w:t>
-            </w:r>
-            <w:r>
-              <w:rPr>
-                <w:rFonts w:eastAsiaTheme="minorHAnsi"/>
-                <w:sz w:val="28"/>
-                <w:szCs w:val="28"/>
-              </w:rPr>
-              <w:t>7.</w:t>
-            </w:r>
-            <w:r>
-              <w:rPr>
-                <w:rFonts w:eastAsiaTheme="minorHAnsi"/>
-                <w:sz w:val="28"/>
-                <w:szCs w:val="28"/>
-              </w:rPr>
-              <w:tab/>
-              <w:t xml:space="preserve">Een lanceerplatform dit moet </w:t>
-            </w:r>
-            <w:r>
-              <w:rPr>
-                <w:rFonts w:eastAsiaTheme="minorHAnsi"/>
-                <w:sz w:val="28"/>
-                <w:szCs w:val="28"/>
-              </w:rPr>
-              <w:t xml:space="preserve">            </w:t>
-            </w:r>
-            <w:r>
-              <w:rPr>
-                <w:rFonts w:eastAsiaTheme="minorHAnsi"/>
-                <w:sz w:val="28"/>
-                <w:szCs w:val="28"/>
-              </w:rPr>
-              <w:t>gewoon iets zijn dat de kurk kan vasthouden terwijl er gepompt word</w:t>
-            </w:r>
-          </w:p>
-          <w:p>
-            <w:pPr>
-              <w:pStyle w:val="Heading3"/>
-              <w:rPr>
-                <w:sz w:val="28"/>
-                <w:szCs w:val="28"/>
-              </w:rPr>
             </w:pPr>
           </w:p>
         </w:tc>
@@ -1750,9 +1751,6 @@
             <w:pPr>
               <w:pStyle w:val="Heading3"/>
               <w:outlineLvl w:val="2"/>
-              <w:rPr>
-                <w:lang w:val="en-IE"/>
-              </w:rPr>
             </w:pPr>
           </w:p>
         </w:tc>
@@ -1793,14 +1791,28 @@
                 <w:b w:val="0"/>
                 <w:bCs w:val="0"/>
               </w:rPr>
-              <w:t>Om dit experiment uit t</w:t>
+              <w:t xml:space="preserve">Om dit experiment uit te voeren </w:t>
             </w:r>
             <w:r>
               <w:rPr>
                 <w:b w:val="0"/>
                 <w:bCs w:val="0"/>
               </w:rPr>
-              <w:t>e voeren moet er het volgende gebeuren. Eerst moet de raket gemaakt worden steek het ventiel door de kurk heen hier is eventueel een hamer voor nodig hierna moet de vles met 300 ml water gevuld worden. Doe de kurk op de fles en monteer de fietspomp aan het ventiel. Monteer alles op een lanceerplatform en begin met pompen. Na enkele keren schiet de fles van de kurk en vlieg de fles de lucht in hierbij word alles om het platform mogelijk nat. Zorg ervoor dat de camera niet gekanteld is, meet na terugkomst op de computer hoe hoog de raket is gegaan gebruik objecten in de achtergrond als referentie. De lengtes die hieruit komen zijn de resultaten. Ook is er de druk van de lucht in de fles gemeten.</w:t>
+              <w:t xml:space="preserve">moet er het volgende gebeuren. Eerst moet de raket gemaakt worden. 1. </w:t>
+            </w:r>
+            <w:r>
+              <w:rPr>
+                <w:b w:val="0"/>
+                <w:bCs w:val="0"/>
+              </w:rPr>
+              <w:t>Steek het ventiel door de kurk heen</w:t>
+            </w:r>
+            <w:r>
+              <w:rPr>
+                <w:b w:val="0"/>
+                <w:bCs w:val="0"/>
+              </w:rPr>
+              <w:t>, heir is eventueel een hamer voor nodig</w:t>
             </w:r>
           </w:p>
         </w:tc>
@@ -1885,7 +1897,7 @@
                   <wp:cNvGraphicFramePr/>
                   <a:graphic xmlns:a="http://schemas.openxmlformats.org/drawingml/2006/main">
                     <a:graphicData uri="http://schemas.openxmlformats.org/drawingml/2006/chart">
-                      <c:chart xmlns:c="http://schemas.openxmlformats.org/drawingml/2006/chart" xmlns:r="http://schemas.openxmlformats.org/officeDocument/2006/relationships" r:id="rId17"/>
+                      <c:chart xmlns:c="http://schemas.openxmlformats.org/drawingml/2006/chart" xmlns:r="http://schemas.openxmlformats.org/officeDocument/2006/relationships" r:id="rId18"/>
                     </a:graphicData>
                   </a:graphic>
                 </wp:anchor>
@@ -2224,6 +2236,7 @@
           <w:p>
             <w:pPr>
               <w:pStyle w:val="Heading2"/>
+              <w:outlineLvl w:val="1"/>
               <w:cnfStyle w:val="100000000000" w:firstRow="1" w:lastRow="0" w:firstColumn="0" w:lastColumn="0" w:oddVBand="0" w:evenVBand="0" w:oddHBand="0" w:evenHBand="0" w:firstRowFirstColumn="0" w:firstRowLastColumn="0" w:lastRowFirstColumn="0" w:lastRowLastColumn="0"/>
             </w:pPr>
             <w:r>
@@ -2597,8 +2610,8 @@
       </w:r>
     </w:p>
     <w:sectPr>
-      <w:footerReference w:type="even" r:id="rId18"/>
-      <w:footerReference w:type="default" r:id="rId19"/>
+      <w:footerReference w:type="even" r:id="rId19"/>
+      <w:footerReference w:type="default" r:id="rId20"/>
       <w:pgSz w:w="12240" w:h="15840" w:code="1"/>
       <w:pgMar w:top="720" w:right="720" w:bottom="1080" w:left="720" w:header="709" w:footer="432" w:gutter="0"/>
       <w:cols w:space="708"/>
@@ -2704,7 +2717,10 @@
       <w:pStyle w:val="Footer"/>
     </w:pPr>
     <w:r>
-      <w:t>Verslag Water raket</w:t>
+      <w:t xml:space="preserve">Verslag </w:t>
+    </w:r>
+    <w:r>
+      <w:t>Waterraket</w:t>
     </w:r>
     <w:r>
       <w:tab/>
@@ -2758,6 +2774,95 @@
 <file path=word/numbering.xml><?xml version="1.0" encoding="utf-8"?>
 <w:numbering xmlns:wpc="http://schemas.microsoft.com/office/word/2010/wordprocessingCanvas" xmlns:cx="http://schemas.microsoft.com/office/drawing/2014/chartex" xmlns:cx1="http://schemas.microsoft.com/office/drawing/2015/9/8/chartex" xmlns:cx2="http://schemas.microsoft.com/office/drawing/2015/10/21/chartex" xmlns:cx3="http://schemas.microsoft.com/office/drawing/2016/5/9/chartex" xmlns:cx4="http://schemas.microsoft.com/office/drawing/2016/5/10/chartex" xmlns:cx5="http://schemas.microsoft.com/office/drawing/2016/5/11/chartex" xmlns:cx6="http://schemas.microsoft.com/office/drawing/2016/5/12/chartex" xmlns:cx7="http://schemas.microsoft.com/office/drawing/2016/5/13/chartex" xmlns:cx8="http://schemas.microsoft.com/office/drawing/2016/5/14/chartex" xmlns:mc="http://schemas.openxmlformats.org/markup-compatibility/2006" xmlns:aink="http://schemas.microsoft.com/office/drawing/2016/ink" xmlns:am3d="http://schemas.microsoft.com/office/drawing/2017/model3d" xmlns:o="urn:schemas-microsoft-com:office:office" xmlns:r="http://schemas.openxmlformats.org/officeDocument/2006/relationships" xmlns:m="http://schemas.openxmlformats.org/officeDocument/2006/math" xmlns:v="urn:schemas-microsoft-com:vml" xmlns:wp14="http://schemas.microsoft.com/office/word/2010/wordprocessingDrawing" xmlns:wp="http://schemas.openxmlformats.org/drawingml/2006/wordprocessingDrawing" xmlns:w10="urn:schemas-microsoft-com:office:word" xmlns:w="http://schemas.openxmlformats.org/wordprocessingml/2006/main" xmlns:w14="http://schemas.microsoft.com/office/word/2010/wordml" xmlns:w15="http://schemas.microsoft.com/office/word/2012/wordml" xmlns:w16cex="http://schemas.microsoft.com/office/word/2018/wordml/cex" xmlns:w16cid="http://schemas.microsoft.com/office/word/2016/wordml/cid" xmlns:w16="http://schemas.microsoft.com/office/word/2018/wordml" xmlns:w16se="http://schemas.microsoft.com/office/word/2015/wordml/symex" xmlns:wpg="http://schemas.microsoft.com/office/word/2010/wordprocessingGroup" xmlns:wpi="http://schemas.microsoft.com/office/word/2010/wordprocessingInk" xmlns:wne="http://schemas.microsoft.com/office/word/2006/wordml" xmlns:wps="http://schemas.microsoft.com/office/word/2010/wordprocessingShape" mc:Ignorable="w14 w15 w16se w16cid w16 w16cex wp14">
   <w:abstractNum w:abstractNumId="0" w15:restartNumberingAfterBreak="0">
+    <w:nsid w:val="01EE373B"/>
+    <w:multiLevelType w:val="hybridMultilevel"/>
+    <w:tmpl w:val="9174A258"/>
+    <w:lvl w:ilvl="0" w:tplc="0413000F">
+      <w:start w:val="1"/>
+      <w:numFmt w:val="decimal"/>
+      <w:lvlText w:val="%1."/>
+      <w:lvlJc w:val="left"/>
+      <w:pPr>
+        <w:ind w:left="720" w:hanging="360"/>
+      </w:pPr>
+      <w:rPr>
+        <w:rFonts w:hint="default"/>
+      </w:rPr>
+    </w:lvl>
+    <w:lvl w:ilvl="1" w:tplc="04130019" w:tentative="1">
+      <w:start w:val="1"/>
+      <w:numFmt w:val="lowerLetter"/>
+      <w:lvlText w:val="%2."/>
+      <w:lvlJc w:val="left"/>
+      <w:pPr>
+        <w:ind w:left="1440" w:hanging="360"/>
+      </w:pPr>
+    </w:lvl>
+    <w:lvl w:ilvl="2" w:tplc="0413001B" w:tentative="1">
+      <w:start w:val="1"/>
+      <w:numFmt w:val="lowerRoman"/>
+      <w:lvlText w:val="%3."/>
+      <w:lvlJc w:val="right"/>
+      <w:pPr>
+        <w:ind w:left="2160" w:hanging="180"/>
+      </w:pPr>
+    </w:lvl>
+    <w:lvl w:ilvl="3" w:tplc="0413000F" w:tentative="1">
+      <w:start w:val="1"/>
+      <w:numFmt w:val="decimal"/>
+      <w:lvlText w:val="%4."/>
+      <w:lvlJc w:val="left"/>
+      <w:pPr>
+        <w:ind w:left="2880" w:hanging="360"/>
+      </w:pPr>
+    </w:lvl>
+    <w:lvl w:ilvl="4" w:tplc="04130019" w:tentative="1">
+      <w:start w:val="1"/>
+      <w:numFmt w:val="lowerLetter"/>
+      <w:lvlText w:val="%5."/>
+      <w:lvlJc w:val="left"/>
+      <w:pPr>
+        <w:ind w:left="3600" w:hanging="360"/>
+      </w:pPr>
+    </w:lvl>
+    <w:lvl w:ilvl="5" w:tplc="0413001B" w:tentative="1">
+      <w:start w:val="1"/>
+      <w:numFmt w:val="lowerRoman"/>
+      <w:lvlText w:val="%6."/>
+      <w:lvlJc w:val="right"/>
+      <w:pPr>
+        <w:ind w:left="4320" w:hanging="180"/>
+      </w:pPr>
+    </w:lvl>
+    <w:lvl w:ilvl="6" w:tplc="0413000F" w:tentative="1">
+      <w:start w:val="1"/>
+      <w:numFmt w:val="decimal"/>
+      <w:lvlText w:val="%7."/>
+      <w:lvlJc w:val="left"/>
+      <w:pPr>
+        <w:ind w:left="5040" w:hanging="360"/>
+      </w:pPr>
+    </w:lvl>
+    <w:lvl w:ilvl="7" w:tplc="04130019" w:tentative="1">
+      <w:start w:val="1"/>
+      <w:numFmt w:val="lowerLetter"/>
+      <w:lvlText w:val="%8."/>
+      <w:lvlJc w:val="left"/>
+      <w:pPr>
+        <w:ind w:left="5760" w:hanging="360"/>
+      </w:pPr>
+    </w:lvl>
+    <w:lvl w:ilvl="8" w:tplc="0413001B" w:tentative="1">
+      <w:start w:val="1"/>
+      <w:numFmt w:val="lowerRoman"/>
+      <w:lvlText w:val="%9."/>
+      <w:lvlJc w:val="right"/>
+      <w:pPr>
+        <w:ind w:left="6480" w:hanging="180"/>
+      </w:pPr>
+    </w:lvl>
+  </w:abstractNum>
+  <w:abstractNum w:abstractNumId="1" w15:restartNumberingAfterBreak="0">
     <w:nsid w:val="273710D2"/>
     <w:multiLevelType w:val="hybridMultilevel"/>
     <w:tmpl w:val="2C3A31B4"/>
@@ -2846,7 +2951,93 @@
       </w:pPr>
     </w:lvl>
   </w:abstractNum>
-  <w:abstractNum w:abstractNumId="1" w15:restartNumberingAfterBreak="0">
+  <w:abstractNum w:abstractNumId="2" w15:restartNumberingAfterBreak="0">
+    <w:nsid w:val="3049201C"/>
+    <w:multiLevelType w:val="hybridMultilevel"/>
+    <w:tmpl w:val="14102B36"/>
+    <w:lvl w:ilvl="0" w:tplc="0413000F">
+      <w:start w:val="1"/>
+      <w:numFmt w:val="decimal"/>
+      <w:lvlText w:val="%1."/>
+      <w:lvlJc w:val="left"/>
+      <w:pPr>
+        <w:ind w:left="720" w:hanging="360"/>
+      </w:pPr>
+    </w:lvl>
+    <w:lvl w:ilvl="1" w:tplc="04130019" w:tentative="1">
+      <w:start w:val="1"/>
+      <w:numFmt w:val="lowerLetter"/>
+      <w:lvlText w:val="%2."/>
+      <w:lvlJc w:val="left"/>
+      <w:pPr>
+        <w:ind w:left="1440" w:hanging="360"/>
+      </w:pPr>
+    </w:lvl>
+    <w:lvl w:ilvl="2" w:tplc="0413001B" w:tentative="1">
+      <w:start w:val="1"/>
+      <w:numFmt w:val="lowerRoman"/>
+      <w:lvlText w:val="%3."/>
+      <w:lvlJc w:val="right"/>
+      <w:pPr>
+        <w:ind w:left="2160" w:hanging="180"/>
+      </w:pPr>
+    </w:lvl>
+    <w:lvl w:ilvl="3" w:tplc="0413000F" w:tentative="1">
+      <w:start w:val="1"/>
+      <w:numFmt w:val="decimal"/>
+      <w:lvlText w:val="%4."/>
+      <w:lvlJc w:val="left"/>
+      <w:pPr>
+        <w:ind w:left="2880" w:hanging="360"/>
+      </w:pPr>
+    </w:lvl>
+    <w:lvl w:ilvl="4" w:tplc="04130019" w:tentative="1">
+      <w:start w:val="1"/>
+      <w:numFmt w:val="lowerLetter"/>
+      <w:lvlText w:val="%5."/>
+      <w:lvlJc w:val="left"/>
+      <w:pPr>
+        <w:ind w:left="3600" w:hanging="360"/>
+      </w:pPr>
+    </w:lvl>
+    <w:lvl w:ilvl="5" w:tplc="0413001B" w:tentative="1">
+      <w:start w:val="1"/>
+      <w:numFmt w:val="lowerRoman"/>
+      <w:lvlText w:val="%6."/>
+      <w:lvlJc w:val="right"/>
+      <w:pPr>
+        <w:ind w:left="4320" w:hanging="180"/>
+      </w:pPr>
+    </w:lvl>
+    <w:lvl w:ilvl="6" w:tplc="0413000F" w:tentative="1">
+      <w:start w:val="1"/>
+      <w:numFmt w:val="decimal"/>
+      <w:lvlText w:val="%7."/>
+      <w:lvlJc w:val="left"/>
+      <w:pPr>
+        <w:ind w:left="5040" w:hanging="360"/>
+      </w:pPr>
+    </w:lvl>
+    <w:lvl w:ilvl="7" w:tplc="04130019" w:tentative="1">
+      <w:start w:val="1"/>
+      <w:numFmt w:val="lowerLetter"/>
+      <w:lvlText w:val="%8."/>
+      <w:lvlJc w:val="left"/>
+      <w:pPr>
+        <w:ind w:left="5760" w:hanging="360"/>
+      </w:pPr>
+    </w:lvl>
+    <w:lvl w:ilvl="8" w:tplc="0413001B" w:tentative="1">
+      <w:start w:val="1"/>
+      <w:numFmt w:val="lowerRoman"/>
+      <w:lvlText w:val="%9."/>
+      <w:lvlJc w:val="right"/>
+      <w:pPr>
+        <w:ind w:left="6480" w:hanging="180"/>
+      </w:pPr>
+    </w:lvl>
+  </w:abstractNum>
+  <w:abstractNum w:abstractNumId="3" w15:restartNumberingAfterBreak="0">
     <w:nsid w:val="51D1777F"/>
     <w:multiLevelType w:val="hybridMultilevel"/>
     <w:tmpl w:val="ABAEA9CA"/>
@@ -2935,7 +3126,274 @@
       </w:pPr>
     </w:lvl>
   </w:abstractNum>
-  <w:abstractNum w:abstractNumId="2" w15:restartNumberingAfterBreak="0">
+  <w:abstractNum w:abstractNumId="4" w15:restartNumberingAfterBreak="0">
+    <w:nsid w:val="58F90849"/>
+    <w:multiLevelType w:val="hybridMultilevel"/>
+    <w:tmpl w:val="7D4C324A"/>
+    <w:lvl w:ilvl="0" w:tplc="0413000F">
+      <w:start w:val="1"/>
+      <w:numFmt w:val="decimal"/>
+      <w:lvlText w:val="%1."/>
+      <w:lvlJc w:val="left"/>
+      <w:pPr>
+        <w:ind w:left="720" w:hanging="360"/>
+      </w:pPr>
+      <w:rPr>
+        <w:rFonts w:hint="default"/>
+      </w:rPr>
+    </w:lvl>
+    <w:lvl w:ilvl="1" w:tplc="04130019" w:tentative="1">
+      <w:start w:val="1"/>
+      <w:numFmt w:val="lowerLetter"/>
+      <w:lvlText w:val="%2."/>
+      <w:lvlJc w:val="left"/>
+      <w:pPr>
+        <w:ind w:left="1440" w:hanging="360"/>
+      </w:pPr>
+    </w:lvl>
+    <w:lvl w:ilvl="2" w:tplc="0413001B" w:tentative="1">
+      <w:start w:val="1"/>
+      <w:numFmt w:val="lowerRoman"/>
+      <w:lvlText w:val="%3."/>
+      <w:lvlJc w:val="right"/>
+      <w:pPr>
+        <w:ind w:left="2160" w:hanging="180"/>
+      </w:pPr>
+    </w:lvl>
+    <w:lvl w:ilvl="3" w:tplc="0413000F" w:tentative="1">
+      <w:start w:val="1"/>
+      <w:numFmt w:val="decimal"/>
+      <w:lvlText w:val="%4."/>
+      <w:lvlJc w:val="left"/>
+      <w:pPr>
+        <w:ind w:left="2880" w:hanging="360"/>
+      </w:pPr>
+    </w:lvl>
+    <w:lvl w:ilvl="4" w:tplc="04130019" w:tentative="1">
+      <w:start w:val="1"/>
+      <w:numFmt w:val="lowerLetter"/>
+      <w:lvlText w:val="%5."/>
+      <w:lvlJc w:val="left"/>
+      <w:pPr>
+        <w:ind w:left="3600" w:hanging="360"/>
+      </w:pPr>
+    </w:lvl>
+    <w:lvl w:ilvl="5" w:tplc="0413001B" w:tentative="1">
+      <w:start w:val="1"/>
+      <w:numFmt w:val="lowerRoman"/>
+      <w:lvlText w:val="%6."/>
+      <w:lvlJc w:val="right"/>
+      <w:pPr>
+        <w:ind w:left="4320" w:hanging="180"/>
+      </w:pPr>
+    </w:lvl>
+    <w:lvl w:ilvl="6" w:tplc="0413000F" w:tentative="1">
+      <w:start w:val="1"/>
+      <w:numFmt w:val="decimal"/>
+      <w:lvlText w:val="%7."/>
+      <w:lvlJc w:val="left"/>
+      <w:pPr>
+        <w:ind w:left="5040" w:hanging="360"/>
+      </w:pPr>
+    </w:lvl>
+    <w:lvl w:ilvl="7" w:tplc="04130019" w:tentative="1">
+      <w:start w:val="1"/>
+      <w:numFmt w:val="lowerLetter"/>
+      <w:lvlText w:val="%8."/>
+      <w:lvlJc w:val="left"/>
+      <w:pPr>
+        <w:ind w:left="5760" w:hanging="360"/>
+      </w:pPr>
+    </w:lvl>
+    <w:lvl w:ilvl="8" w:tplc="0413001B" w:tentative="1">
+      <w:start w:val="1"/>
+      <w:numFmt w:val="lowerRoman"/>
+      <w:lvlText w:val="%9."/>
+      <w:lvlJc w:val="right"/>
+      <w:pPr>
+        <w:ind w:left="6480" w:hanging="180"/>
+      </w:pPr>
+    </w:lvl>
+  </w:abstractNum>
+  <w:abstractNum w:abstractNumId="5" w15:restartNumberingAfterBreak="0">
+    <w:nsid w:val="5DAB3316"/>
+    <w:multiLevelType w:val="hybridMultilevel"/>
+    <w:tmpl w:val="750E3B60"/>
+    <w:lvl w:ilvl="0" w:tplc="0413000F">
+      <w:start w:val="1"/>
+      <w:numFmt w:val="decimal"/>
+      <w:lvlText w:val="%1."/>
+      <w:lvlJc w:val="left"/>
+      <w:pPr>
+        <w:ind w:left="720" w:hanging="360"/>
+      </w:pPr>
+      <w:rPr>
+        <w:rFonts w:hint="default"/>
+      </w:rPr>
+    </w:lvl>
+    <w:lvl w:ilvl="1" w:tplc="04130019" w:tentative="1">
+      <w:start w:val="1"/>
+      <w:numFmt w:val="lowerLetter"/>
+      <w:lvlText w:val="%2."/>
+      <w:lvlJc w:val="left"/>
+      <w:pPr>
+        <w:ind w:left="1440" w:hanging="360"/>
+      </w:pPr>
+    </w:lvl>
+    <w:lvl w:ilvl="2" w:tplc="0413001B" w:tentative="1">
+      <w:start w:val="1"/>
+      <w:numFmt w:val="lowerRoman"/>
+      <w:lvlText w:val="%3."/>
+      <w:lvlJc w:val="right"/>
+      <w:pPr>
+        <w:ind w:left="2160" w:hanging="180"/>
+      </w:pPr>
+    </w:lvl>
+    <w:lvl w:ilvl="3" w:tplc="0413000F" w:tentative="1">
+      <w:start w:val="1"/>
+      <w:numFmt w:val="decimal"/>
+      <w:lvlText w:val="%4."/>
+      <w:lvlJc w:val="left"/>
+      <w:pPr>
+        <w:ind w:left="2880" w:hanging="360"/>
+      </w:pPr>
+    </w:lvl>
+    <w:lvl w:ilvl="4" w:tplc="04130019" w:tentative="1">
+      <w:start w:val="1"/>
+      <w:numFmt w:val="lowerLetter"/>
+      <w:lvlText w:val="%5."/>
+      <w:lvlJc w:val="left"/>
+      <w:pPr>
+        <w:ind w:left="3600" w:hanging="360"/>
+      </w:pPr>
+    </w:lvl>
+    <w:lvl w:ilvl="5" w:tplc="0413001B" w:tentative="1">
+      <w:start w:val="1"/>
+      <w:numFmt w:val="lowerRoman"/>
+      <w:lvlText w:val="%6."/>
+      <w:lvlJc w:val="right"/>
+      <w:pPr>
+        <w:ind w:left="4320" w:hanging="180"/>
+      </w:pPr>
+    </w:lvl>
+    <w:lvl w:ilvl="6" w:tplc="0413000F" w:tentative="1">
+      <w:start w:val="1"/>
+      <w:numFmt w:val="decimal"/>
+      <w:lvlText w:val="%7."/>
+      <w:lvlJc w:val="left"/>
+      <w:pPr>
+        <w:ind w:left="5040" w:hanging="360"/>
+      </w:pPr>
+    </w:lvl>
+    <w:lvl w:ilvl="7" w:tplc="04130019" w:tentative="1">
+      <w:start w:val="1"/>
+      <w:numFmt w:val="lowerLetter"/>
+      <w:lvlText w:val="%8."/>
+      <w:lvlJc w:val="left"/>
+      <w:pPr>
+        <w:ind w:left="5760" w:hanging="360"/>
+      </w:pPr>
+    </w:lvl>
+    <w:lvl w:ilvl="8" w:tplc="0413001B" w:tentative="1">
+      <w:start w:val="1"/>
+      <w:numFmt w:val="lowerRoman"/>
+      <w:lvlText w:val="%9."/>
+      <w:lvlJc w:val="right"/>
+      <w:pPr>
+        <w:ind w:left="6480" w:hanging="180"/>
+      </w:pPr>
+    </w:lvl>
+  </w:abstractNum>
+  <w:abstractNum w:abstractNumId="6" w15:restartNumberingAfterBreak="0">
+    <w:nsid w:val="72FC0FA8"/>
+    <w:multiLevelType w:val="hybridMultilevel"/>
+    <w:tmpl w:val="44DE43E2"/>
+    <w:lvl w:ilvl="0" w:tplc="0413000F">
+      <w:start w:val="1"/>
+      <w:numFmt w:val="decimal"/>
+      <w:lvlText w:val="%1."/>
+      <w:lvlJc w:val="left"/>
+      <w:pPr>
+        <w:ind w:left="720" w:hanging="360"/>
+      </w:pPr>
+      <w:rPr>
+        <w:rFonts w:hint="default"/>
+      </w:rPr>
+    </w:lvl>
+    <w:lvl w:ilvl="1" w:tplc="04130019" w:tentative="1">
+      <w:start w:val="1"/>
+      <w:numFmt w:val="lowerLetter"/>
+      <w:lvlText w:val="%2."/>
+      <w:lvlJc w:val="left"/>
+      <w:pPr>
+        <w:ind w:left="1440" w:hanging="360"/>
+      </w:pPr>
+    </w:lvl>
+    <w:lvl w:ilvl="2" w:tplc="0413001B" w:tentative="1">
+      <w:start w:val="1"/>
+      <w:numFmt w:val="lowerRoman"/>
+      <w:lvlText w:val="%3."/>
+      <w:lvlJc w:val="right"/>
+      <w:pPr>
+        <w:ind w:left="2160" w:hanging="180"/>
+      </w:pPr>
+    </w:lvl>
+    <w:lvl w:ilvl="3" w:tplc="0413000F" w:tentative="1">
+      <w:start w:val="1"/>
+      <w:numFmt w:val="decimal"/>
+      <w:lvlText w:val="%4."/>
+      <w:lvlJc w:val="left"/>
+      <w:pPr>
+        <w:ind w:left="2880" w:hanging="360"/>
+      </w:pPr>
+    </w:lvl>
+    <w:lvl w:ilvl="4" w:tplc="04130019" w:tentative="1">
+      <w:start w:val="1"/>
+      <w:numFmt w:val="lowerLetter"/>
+      <w:lvlText w:val="%5."/>
+      <w:lvlJc w:val="left"/>
+      <w:pPr>
+        <w:ind w:left="3600" w:hanging="360"/>
+      </w:pPr>
+    </w:lvl>
+    <w:lvl w:ilvl="5" w:tplc="0413001B" w:tentative="1">
+      <w:start w:val="1"/>
+      <w:numFmt w:val="lowerRoman"/>
+      <w:lvlText w:val="%6."/>
+      <w:lvlJc w:val="right"/>
+      <w:pPr>
+        <w:ind w:left="4320" w:hanging="180"/>
+      </w:pPr>
+    </w:lvl>
+    <w:lvl w:ilvl="6" w:tplc="0413000F" w:tentative="1">
+      <w:start w:val="1"/>
+      <w:numFmt w:val="decimal"/>
+      <w:lvlText w:val="%7."/>
+      <w:lvlJc w:val="left"/>
+      <w:pPr>
+        <w:ind w:left="5040" w:hanging="360"/>
+      </w:pPr>
+    </w:lvl>
+    <w:lvl w:ilvl="7" w:tplc="04130019" w:tentative="1">
+      <w:start w:val="1"/>
+      <w:numFmt w:val="lowerLetter"/>
+      <w:lvlText w:val="%8."/>
+      <w:lvlJc w:val="left"/>
+      <w:pPr>
+        <w:ind w:left="5760" w:hanging="360"/>
+      </w:pPr>
+    </w:lvl>
+    <w:lvl w:ilvl="8" w:tplc="0413001B" w:tentative="1">
+      <w:start w:val="1"/>
+      <w:numFmt w:val="lowerRoman"/>
+      <w:lvlText w:val="%9."/>
+      <w:lvlJc w:val="right"/>
+      <w:pPr>
+        <w:ind w:left="6480" w:hanging="180"/>
+      </w:pPr>
+    </w:lvl>
+  </w:abstractNum>
+  <w:abstractNum w:abstractNumId="7" w15:restartNumberingAfterBreak="0">
     <w:nsid w:val="79C26B6A"/>
     <w:multiLevelType w:val="hybridMultilevel"/>
     <w:tmpl w:val="3584678A"/>
@@ -3025,13 +3483,28 @@
     </w:lvl>
   </w:abstractNum>
   <w:num w:numId="1">
+    <w:abstractNumId w:val="1"/>
+  </w:num>
+  <w:num w:numId="2">
+    <w:abstractNumId w:val="7"/>
+  </w:num>
+  <w:num w:numId="3">
+    <w:abstractNumId w:val="3"/>
+  </w:num>
+  <w:num w:numId="4">
+    <w:abstractNumId w:val="5"/>
+  </w:num>
+  <w:num w:numId="5">
+    <w:abstractNumId w:val="6"/>
+  </w:num>
+  <w:num w:numId="6">
+    <w:abstractNumId w:val="4"/>
+  </w:num>
+  <w:num w:numId="7">
     <w:abstractNumId w:val="0"/>
   </w:num>
-  <w:num w:numId="2">
+  <w:num w:numId="8">
     <w:abstractNumId w:val="2"/>
-  </w:num>
-  <w:num w:numId="3">
-    <w:abstractNumId w:val="1"/>
   </w:num>
 </w:numbering>
 </file>
@@ -3885,7 +4358,6 @@
     <w:name w:val="Hyperlink"/>
     <w:basedOn w:val="DefaultParagraphFont"/>
     <w:uiPriority w:val="99"/>
-    <w:semiHidden/>
     <w:rsid w:val="003E6200"/>
     <w:rPr>
       <w:color w:val="0000FF" w:themeColor="hyperlink"/>
@@ -4007,6 +4479,73 @@
         </w:tcBorders>
       </w:tcPr>
     </w:tblStylePr>
+  </w:style>
+  <w:style w:type="paragraph" w:styleId="TOCHeading">
+    <w:name w:val="TOC Heading"/>
+    <w:basedOn w:val="Heading1"/>
+    <w:next w:val="Normal"/>
+    <w:uiPriority w:val="39"/>
+    <w:unhideWhenUsed/>
+    <w:qFormat/>
+    <w:rsid w:val="00F0253A"/>
+    <w:pPr>
+      <w:spacing w:line="259" w:lineRule="auto"/>
+      <w:outlineLvl w:val="9"/>
+    </w:pPr>
+    <w:rPr>
+      <w:b w:val="0"/>
+      <w:noProof w:val="0"/>
+      <w:color w:val="0D294E" w:themeColor="accent1" w:themeShade="BF"/>
+      <w:sz w:val="32"/>
+      <w:lang w:val="en-US"/>
+    </w:rPr>
+  </w:style>
+  <w:style w:type="paragraph" w:styleId="TOC1">
+    <w:name w:val="toc 1"/>
+    <w:basedOn w:val="Normal"/>
+    <w:next w:val="Normal"/>
+    <w:autoRedefine/>
+    <w:uiPriority w:val="39"/>
+    <w:rsid w:val="00F0253A"/>
+    <w:pPr>
+      <w:spacing w:after="100"/>
+    </w:pPr>
+  </w:style>
+  <w:style w:type="paragraph" w:styleId="TOC2">
+    <w:name w:val="toc 2"/>
+    <w:basedOn w:val="Normal"/>
+    <w:next w:val="Normal"/>
+    <w:autoRedefine/>
+    <w:uiPriority w:val="39"/>
+    <w:rsid w:val="00F0253A"/>
+    <w:pPr>
+      <w:spacing w:after="100"/>
+      <w:ind w:left="240"/>
+    </w:pPr>
+  </w:style>
+  <w:style w:type="paragraph" w:styleId="TOC3">
+    <w:name w:val="toc 3"/>
+    <w:basedOn w:val="Normal"/>
+    <w:next w:val="Normal"/>
+    <w:autoRedefine/>
+    <w:uiPriority w:val="39"/>
+    <w:rsid w:val="00F0253A"/>
+    <w:pPr>
+      <w:spacing w:after="100"/>
+      <w:ind w:left="480"/>
+    </w:pPr>
+  </w:style>
+  <w:style w:type="paragraph" w:styleId="ListParagraph">
+    <w:name w:val="List Paragraph"/>
+    <w:basedOn w:val="Normal"/>
+    <w:uiPriority w:val="34"/>
+    <w:semiHidden/>
+    <w:qFormat/>
+    <w:rsid w:val="00E81EF9"/>
+    <w:pPr>
+      <w:ind w:left="720"/>
+      <w:contextualSpacing/>
+    </w:pPr>
   </w:style>
 </w:styles>
 </file>
@@ -5938,7 +6477,7 @@
         <a:p>
           <a:r>
             <a:rPr lang="nl-NL"/>
-            <a:t>Inleiding</a:t>
+            <a:t>Inleiding en theoretisch kader</a:t>
           </a:r>
         </a:p>
       </dgm:t>
@@ -5965,78 +6504,6 @@
         </a:p>
       </dgm:t>
     </dgm:pt>
-    <dgm:pt modelId="{AC3A6B20-175D-491A-9C91-77C001B76FB9}">
-      <dgm:prSet phldrT="[Text]"/>
-      <dgm:spPr/>
-      <dgm:t>
-        <a:bodyPr/>
-        <a:lstStyle/>
-        <a:p>
-          <a:r>
-            <a:rPr lang="nl-NL"/>
-            <a:t>Theoretisch kader</a:t>
-          </a:r>
-        </a:p>
-      </dgm:t>
-    </dgm:pt>
-    <dgm:pt modelId="{19558296-5A55-4C40-800E-C50F7E9F7D15}" type="parTrans" cxnId="{EF58A39E-5E5C-45EF-94DA-B08625305BE8}">
-      <dgm:prSet/>
-      <dgm:spPr/>
-      <dgm:t>
-        <a:bodyPr/>
-        <a:lstStyle/>
-        <a:p>
-          <a:endParaRPr lang="nl-NL"/>
-        </a:p>
-      </dgm:t>
-    </dgm:pt>
-    <dgm:pt modelId="{742BDE98-C03F-4F44-B400-B301F27C4FFF}" type="sibTrans" cxnId="{EF58A39E-5E5C-45EF-94DA-B08625305BE8}">
-      <dgm:prSet/>
-      <dgm:spPr/>
-      <dgm:t>
-        <a:bodyPr/>
-        <a:lstStyle/>
-        <a:p>
-          <a:endParaRPr lang="nl-NL"/>
-        </a:p>
-      </dgm:t>
-    </dgm:pt>
-    <dgm:pt modelId="{1232A54E-D552-4586-8AC7-E3519FDBFC29}">
-      <dgm:prSet phldrT="[Text]"/>
-      <dgm:spPr/>
-      <dgm:t>
-        <a:bodyPr/>
-        <a:lstStyle/>
-        <a:p>
-          <a:r>
-            <a:rPr lang="nl-NL"/>
-            <a:t>Over hoe de raket werkt</a:t>
-          </a:r>
-        </a:p>
-      </dgm:t>
-    </dgm:pt>
-    <dgm:pt modelId="{1EF285C4-7F09-4378-A521-638E8CBF45A0}" type="parTrans" cxnId="{650B1BD3-D58B-42E0-A4E6-3B3028C9D4AE}">
-      <dgm:prSet/>
-      <dgm:spPr/>
-      <dgm:t>
-        <a:bodyPr/>
-        <a:lstStyle/>
-        <a:p>
-          <a:endParaRPr lang="nl-NL"/>
-        </a:p>
-      </dgm:t>
-    </dgm:pt>
-    <dgm:pt modelId="{AF0A483D-DA2C-427E-9A69-63FC8724EBE4}" type="sibTrans" cxnId="{650B1BD3-D58B-42E0-A4E6-3B3028C9D4AE}">
-      <dgm:prSet/>
-      <dgm:spPr/>
-      <dgm:t>
-        <a:bodyPr/>
-        <a:lstStyle/>
-        <a:p>
-          <a:endParaRPr lang="nl-NL"/>
-        </a:p>
-      </dgm:t>
-    </dgm:pt>
     <dgm:pt modelId="{B02C7BCD-7788-4C02-ACD4-5934A395B240}">
       <dgm:prSet phldrT="[Text]"/>
       <dgm:spPr/>
@@ -6046,7 +6513,7 @@
         <a:p>
           <a:r>
             <a:rPr lang="nl-NL"/>
-            <a:t>Onderzoeksvraag</a:t>
+            <a:t>Onderzoeksvraag en hypothese</a:t>
           </a:r>
         </a:p>
       </dgm:t>
@@ -6063,150 +6530,6 @@
       </dgm:t>
     </dgm:pt>
     <dgm:pt modelId="{F2FE340E-8A79-4BFB-BF1E-AE804A0DDE12}" type="sibTrans" cxnId="{DE8AA882-F24E-44A3-8FA9-8A5494EA9554}">
-      <dgm:prSet/>
-      <dgm:spPr/>
-      <dgm:t>
-        <a:bodyPr/>
-        <a:lstStyle/>
-        <a:p>
-          <a:endParaRPr lang="nl-NL"/>
-        </a:p>
-      </dgm:t>
-    </dgm:pt>
-    <dgm:pt modelId="{9369328A-E71E-4F3F-80AC-8FA99017F786}">
-      <dgm:prSet phldrT="[Text]"/>
-      <dgm:spPr/>
-      <dgm:t>
-        <a:bodyPr/>
-        <a:lstStyle/>
-        <a:p>
-          <a:r>
-            <a:rPr lang="nl-NL"/>
-            <a:t>Over mijn onderzoeksvraag</a:t>
-          </a:r>
-        </a:p>
-      </dgm:t>
-    </dgm:pt>
-    <dgm:pt modelId="{B9BA3E01-8EB7-401D-959C-F94B8E00E957}" type="parTrans" cxnId="{94C94746-68DF-44B1-B110-2F8060A1E665}">
-      <dgm:prSet/>
-      <dgm:spPr/>
-      <dgm:t>
-        <a:bodyPr/>
-        <a:lstStyle/>
-        <a:p>
-          <a:endParaRPr lang="nl-NL"/>
-        </a:p>
-      </dgm:t>
-    </dgm:pt>
-    <dgm:pt modelId="{7532856B-2980-4746-BE32-5430B18D1363}" type="sibTrans" cxnId="{94C94746-68DF-44B1-B110-2F8060A1E665}">
-      <dgm:prSet/>
-      <dgm:spPr/>
-      <dgm:t>
-        <a:bodyPr/>
-        <a:lstStyle/>
-        <a:p>
-          <a:endParaRPr lang="nl-NL"/>
-        </a:p>
-      </dgm:t>
-    </dgm:pt>
-    <dgm:pt modelId="{27DBC861-7BEE-476F-A1D1-289ABAF60E6B}">
-      <dgm:prSet phldrT="[Text]"/>
-      <dgm:spPr/>
-      <dgm:t>
-        <a:bodyPr/>
-        <a:lstStyle/>
-        <a:p>
-          <a:r>
-            <a:rPr lang="nl-NL"/>
-            <a:t>Over wat ik heb gedaan om de raket te maken</a:t>
-          </a:r>
-        </a:p>
-      </dgm:t>
-    </dgm:pt>
-    <dgm:pt modelId="{BB1745AE-6972-4918-802C-A56C27AC7B60}" type="sibTrans" cxnId="{F37C1B55-D2B2-4BD3-9FBC-D983FBAA1005}">
-      <dgm:prSet/>
-      <dgm:spPr/>
-      <dgm:t>
-        <a:bodyPr/>
-        <a:lstStyle/>
-        <a:p>
-          <a:endParaRPr lang="nl-NL"/>
-        </a:p>
-      </dgm:t>
-    </dgm:pt>
-    <dgm:pt modelId="{E7CCD5C6-3DD3-4D98-9826-604A71E77CF3}" type="parTrans" cxnId="{F37C1B55-D2B2-4BD3-9FBC-D983FBAA1005}">
-      <dgm:prSet/>
-      <dgm:spPr/>
-      <dgm:t>
-        <a:bodyPr/>
-        <a:lstStyle/>
-        <a:p>
-          <a:endParaRPr lang="nl-NL"/>
-        </a:p>
-      </dgm:t>
-    </dgm:pt>
-    <dgm:pt modelId="{28055689-C33D-46BC-A0D8-5A4E14CA7C37}">
-      <dgm:prSet phldrT="[Text]"/>
-      <dgm:spPr/>
-      <dgm:t>
-        <a:bodyPr/>
-        <a:lstStyle/>
-        <a:p>
-          <a:r>
-            <a:rPr lang="nl-NL"/>
-            <a:t>Hypothese</a:t>
-          </a:r>
-        </a:p>
-      </dgm:t>
-    </dgm:pt>
-    <dgm:pt modelId="{FFA02EC7-A893-4FB9-ADB2-9D53F49A1521}" type="parTrans" cxnId="{52998CE4-618D-4F52-B374-E8EA626574AC}">
-      <dgm:prSet/>
-      <dgm:spPr/>
-      <dgm:t>
-        <a:bodyPr/>
-        <a:lstStyle/>
-        <a:p>
-          <a:endParaRPr lang="nl-NL"/>
-        </a:p>
-      </dgm:t>
-    </dgm:pt>
-    <dgm:pt modelId="{0B14F490-71D9-407E-B30F-A79BC19A9B7B}" type="sibTrans" cxnId="{52998CE4-618D-4F52-B374-E8EA626574AC}">
-      <dgm:prSet/>
-      <dgm:spPr/>
-      <dgm:t>
-        <a:bodyPr/>
-        <a:lstStyle/>
-        <a:p>
-          <a:endParaRPr lang="nl-NL"/>
-        </a:p>
-      </dgm:t>
-    </dgm:pt>
-    <dgm:pt modelId="{F35E6A79-1C7F-416D-8442-D1230BB765BC}">
-      <dgm:prSet phldrT="[Text]"/>
-      <dgm:spPr/>
-      <dgm:t>
-        <a:bodyPr/>
-        <a:lstStyle/>
-        <a:p>
-          <a:r>
-            <a:rPr lang="nl-NL"/>
-            <a:t>Over wat ik denk dat er uit mijn onderzoek zal komen</a:t>
-          </a:r>
-        </a:p>
-      </dgm:t>
-    </dgm:pt>
-    <dgm:pt modelId="{10F485D0-C14F-4AD9-AA56-F7C97F09022D}" type="parTrans" cxnId="{1EE385E5-E977-43F0-A853-A13C9D0C7070}">
-      <dgm:prSet/>
-      <dgm:spPr/>
-      <dgm:t>
-        <a:bodyPr/>
-        <a:lstStyle/>
-        <a:p>
-          <a:endParaRPr lang="nl-NL"/>
-        </a:p>
-      </dgm:t>
-    </dgm:pt>
-    <dgm:pt modelId="{EA607062-ED89-45C7-A200-685C644061A4}" type="sibTrans" cxnId="{1EE385E5-E977-43F0-A853-A13C9D0C7070}">
       <dgm:prSet/>
       <dgm:spPr/>
       <dgm:t>
@@ -6253,42 +6576,6 @@
         </a:p>
       </dgm:t>
     </dgm:pt>
-    <dgm:pt modelId="{1BA90B6D-9FD2-4C49-B691-3F3949BCD033}">
-      <dgm:prSet phldrT="[Text]"/>
-      <dgm:spPr/>
-      <dgm:t>
-        <a:bodyPr/>
-        <a:lstStyle/>
-        <a:p>
-          <a:r>
-            <a:rPr lang="nl-NL"/>
-            <a:t>Over waar de raket van gemaakt is</a:t>
-          </a:r>
-        </a:p>
-      </dgm:t>
-    </dgm:pt>
-    <dgm:pt modelId="{D50769F4-5BA1-48A1-9FF5-EC2BA89F6019}" type="parTrans" cxnId="{0E62714E-9E3A-4130-992B-CC7E12C67DCB}">
-      <dgm:prSet/>
-      <dgm:spPr/>
-      <dgm:t>
-        <a:bodyPr/>
-        <a:lstStyle/>
-        <a:p>
-          <a:endParaRPr lang="nl-NL"/>
-        </a:p>
-      </dgm:t>
-    </dgm:pt>
-    <dgm:pt modelId="{1E975302-19B1-417F-BDAA-953C07403ECF}" type="sibTrans" cxnId="{0E62714E-9E3A-4130-992B-CC7E12C67DCB}">
-      <dgm:prSet/>
-      <dgm:spPr/>
-      <dgm:t>
-        <a:bodyPr/>
-        <a:lstStyle/>
-        <a:p>
-          <a:endParaRPr lang="nl-NL"/>
-        </a:p>
-      </dgm:t>
-    </dgm:pt>
     <dgm:pt modelId="{3624343E-7132-44FD-A0C7-B58ADBCB5F3D}">
       <dgm:prSet phldrT="[Text]"/>
       <dgm:spPr/>
@@ -6325,42 +6612,6 @@
         </a:p>
       </dgm:t>
     </dgm:pt>
-    <dgm:pt modelId="{7716EE60-72F4-4D1C-90EE-3A821F0ABF91}">
-      <dgm:prSet phldrT="[Text]"/>
-      <dgm:spPr/>
-      <dgm:t>
-        <a:bodyPr/>
-        <a:lstStyle/>
-        <a:p>
-          <a:r>
-            <a:rPr lang="nl-NL"/>
-            <a:t>Over hoe ik het onderzoek PRECIES ga doen</a:t>
-          </a:r>
-        </a:p>
-      </dgm:t>
-    </dgm:pt>
-    <dgm:pt modelId="{09A623F8-6656-42C3-ADA8-2BA6571FB28D}" type="parTrans" cxnId="{7C469F05-F46E-41D7-BB6D-B98FCD25748A}">
-      <dgm:prSet/>
-      <dgm:spPr/>
-      <dgm:t>
-        <a:bodyPr/>
-        <a:lstStyle/>
-        <a:p>
-          <a:endParaRPr lang="nl-NL"/>
-        </a:p>
-      </dgm:t>
-    </dgm:pt>
-    <dgm:pt modelId="{D77C7524-9932-4779-B200-7D081D77C418}" type="sibTrans" cxnId="{7C469F05-F46E-41D7-BB6D-B98FCD25748A}">
-      <dgm:prSet/>
-      <dgm:spPr/>
-      <dgm:t>
-        <a:bodyPr/>
-        <a:lstStyle/>
-        <a:p>
-          <a:endParaRPr lang="nl-NL"/>
-        </a:p>
-      </dgm:t>
-    </dgm:pt>
     <dgm:pt modelId="{94BD86F8-B827-47CE-9ACB-6114BD158343}">
       <dgm:prSet phldrT="[Text]"/>
       <dgm:spPr/>
@@ -6370,7 +6621,7 @@
         <a:p>
           <a:r>
             <a:rPr lang="nl-NL"/>
-            <a:t>Resultaat</a:t>
+            <a:t>Resultaten</a:t>
           </a:r>
         </a:p>
       </dgm:t>
@@ -6387,42 +6638,6 @@
       </dgm:t>
     </dgm:pt>
     <dgm:pt modelId="{B36A0206-7EFB-4549-8D45-02ED3EE5330A}" type="sibTrans" cxnId="{1B2AFD9F-94A8-4CA0-AF42-5E39BA319566}">
-      <dgm:prSet/>
-      <dgm:spPr/>
-      <dgm:t>
-        <a:bodyPr/>
-        <a:lstStyle/>
-        <a:p>
-          <a:endParaRPr lang="nl-NL"/>
-        </a:p>
-      </dgm:t>
-    </dgm:pt>
-    <dgm:pt modelId="{2D2B0F85-8C3E-4F93-8A9C-78E1DC994FE9}">
-      <dgm:prSet phldrT="[Text]"/>
-      <dgm:spPr/>
-      <dgm:t>
-        <a:bodyPr/>
-        <a:lstStyle/>
-        <a:p>
-          <a:r>
-            <a:rPr lang="nl-NL"/>
-            <a:t>Over wat er uit mijn onderzoek is gekomen</a:t>
-          </a:r>
-        </a:p>
-      </dgm:t>
-    </dgm:pt>
-    <dgm:pt modelId="{3D00E212-E358-4F79-AB84-2F4A30B0F969}" type="parTrans" cxnId="{609B7ABA-A71E-4E39-B214-E0232FE424AD}">
-      <dgm:prSet/>
-      <dgm:spPr/>
-      <dgm:t>
-        <a:bodyPr/>
-        <a:lstStyle/>
-        <a:p>
-          <a:endParaRPr lang="nl-NL"/>
-        </a:p>
-      </dgm:t>
-    </dgm:pt>
-    <dgm:pt modelId="{285D4155-6020-4906-802A-43A21D0A944D}" type="sibTrans" cxnId="{609B7ABA-A71E-4E39-B214-E0232FE424AD}">
       <dgm:prSet/>
       <dgm:spPr/>
       <dgm:t>
@@ -6469,42 +6684,6 @@
         </a:p>
       </dgm:t>
     </dgm:pt>
-    <dgm:pt modelId="{D9CA069B-1747-4D35-9E47-48E45E091598}">
-      <dgm:prSet phldrT="[Text]"/>
-      <dgm:spPr/>
-      <dgm:t>
-        <a:bodyPr/>
-        <a:lstStyle/>
-        <a:p>
-          <a:r>
-            <a:rPr lang="nl-NL"/>
-            <a:t>Over wat ik denk dat mijn resultaten betekenen</a:t>
-          </a:r>
-        </a:p>
-      </dgm:t>
-    </dgm:pt>
-    <dgm:pt modelId="{2B5870FD-4572-45FF-9015-56E49D58B8F4}" type="parTrans" cxnId="{A94F1F8A-C07D-40E4-8A54-3231C91941CD}">
-      <dgm:prSet/>
-      <dgm:spPr/>
-      <dgm:t>
-        <a:bodyPr/>
-        <a:lstStyle/>
-        <a:p>
-          <a:endParaRPr lang="nl-NL"/>
-        </a:p>
-      </dgm:t>
-    </dgm:pt>
-    <dgm:pt modelId="{EABC52CC-DA59-4F0E-ADD8-9588F5BCC4DD}" type="sibTrans" cxnId="{A94F1F8A-C07D-40E4-8A54-3231C91941CD}">
-      <dgm:prSet/>
-      <dgm:spPr/>
-      <dgm:t>
-        <a:bodyPr/>
-        <a:lstStyle/>
-        <a:p>
-          <a:endParaRPr lang="nl-NL"/>
-        </a:p>
-      </dgm:t>
-    </dgm:pt>
     <dgm:pt modelId="{9D1C9E05-5EFF-4F49-AD96-672AB16710AE}">
       <dgm:prSet phldrT="[Text]"/>
       <dgm:spPr/>
@@ -6541,42 +6720,6 @@
         </a:p>
       </dgm:t>
     </dgm:pt>
-    <dgm:pt modelId="{D601C70B-858F-4F9F-A6CB-54D2AC5B73BC}">
-      <dgm:prSet phldrT="[Text]"/>
-      <dgm:spPr/>
-      <dgm:t>
-        <a:bodyPr/>
-        <a:lstStyle/>
-        <a:p>
-          <a:r>
-            <a:rPr lang="nl-NL"/>
-            <a:t> </a:t>
-          </a:r>
-        </a:p>
-      </dgm:t>
-    </dgm:pt>
-    <dgm:pt modelId="{E5FE353B-3451-4684-9E56-5C9884C3D1FE}" type="sibTrans" cxnId="{F5A73598-4555-4DC8-9C84-1421A46ADABD}">
-      <dgm:prSet/>
-      <dgm:spPr/>
-      <dgm:t>
-        <a:bodyPr/>
-        <a:lstStyle/>
-        <a:p>
-          <a:endParaRPr lang="nl-NL"/>
-        </a:p>
-      </dgm:t>
-    </dgm:pt>
-    <dgm:pt modelId="{E5B4677A-0926-4162-92D7-E517176CCC6A}" type="parTrans" cxnId="{F5A73598-4555-4DC8-9C84-1421A46ADABD}">
-      <dgm:prSet/>
-      <dgm:spPr/>
-      <dgm:t>
-        <a:bodyPr/>
-        <a:lstStyle/>
-        <a:p>
-          <a:endParaRPr lang="nl-NL"/>
-        </a:p>
-      </dgm:t>
-    </dgm:pt>
     <dgm:pt modelId="{6F3541ED-F66E-4589-A47E-65DFA9D7D40B}">
       <dgm:prSet phldrT="[Text]"/>
       <dgm:spPr/>
@@ -6603,42 +6746,6 @@
       </dgm:t>
     </dgm:pt>
     <dgm:pt modelId="{52158278-C8A5-4B10-B16A-6104077D22B2}" type="parTrans" cxnId="{FFE10F3C-EE8F-4726-8D5E-8EA7EDDCB0D1}">
-      <dgm:prSet/>
-      <dgm:spPr/>
-      <dgm:t>
-        <a:bodyPr/>
-        <a:lstStyle/>
-        <a:p>
-          <a:endParaRPr lang="nl-NL"/>
-        </a:p>
-      </dgm:t>
-    </dgm:pt>
-    <dgm:pt modelId="{BFB07F2A-1E43-4D74-947C-44ED77FA2E65}">
-      <dgm:prSet phldrT="[Text]"/>
-      <dgm:spPr/>
-      <dgm:t>
-        <a:bodyPr/>
-        <a:lstStyle/>
-        <a:p>
-          <a:r>
-            <a:rPr lang="nl-NL"/>
-            <a:t> </a:t>
-          </a:r>
-        </a:p>
-      </dgm:t>
-    </dgm:pt>
-    <dgm:pt modelId="{5E0E69EF-D562-4EC7-8A1E-90C8D484F4EA}" type="sibTrans" cxnId="{05495952-BF10-4628-9E28-A587439EE15A}">
-      <dgm:prSet/>
-      <dgm:spPr/>
-      <dgm:t>
-        <a:bodyPr/>
-        <a:lstStyle/>
-        <a:p>
-          <a:endParaRPr lang="nl-NL"/>
-        </a:p>
-      </dgm:t>
-    </dgm:pt>
-    <dgm:pt modelId="{3BE0B1C0-8174-45B3-936B-81EA3B85A86C}" type="parTrans" cxnId="{05495952-BF10-4628-9E28-A587439EE15A}">
       <dgm:prSet/>
       <dgm:spPr/>
       <dgm:t>
@@ -6817,42 +6924,6 @@
         </a:p>
       </dgm:t>
     </dgm:pt>
-    <dgm:pt modelId="{7F5141EE-4016-42CC-82F5-69EEC372C0EE}">
-      <dgm:prSet phldrT="[Text]"/>
-      <dgm:spPr/>
-      <dgm:t>
-        <a:bodyPr/>
-        <a:lstStyle/>
-        <a:p>
-          <a:r>
-            <a:rPr lang="nl-NL"/>
-            <a:t>Over waarom mijn conclusie fout zou kunnen zijn</a:t>
-          </a:r>
-        </a:p>
-      </dgm:t>
-    </dgm:pt>
-    <dgm:pt modelId="{0569F97B-72D5-4778-AB0D-E411C830F7C0}" type="parTrans" cxnId="{C5D86882-44C7-452A-8BAA-0734407F143E}">
-      <dgm:prSet/>
-      <dgm:spPr/>
-      <dgm:t>
-        <a:bodyPr/>
-        <a:lstStyle/>
-        <a:p>
-          <a:endParaRPr lang="nl-NL"/>
-        </a:p>
-      </dgm:t>
-    </dgm:pt>
-    <dgm:pt modelId="{9B0C0A17-8A3B-41FB-A64C-E45E66BF073B}" type="sibTrans" cxnId="{C5D86882-44C7-452A-8BAA-0734407F143E}">
-      <dgm:prSet/>
-      <dgm:spPr/>
-      <dgm:t>
-        <a:bodyPr/>
-        <a:lstStyle/>
-        <a:p>
-          <a:endParaRPr lang="nl-NL"/>
-        </a:p>
-      </dgm:t>
-    </dgm:pt>
     <dgm:pt modelId="{2FF8908B-4CF2-4A69-A470-DDDD1CAFE3FC}">
       <dgm:prSet phldrT="[Text]"/>
       <dgm:spPr/>
@@ -6922,42 +6993,6 @@
         </a:p>
       </dgm:t>
     </dgm:pt>
-    <dgm:pt modelId="{9054D832-36F2-4A7E-8B41-3C8A4CD4DA57}">
-      <dgm:prSet phldrT="[Text]"/>
-      <dgm:spPr/>
-      <dgm:t>
-        <a:bodyPr/>
-        <a:lstStyle/>
-        <a:p>
-          <a:r>
-            <a:rPr lang="nl-NL"/>
-            <a:t>einde</a:t>
-          </a:r>
-        </a:p>
-      </dgm:t>
-    </dgm:pt>
-    <dgm:pt modelId="{CF843F6B-236D-42AD-8703-A62065D64D0C}" type="parTrans" cxnId="{A1765377-BA68-4228-9E8B-EDF453CB3A0F}">
-      <dgm:prSet/>
-      <dgm:spPr/>
-      <dgm:t>
-        <a:bodyPr/>
-        <a:lstStyle/>
-        <a:p>
-          <a:endParaRPr lang="nl-NL"/>
-        </a:p>
-      </dgm:t>
-    </dgm:pt>
-    <dgm:pt modelId="{4701C10E-2940-4F11-855D-D5D78C681E6A}" type="sibTrans" cxnId="{A1765377-BA68-4228-9E8B-EDF453CB3A0F}">
-      <dgm:prSet/>
-      <dgm:spPr/>
-      <dgm:t>
-        <a:bodyPr/>
-        <a:lstStyle/>
-        <a:p>
-          <a:endParaRPr lang="nl-NL"/>
-        </a:p>
-      </dgm:t>
-    </dgm:pt>
     <dgm:pt modelId="{6396F99B-4FE8-4566-9818-243394F9F60F}">
       <dgm:prSet phldrT="[Text]"/>
       <dgm:spPr/>
@@ -6991,7 +7026,7 @@
         </a:p>
       </dgm:t>
     </dgm:pt>
-    <dgm:pt modelId="{680135AC-C30D-43FC-913D-8DFAA7D0D898}">
+    <dgm:pt modelId="{DC4FB978-CD8C-4DFD-9C6A-45E81509FFED}">
       <dgm:prSet phldrT="[Text]"/>
       <dgm:spPr/>
       <dgm:t>
@@ -7002,7 +7037,7 @@
         </a:p>
       </dgm:t>
     </dgm:pt>
-    <dgm:pt modelId="{5ECC075F-1201-45B0-B64E-06A5809AD49A}" type="parTrans" cxnId="{CA81A2B2-0B06-4B22-BAF7-AC5BA5C37567}">
+    <dgm:pt modelId="{3F8E8C68-26FB-49C3-A65C-949BD0A1F0C3}" type="parTrans" cxnId="{C2624639-6062-4140-91CA-CD04AA7D53B6}">
       <dgm:prSet/>
       <dgm:spPr/>
       <dgm:t>
@@ -7013,7 +7048,205 @@
         </a:p>
       </dgm:t>
     </dgm:pt>
-    <dgm:pt modelId="{3DE93F00-2E04-4B9E-8449-CB9194A1DE23}" type="sibTrans" cxnId="{CA81A2B2-0B06-4B22-BAF7-AC5BA5C37567}">
+    <dgm:pt modelId="{03231A0E-26AF-49C0-9C05-0A79E0A1B5D4}" type="sibTrans" cxnId="{C2624639-6062-4140-91CA-CD04AA7D53B6}">
+      <dgm:prSet/>
+      <dgm:spPr/>
+      <dgm:t>
+        <a:bodyPr/>
+        <a:lstStyle/>
+        <a:p>
+          <a:endParaRPr lang="nl-NL"/>
+        </a:p>
+      </dgm:t>
+    </dgm:pt>
+    <dgm:pt modelId="{313AA92B-A685-4FCC-A7CA-D63B8DD70703}">
+      <dgm:prSet phldrT="[Text]"/>
+      <dgm:spPr/>
+      <dgm:t>
+        <a:bodyPr/>
+        <a:lstStyle/>
+        <a:p>
+          <a:endParaRPr lang="nl-NL"/>
+        </a:p>
+      </dgm:t>
+    </dgm:pt>
+    <dgm:pt modelId="{461DCAB9-3082-4B1B-9E74-A5F5A3355C85}" type="parTrans" cxnId="{E0878AF1-2149-475D-A574-CCC5409DB640}">
+      <dgm:prSet/>
+      <dgm:spPr/>
+      <dgm:t>
+        <a:bodyPr/>
+        <a:lstStyle/>
+        <a:p>
+          <a:endParaRPr lang="nl-NL"/>
+        </a:p>
+      </dgm:t>
+    </dgm:pt>
+    <dgm:pt modelId="{704FA259-1D98-45A1-940D-7F860AED9116}" type="sibTrans" cxnId="{E0878AF1-2149-475D-A574-CCC5409DB640}">
+      <dgm:prSet/>
+      <dgm:spPr/>
+      <dgm:t>
+        <a:bodyPr/>
+        <a:lstStyle/>
+        <a:p>
+          <a:endParaRPr lang="nl-NL"/>
+        </a:p>
+      </dgm:t>
+    </dgm:pt>
+    <dgm:pt modelId="{DDB6C138-B46A-43DC-8D4C-68782E897D3D}">
+      <dgm:prSet phldrT="[Text]"/>
+      <dgm:spPr/>
+      <dgm:t>
+        <a:bodyPr/>
+        <a:lstStyle/>
+        <a:p>
+          <a:endParaRPr lang="nl-NL"/>
+        </a:p>
+      </dgm:t>
+    </dgm:pt>
+    <dgm:pt modelId="{BF24DD14-3ACB-4759-A1FD-7AC2C845F22B}" type="parTrans" cxnId="{6B497BBD-897A-4D61-A2F8-27020E4ECC00}">
+      <dgm:prSet/>
+      <dgm:spPr/>
+      <dgm:t>
+        <a:bodyPr/>
+        <a:lstStyle/>
+        <a:p>
+          <a:endParaRPr lang="nl-NL"/>
+        </a:p>
+      </dgm:t>
+    </dgm:pt>
+    <dgm:pt modelId="{935B4095-84DE-4792-BFB7-D2DC9B07B761}" type="sibTrans" cxnId="{6B497BBD-897A-4D61-A2F8-27020E4ECC00}">
+      <dgm:prSet/>
+      <dgm:spPr/>
+      <dgm:t>
+        <a:bodyPr/>
+        <a:lstStyle/>
+        <a:p>
+          <a:endParaRPr lang="nl-NL"/>
+        </a:p>
+      </dgm:t>
+    </dgm:pt>
+    <dgm:pt modelId="{272DEDEB-AC5A-4162-A2CB-4219B96CC4C8}">
+      <dgm:prSet phldrT="[Text]"/>
+      <dgm:spPr/>
+      <dgm:t>
+        <a:bodyPr/>
+        <a:lstStyle/>
+        <a:p>
+          <a:endParaRPr lang="nl-NL"/>
+        </a:p>
+      </dgm:t>
+    </dgm:pt>
+    <dgm:pt modelId="{32AF44EB-681C-478E-B11E-C9A277BD5B1D}" type="parTrans" cxnId="{FE987770-D0BB-408F-A6D5-FBC0054A2670}">
+      <dgm:prSet/>
+      <dgm:spPr/>
+      <dgm:t>
+        <a:bodyPr/>
+        <a:lstStyle/>
+        <a:p>
+          <a:endParaRPr lang="nl-NL"/>
+        </a:p>
+      </dgm:t>
+    </dgm:pt>
+    <dgm:pt modelId="{1108AF76-784D-4FC8-B94C-DDEB27F978DF}" type="sibTrans" cxnId="{FE987770-D0BB-408F-A6D5-FBC0054A2670}">
+      <dgm:prSet/>
+      <dgm:spPr/>
+      <dgm:t>
+        <a:bodyPr/>
+        <a:lstStyle/>
+        <a:p>
+          <a:endParaRPr lang="nl-NL"/>
+        </a:p>
+      </dgm:t>
+    </dgm:pt>
+    <dgm:pt modelId="{D55EC38B-ECE6-4DE1-9474-C2CE93DEC505}">
+      <dgm:prSet phldrT="[Text]"/>
+      <dgm:spPr/>
+      <dgm:t>
+        <a:bodyPr/>
+        <a:lstStyle/>
+        <a:p>
+          <a:endParaRPr lang="nl-NL"/>
+        </a:p>
+      </dgm:t>
+    </dgm:pt>
+    <dgm:pt modelId="{B3BBCF58-51F6-4E50-9414-432FEAA70277}" type="parTrans" cxnId="{83DF0348-300F-4B7D-BB6D-798307EB4212}">
+      <dgm:prSet/>
+      <dgm:spPr/>
+      <dgm:t>
+        <a:bodyPr/>
+        <a:lstStyle/>
+        <a:p>
+          <a:endParaRPr lang="nl-NL"/>
+        </a:p>
+      </dgm:t>
+    </dgm:pt>
+    <dgm:pt modelId="{6DA8E855-F0F0-431E-A30C-862053946D70}" type="sibTrans" cxnId="{83DF0348-300F-4B7D-BB6D-798307EB4212}">
+      <dgm:prSet/>
+      <dgm:spPr/>
+      <dgm:t>
+        <a:bodyPr/>
+        <a:lstStyle/>
+        <a:p>
+          <a:endParaRPr lang="nl-NL"/>
+        </a:p>
+      </dgm:t>
+    </dgm:pt>
+    <dgm:pt modelId="{13CCBE73-FC91-471B-BC11-265F6FDBF13C}">
+      <dgm:prSet phldrT="[Text]"/>
+      <dgm:spPr/>
+      <dgm:t>
+        <a:bodyPr/>
+        <a:lstStyle/>
+        <a:p>
+          <a:endParaRPr lang="nl-NL"/>
+        </a:p>
+      </dgm:t>
+    </dgm:pt>
+    <dgm:pt modelId="{ECD2A28F-3713-4C33-AEEF-1D8B341BABFC}" type="parTrans" cxnId="{460DDBE7-E219-407C-B3A5-4E0E28A4329E}">
+      <dgm:prSet/>
+      <dgm:spPr/>
+      <dgm:t>
+        <a:bodyPr/>
+        <a:lstStyle/>
+        <a:p>
+          <a:endParaRPr lang="nl-NL"/>
+        </a:p>
+      </dgm:t>
+    </dgm:pt>
+    <dgm:pt modelId="{1F138D56-80D3-4772-8FE0-74FF04DF1997}" type="sibTrans" cxnId="{460DDBE7-E219-407C-B3A5-4E0E28A4329E}">
+      <dgm:prSet/>
+      <dgm:spPr/>
+      <dgm:t>
+        <a:bodyPr/>
+        <a:lstStyle/>
+        <a:p>
+          <a:endParaRPr lang="nl-NL"/>
+        </a:p>
+      </dgm:t>
+    </dgm:pt>
+    <dgm:pt modelId="{A6E35334-F5D6-452B-94CA-750A24E297F0}">
+      <dgm:prSet phldrT="[Text]"/>
+      <dgm:spPr/>
+      <dgm:t>
+        <a:bodyPr/>
+        <a:lstStyle/>
+        <a:p>
+          <a:endParaRPr lang="nl-NL"/>
+        </a:p>
+      </dgm:t>
+    </dgm:pt>
+    <dgm:pt modelId="{2BA2BE60-FDF7-4F7D-A844-C16206B62F78}" type="parTrans" cxnId="{A034470B-5E9F-4B10-ADEF-991649139DB4}">
+      <dgm:prSet/>
+      <dgm:spPr/>
+      <dgm:t>
+        <a:bodyPr/>
+        <a:lstStyle/>
+        <a:p>
+          <a:endParaRPr lang="nl-NL"/>
+        </a:p>
+      </dgm:t>
+    </dgm:pt>
+    <dgm:pt modelId="{A2E80228-0CE9-4D7B-A3DC-F23B31440778}" type="sibTrans" cxnId="{A034470B-5E9F-4B10-ADEF-991649139DB4}">
       <dgm:prSet/>
       <dgm:spPr/>
       <dgm:t>
@@ -7041,7 +7274,7 @@
       <dgm:spPr/>
     </dgm:pt>
     <dgm:pt modelId="{97DBADAC-814F-47BB-A1DA-7DA778CAF45C}" type="pres">
-      <dgm:prSet presAssocID="{374F293C-0BEF-4F20-83B1-BB93BECAD7D0}" presName="FirstChild" presStyleLbl="revTx" presStyleIdx="0" presStyleCnt="21">
+      <dgm:prSet presAssocID="{374F293C-0BEF-4F20-83B1-BB93BECAD7D0}" presName="FirstChild" presStyleLbl="revTx" presStyleIdx="0" presStyleCnt="15">
         <dgm:presLayoutVars>
           <dgm:chMax val="0"/>
           <dgm:chPref val="0"/>
@@ -7051,7 +7284,7 @@
       <dgm:spPr/>
     </dgm:pt>
     <dgm:pt modelId="{E55967B5-2837-4CD0-96FC-63FBF986E964}" type="pres">
-      <dgm:prSet presAssocID="{374F293C-0BEF-4F20-83B1-BB93BECAD7D0}" presName="Parent" presStyleLbl="alignNode1" presStyleIdx="0" presStyleCnt="11">
+      <dgm:prSet presAssocID="{374F293C-0BEF-4F20-83B1-BB93BECAD7D0}" presName="Parent" presStyleLbl="alignNode1" presStyleIdx="0" presStyleCnt="8">
         <dgm:presLayoutVars>
           <dgm:chMax val="3"/>
           <dgm:chPref val="3"/>
@@ -7061,11 +7294,11 @@
       <dgm:spPr/>
     </dgm:pt>
     <dgm:pt modelId="{3020A122-E8FE-42CB-A370-CCD5CAD3AF0A}" type="pres">
-      <dgm:prSet presAssocID="{374F293C-0BEF-4F20-83B1-BB93BECAD7D0}" presName="Accent" presStyleLbl="parChTrans1D1" presStyleIdx="0" presStyleCnt="11"/>
+      <dgm:prSet presAssocID="{374F293C-0BEF-4F20-83B1-BB93BECAD7D0}" presName="Accent" presStyleLbl="parChTrans1D1" presStyleIdx="0" presStyleCnt="8"/>
       <dgm:spPr/>
     </dgm:pt>
-    <dgm:pt modelId="{0A9CAE11-38A0-4551-A667-F114C644F6EA}" type="pres">
-      <dgm:prSet presAssocID="{374F293C-0BEF-4F20-83B1-BB93BECAD7D0}" presName="Child" presStyleLbl="revTx" presStyleIdx="1" presStyleCnt="21">
+    <dgm:pt modelId="{4A8B0C5B-C36D-4A9A-BDBF-2138A3AD6896}" type="pres">
+      <dgm:prSet presAssocID="{374F293C-0BEF-4F20-83B1-BB93BECAD7D0}" presName="Child" presStyleLbl="revTx" presStyleIdx="1" presStyleCnt="15">
         <dgm:presLayoutVars>
           <dgm:chMax val="0"/>
           <dgm:chPref val="0"/>
@@ -7078,54 +7311,12 @@
       <dgm:prSet presAssocID="{68908B3B-5D7A-42CD-B19F-B62B8C3B9B71}" presName="sibTrans" presStyleCnt="0"/>
       <dgm:spPr/>
     </dgm:pt>
-    <dgm:pt modelId="{2FDD367A-AB15-4D8F-BBC6-725429547D6C}" type="pres">
-      <dgm:prSet presAssocID="{AC3A6B20-175D-491A-9C91-77C001B76FB9}" presName="composite" presStyleCnt="0"/>
-      <dgm:spPr/>
-    </dgm:pt>
-    <dgm:pt modelId="{DE36EA71-4325-4051-A2F4-6F627D3B39EC}" type="pres">
-      <dgm:prSet presAssocID="{AC3A6B20-175D-491A-9C91-77C001B76FB9}" presName="FirstChild" presStyleLbl="revTx" presStyleIdx="2" presStyleCnt="21">
-        <dgm:presLayoutVars>
-          <dgm:chMax val="0"/>
-          <dgm:chPref val="0"/>
-          <dgm:bulletEnabled val="1"/>
-        </dgm:presLayoutVars>
-      </dgm:prSet>
-      <dgm:spPr/>
-    </dgm:pt>
-    <dgm:pt modelId="{6C0988BB-D61C-4204-86DC-481FCB2EFE91}" type="pres">
-      <dgm:prSet presAssocID="{AC3A6B20-175D-491A-9C91-77C001B76FB9}" presName="Parent" presStyleLbl="alignNode1" presStyleIdx="1" presStyleCnt="11">
-        <dgm:presLayoutVars>
-          <dgm:chMax val="3"/>
-          <dgm:chPref val="3"/>
-          <dgm:bulletEnabled val="1"/>
-        </dgm:presLayoutVars>
-      </dgm:prSet>
-      <dgm:spPr/>
-    </dgm:pt>
-    <dgm:pt modelId="{27C259DC-9B3F-4497-BA03-61F65DF29F38}" type="pres">
-      <dgm:prSet presAssocID="{AC3A6B20-175D-491A-9C91-77C001B76FB9}" presName="Accent" presStyleLbl="parChTrans1D1" presStyleIdx="1" presStyleCnt="11"/>
-      <dgm:spPr/>
-    </dgm:pt>
-    <dgm:pt modelId="{C6EA8907-C88B-4206-B56B-698549A17776}" type="pres">
-      <dgm:prSet presAssocID="{AC3A6B20-175D-491A-9C91-77C001B76FB9}" presName="Child" presStyleLbl="revTx" presStyleIdx="3" presStyleCnt="21">
-        <dgm:presLayoutVars>
-          <dgm:chMax val="0"/>
-          <dgm:chPref val="0"/>
-          <dgm:bulletEnabled val="1"/>
-        </dgm:presLayoutVars>
-      </dgm:prSet>
-      <dgm:spPr/>
-    </dgm:pt>
-    <dgm:pt modelId="{2592F0F5-9C54-4D22-94B8-17B21FABE932}" type="pres">
-      <dgm:prSet presAssocID="{742BDE98-C03F-4F44-B400-B301F27C4FFF}" presName="sibTrans" presStyleCnt="0"/>
-      <dgm:spPr/>
-    </dgm:pt>
     <dgm:pt modelId="{3A39AE07-9BE7-48F4-B3C4-2DBA1E2F55E0}" type="pres">
       <dgm:prSet presAssocID="{B02C7BCD-7788-4C02-ACD4-5934A395B240}" presName="composite" presStyleCnt="0"/>
       <dgm:spPr/>
     </dgm:pt>
     <dgm:pt modelId="{118E5681-A01F-48DA-B382-3C37E518C7D0}" type="pres">
-      <dgm:prSet presAssocID="{B02C7BCD-7788-4C02-ACD4-5934A395B240}" presName="FirstChild" presStyleLbl="revTx" presStyleIdx="4" presStyleCnt="21">
+      <dgm:prSet presAssocID="{B02C7BCD-7788-4C02-ACD4-5934A395B240}" presName="FirstChild" presStyleLbl="revTx" presStyleIdx="2" presStyleCnt="15">
         <dgm:presLayoutVars>
           <dgm:chMax val="0"/>
           <dgm:chPref val="0"/>
@@ -7135,7 +7326,7 @@
       <dgm:spPr/>
     </dgm:pt>
     <dgm:pt modelId="{465D6C46-099A-4807-9C35-16B46C52335D}" type="pres">
-      <dgm:prSet presAssocID="{B02C7BCD-7788-4C02-ACD4-5934A395B240}" presName="Parent" presStyleLbl="alignNode1" presStyleIdx="2" presStyleCnt="11">
+      <dgm:prSet presAssocID="{B02C7BCD-7788-4C02-ACD4-5934A395B240}" presName="Parent" presStyleLbl="alignNode1" presStyleIdx="1" presStyleCnt="8">
         <dgm:presLayoutVars>
           <dgm:chMax val="3"/>
           <dgm:chPref val="3"/>
@@ -7145,11 +7336,11 @@
       <dgm:spPr/>
     </dgm:pt>
     <dgm:pt modelId="{51243CD1-B84E-429E-916B-82BDECAECFE1}" type="pres">
-      <dgm:prSet presAssocID="{B02C7BCD-7788-4C02-ACD4-5934A395B240}" presName="Accent" presStyleLbl="parChTrans1D1" presStyleIdx="2" presStyleCnt="11"/>
+      <dgm:prSet presAssocID="{B02C7BCD-7788-4C02-ACD4-5934A395B240}" presName="Accent" presStyleLbl="parChTrans1D1" presStyleIdx="1" presStyleCnt="8"/>
       <dgm:spPr/>
     </dgm:pt>
-    <dgm:pt modelId="{56E981E0-1351-4720-BC7F-4B4C5EFFDCEE}" type="pres">
-      <dgm:prSet presAssocID="{B02C7BCD-7788-4C02-ACD4-5934A395B240}" presName="Child" presStyleLbl="revTx" presStyleIdx="5" presStyleCnt="21">
+    <dgm:pt modelId="{0BE76B25-5F2E-46FE-BAF9-2C71A27848BA}" type="pres">
+      <dgm:prSet presAssocID="{B02C7BCD-7788-4C02-ACD4-5934A395B240}" presName="Child" presStyleLbl="revTx" presStyleIdx="3" presStyleCnt="15">
         <dgm:presLayoutVars>
           <dgm:chMax val="0"/>
           <dgm:chPref val="0"/>
@@ -7162,54 +7353,12 @@
       <dgm:prSet presAssocID="{F2FE340E-8A79-4BFB-BF1E-AE804A0DDE12}" presName="sibTrans" presStyleCnt="0"/>
       <dgm:spPr/>
     </dgm:pt>
-    <dgm:pt modelId="{1F2000C7-C315-4F3F-B982-4A40EE333889}" type="pres">
-      <dgm:prSet presAssocID="{28055689-C33D-46BC-A0D8-5A4E14CA7C37}" presName="composite" presStyleCnt="0"/>
-      <dgm:spPr/>
-    </dgm:pt>
-    <dgm:pt modelId="{D4C3DA9B-B2C3-4B2A-9886-DA80C30211A5}" type="pres">
-      <dgm:prSet presAssocID="{28055689-C33D-46BC-A0D8-5A4E14CA7C37}" presName="FirstChild" presStyleLbl="revTx" presStyleIdx="6" presStyleCnt="21">
-        <dgm:presLayoutVars>
-          <dgm:chMax val="0"/>
-          <dgm:chPref val="0"/>
-          <dgm:bulletEnabled val="1"/>
-        </dgm:presLayoutVars>
-      </dgm:prSet>
-      <dgm:spPr/>
-    </dgm:pt>
-    <dgm:pt modelId="{D75E8FA6-B10D-45EE-A8CE-3A8CA659F85A}" type="pres">
-      <dgm:prSet presAssocID="{28055689-C33D-46BC-A0D8-5A4E14CA7C37}" presName="Parent" presStyleLbl="alignNode1" presStyleIdx="3" presStyleCnt="11">
-        <dgm:presLayoutVars>
-          <dgm:chMax val="3"/>
-          <dgm:chPref val="3"/>
-          <dgm:bulletEnabled val="1"/>
-        </dgm:presLayoutVars>
-      </dgm:prSet>
-      <dgm:spPr/>
-    </dgm:pt>
-    <dgm:pt modelId="{958B5D1B-5822-43E0-BCA1-36F641F3C371}" type="pres">
-      <dgm:prSet presAssocID="{28055689-C33D-46BC-A0D8-5A4E14CA7C37}" presName="Accent" presStyleLbl="parChTrans1D1" presStyleIdx="3" presStyleCnt="11"/>
-      <dgm:spPr/>
-    </dgm:pt>
-    <dgm:pt modelId="{0D2785ED-25DA-4F58-B8D7-482843FF44D5}" type="pres">
-      <dgm:prSet presAssocID="{28055689-C33D-46BC-A0D8-5A4E14CA7C37}" presName="Child" presStyleLbl="revTx" presStyleIdx="7" presStyleCnt="21">
-        <dgm:presLayoutVars>
-          <dgm:chMax val="0"/>
-          <dgm:chPref val="0"/>
-          <dgm:bulletEnabled val="1"/>
-        </dgm:presLayoutVars>
-      </dgm:prSet>
-      <dgm:spPr/>
-    </dgm:pt>
-    <dgm:pt modelId="{6CB5847E-A727-43DB-BAFD-FD4254F73EB5}" type="pres">
-      <dgm:prSet presAssocID="{0B14F490-71D9-407E-B30F-A79BC19A9B7B}" presName="sibTrans" presStyleCnt="0"/>
-      <dgm:spPr/>
-    </dgm:pt>
     <dgm:pt modelId="{72722F67-49FF-4EB4-8DCE-3A772008011E}" type="pres">
       <dgm:prSet presAssocID="{C92E27EF-E0F1-4413-AF85-E10E532C8B55}" presName="composite" presStyleCnt="0"/>
       <dgm:spPr/>
     </dgm:pt>
     <dgm:pt modelId="{91D9B644-7EA5-4262-9749-6B0E185D3352}" type="pres">
-      <dgm:prSet presAssocID="{C92E27EF-E0F1-4413-AF85-E10E532C8B55}" presName="FirstChild" presStyleLbl="revTx" presStyleIdx="8" presStyleCnt="21">
+      <dgm:prSet presAssocID="{C92E27EF-E0F1-4413-AF85-E10E532C8B55}" presName="FirstChild" presStyleLbl="revTx" presStyleIdx="4" presStyleCnt="15">
         <dgm:presLayoutVars>
           <dgm:chMax val="0"/>
           <dgm:chPref val="0"/>
@@ -7219,7 +7368,7 @@
       <dgm:spPr/>
     </dgm:pt>
     <dgm:pt modelId="{84AE48BC-DA1D-40BA-8F88-E274C7CD9EF6}" type="pres">
-      <dgm:prSet presAssocID="{C92E27EF-E0F1-4413-AF85-E10E532C8B55}" presName="Parent" presStyleLbl="alignNode1" presStyleIdx="4" presStyleCnt="11">
+      <dgm:prSet presAssocID="{C92E27EF-E0F1-4413-AF85-E10E532C8B55}" presName="Parent" presStyleLbl="alignNode1" presStyleIdx="2" presStyleCnt="8">
         <dgm:presLayoutVars>
           <dgm:chMax val="3"/>
           <dgm:chPref val="3"/>
@@ -7229,11 +7378,11 @@
       <dgm:spPr/>
     </dgm:pt>
     <dgm:pt modelId="{FD11AE15-B881-4656-85EE-DC9F38302029}" type="pres">
-      <dgm:prSet presAssocID="{C92E27EF-E0F1-4413-AF85-E10E532C8B55}" presName="Accent" presStyleLbl="parChTrans1D1" presStyleIdx="4" presStyleCnt="11"/>
+      <dgm:prSet presAssocID="{C92E27EF-E0F1-4413-AF85-E10E532C8B55}" presName="Accent" presStyleLbl="parChTrans1D1" presStyleIdx="2" presStyleCnt="8"/>
       <dgm:spPr/>
     </dgm:pt>
-    <dgm:pt modelId="{0EDA52D8-B2F3-49C3-91C1-650682A2A143}" type="pres">
-      <dgm:prSet presAssocID="{C92E27EF-E0F1-4413-AF85-E10E532C8B55}" presName="Child" presStyleLbl="revTx" presStyleIdx="9" presStyleCnt="21">
+    <dgm:pt modelId="{217AD732-8CA0-43F1-9ECF-04D0D5FA232D}" type="pres">
+      <dgm:prSet presAssocID="{C92E27EF-E0F1-4413-AF85-E10E532C8B55}" presName="Child" presStyleLbl="revTx" presStyleIdx="5" presStyleCnt="15">
         <dgm:presLayoutVars>
           <dgm:chMax val="0"/>
           <dgm:chPref val="0"/>
@@ -7251,7 +7400,7 @@
       <dgm:spPr/>
     </dgm:pt>
     <dgm:pt modelId="{E23D76BD-9B7B-4255-9A94-253A99336C15}" type="pres">
-      <dgm:prSet presAssocID="{3624343E-7132-44FD-A0C7-B58ADBCB5F3D}" presName="FirstChild" presStyleLbl="revTx" presStyleIdx="10" presStyleCnt="21">
+      <dgm:prSet presAssocID="{3624343E-7132-44FD-A0C7-B58ADBCB5F3D}" presName="FirstChild" presStyleLbl="revTx" presStyleIdx="6" presStyleCnt="15">
         <dgm:presLayoutVars>
           <dgm:chMax val="0"/>
           <dgm:chPref val="0"/>
@@ -7261,7 +7410,7 @@
       <dgm:spPr/>
     </dgm:pt>
     <dgm:pt modelId="{3702427B-65FD-4B5E-979C-884E0D9FDFDB}" type="pres">
-      <dgm:prSet presAssocID="{3624343E-7132-44FD-A0C7-B58ADBCB5F3D}" presName="Parent" presStyleLbl="alignNode1" presStyleIdx="5" presStyleCnt="11">
+      <dgm:prSet presAssocID="{3624343E-7132-44FD-A0C7-B58ADBCB5F3D}" presName="Parent" presStyleLbl="alignNode1" presStyleIdx="3" presStyleCnt="8">
         <dgm:presLayoutVars>
           <dgm:chMax val="3"/>
           <dgm:chPref val="3"/>
@@ -7271,11 +7420,11 @@
       <dgm:spPr/>
     </dgm:pt>
     <dgm:pt modelId="{9F83BF5C-E022-49DD-8719-D4745C944F77}" type="pres">
-      <dgm:prSet presAssocID="{3624343E-7132-44FD-A0C7-B58ADBCB5F3D}" presName="Accent" presStyleLbl="parChTrans1D1" presStyleIdx="5" presStyleCnt="11"/>
+      <dgm:prSet presAssocID="{3624343E-7132-44FD-A0C7-B58ADBCB5F3D}" presName="Accent" presStyleLbl="parChTrans1D1" presStyleIdx="3" presStyleCnt="8"/>
       <dgm:spPr/>
     </dgm:pt>
-    <dgm:pt modelId="{B9177805-0EEA-4CA0-A4DA-A3DEDD5890CC}" type="pres">
-      <dgm:prSet presAssocID="{3624343E-7132-44FD-A0C7-B58ADBCB5F3D}" presName="Child" presStyleLbl="revTx" presStyleIdx="11" presStyleCnt="21">
+    <dgm:pt modelId="{6A390EB7-1432-4B3E-A0FB-5D71D763BDC8}" type="pres">
+      <dgm:prSet presAssocID="{3624343E-7132-44FD-A0C7-B58ADBCB5F3D}" presName="Child" presStyleLbl="revTx" presStyleIdx="7" presStyleCnt="15">
         <dgm:presLayoutVars>
           <dgm:chMax val="0"/>
           <dgm:chPref val="0"/>
@@ -7293,7 +7442,7 @@
       <dgm:spPr/>
     </dgm:pt>
     <dgm:pt modelId="{0EE58AFD-5D76-427B-A339-EEF7E88F102D}" type="pres">
-      <dgm:prSet presAssocID="{94BD86F8-B827-47CE-9ACB-6114BD158343}" presName="FirstChild" presStyleLbl="revTx" presStyleIdx="12" presStyleCnt="21">
+      <dgm:prSet presAssocID="{94BD86F8-B827-47CE-9ACB-6114BD158343}" presName="FirstChild" presStyleLbl="revTx" presStyleIdx="8" presStyleCnt="15">
         <dgm:presLayoutVars>
           <dgm:chMax val="0"/>
           <dgm:chPref val="0"/>
@@ -7303,7 +7452,7 @@
       <dgm:spPr/>
     </dgm:pt>
     <dgm:pt modelId="{DE2677DB-D70B-4D3E-8A29-A769C3568B51}" type="pres">
-      <dgm:prSet presAssocID="{94BD86F8-B827-47CE-9ACB-6114BD158343}" presName="Parent" presStyleLbl="alignNode1" presStyleIdx="6" presStyleCnt="11">
+      <dgm:prSet presAssocID="{94BD86F8-B827-47CE-9ACB-6114BD158343}" presName="Parent" presStyleLbl="alignNode1" presStyleIdx="4" presStyleCnt="8">
         <dgm:presLayoutVars>
           <dgm:chMax val="3"/>
           <dgm:chPref val="3"/>
@@ -7313,11 +7462,11 @@
       <dgm:spPr/>
     </dgm:pt>
     <dgm:pt modelId="{295CC725-B06B-4C55-B4AE-D632DFB22198}" type="pres">
-      <dgm:prSet presAssocID="{94BD86F8-B827-47CE-9ACB-6114BD158343}" presName="Accent" presStyleLbl="parChTrans1D1" presStyleIdx="6" presStyleCnt="11"/>
+      <dgm:prSet presAssocID="{94BD86F8-B827-47CE-9ACB-6114BD158343}" presName="Accent" presStyleLbl="parChTrans1D1" presStyleIdx="4" presStyleCnt="8"/>
       <dgm:spPr/>
     </dgm:pt>
-    <dgm:pt modelId="{6C89E044-15C9-480C-812F-B9FFE4EC7A82}" type="pres">
-      <dgm:prSet presAssocID="{94BD86F8-B827-47CE-9ACB-6114BD158343}" presName="Child" presStyleLbl="revTx" presStyleIdx="13" presStyleCnt="21">
+    <dgm:pt modelId="{EAD70D50-8109-4941-A13C-2B261DD10D12}" type="pres">
+      <dgm:prSet presAssocID="{94BD86F8-B827-47CE-9ACB-6114BD158343}" presName="Child" presStyleLbl="revTx" presStyleIdx="9" presStyleCnt="15">
         <dgm:presLayoutVars>
           <dgm:chMax val="0"/>
           <dgm:chPref val="0"/>
@@ -7335,7 +7484,7 @@
       <dgm:spPr/>
     </dgm:pt>
     <dgm:pt modelId="{2B8963A4-3F80-476E-BA4E-A2D705B3B4A3}" type="pres">
-      <dgm:prSet presAssocID="{EB461B6C-720B-4580-8BA0-18616F181644}" presName="FirstChild" presStyleLbl="revTx" presStyleIdx="14" presStyleCnt="21">
+      <dgm:prSet presAssocID="{EB461B6C-720B-4580-8BA0-18616F181644}" presName="FirstChild" presStyleLbl="revTx" presStyleIdx="10" presStyleCnt="15">
         <dgm:presLayoutVars>
           <dgm:chMax val="0"/>
           <dgm:chPref val="0"/>
@@ -7345,7 +7494,7 @@
       <dgm:spPr/>
     </dgm:pt>
     <dgm:pt modelId="{CC2DBB29-65F7-40B6-B2EF-C74BC43B1881}" type="pres">
-      <dgm:prSet presAssocID="{EB461B6C-720B-4580-8BA0-18616F181644}" presName="Parent" presStyleLbl="alignNode1" presStyleIdx="7" presStyleCnt="11">
+      <dgm:prSet presAssocID="{EB461B6C-720B-4580-8BA0-18616F181644}" presName="Parent" presStyleLbl="alignNode1" presStyleIdx="5" presStyleCnt="8">
         <dgm:presLayoutVars>
           <dgm:chMax val="3"/>
           <dgm:chPref val="3"/>
@@ -7355,11 +7504,11 @@
       <dgm:spPr/>
     </dgm:pt>
     <dgm:pt modelId="{E2B24FF4-E210-44D5-9D9F-6A67397F2EC5}" type="pres">
-      <dgm:prSet presAssocID="{EB461B6C-720B-4580-8BA0-18616F181644}" presName="Accent" presStyleLbl="parChTrans1D1" presStyleIdx="7" presStyleCnt="11"/>
+      <dgm:prSet presAssocID="{EB461B6C-720B-4580-8BA0-18616F181644}" presName="Accent" presStyleLbl="parChTrans1D1" presStyleIdx="5" presStyleCnt="8"/>
       <dgm:spPr/>
     </dgm:pt>
-    <dgm:pt modelId="{1868F4D9-1C89-4118-8485-7DE0BE6CB50F}" type="pres">
-      <dgm:prSet presAssocID="{EB461B6C-720B-4580-8BA0-18616F181644}" presName="Child" presStyleLbl="revTx" presStyleIdx="15" presStyleCnt="21">
+    <dgm:pt modelId="{CDF3D050-6784-48D6-94CF-6E6691096B81}" type="pres">
+      <dgm:prSet presAssocID="{EB461B6C-720B-4580-8BA0-18616F181644}" presName="Child" presStyleLbl="revTx" presStyleIdx="11" presStyleCnt="15">
         <dgm:presLayoutVars>
           <dgm:chMax val="0"/>
           <dgm:chPref val="0"/>
@@ -7377,7 +7526,7 @@
       <dgm:spPr/>
     </dgm:pt>
     <dgm:pt modelId="{D454878E-0E20-471D-8E9E-99F3CE89948C}" type="pres">
-      <dgm:prSet presAssocID="{29CF023A-9E50-48E8-9D3E-26B1D6D24003}" presName="FirstChild" presStyleLbl="revTx" presStyleIdx="16" presStyleCnt="21">
+      <dgm:prSet presAssocID="{29CF023A-9E50-48E8-9D3E-26B1D6D24003}" presName="FirstChild" presStyleLbl="revTx" presStyleIdx="12" presStyleCnt="15">
         <dgm:presLayoutVars>
           <dgm:chMax val="0"/>
           <dgm:chPref val="0"/>
@@ -7387,7 +7536,7 @@
       <dgm:spPr/>
     </dgm:pt>
     <dgm:pt modelId="{8FE37526-D54B-475C-A1B1-5E20AE6E3E44}" type="pres">
-      <dgm:prSet presAssocID="{29CF023A-9E50-48E8-9D3E-26B1D6D24003}" presName="Parent" presStyleLbl="alignNode1" presStyleIdx="8" presStyleCnt="11">
+      <dgm:prSet presAssocID="{29CF023A-9E50-48E8-9D3E-26B1D6D24003}" presName="Parent" presStyleLbl="alignNode1" presStyleIdx="6" presStyleCnt="8">
         <dgm:presLayoutVars>
           <dgm:chMax val="3"/>
           <dgm:chPref val="3"/>
@@ -7397,11 +7546,11 @@
       <dgm:spPr/>
     </dgm:pt>
     <dgm:pt modelId="{22F1F5BF-6A44-4242-A03B-8E2BC8DAADE7}" type="pres">
-      <dgm:prSet presAssocID="{29CF023A-9E50-48E8-9D3E-26B1D6D24003}" presName="Accent" presStyleLbl="parChTrans1D1" presStyleIdx="8" presStyleCnt="11"/>
+      <dgm:prSet presAssocID="{29CF023A-9E50-48E8-9D3E-26B1D6D24003}" presName="Accent" presStyleLbl="parChTrans1D1" presStyleIdx="6" presStyleCnt="8"/>
       <dgm:spPr/>
     </dgm:pt>
-    <dgm:pt modelId="{12B15CF7-FE48-4F1B-84B8-AD7123298C2B}" type="pres">
-      <dgm:prSet presAssocID="{29CF023A-9E50-48E8-9D3E-26B1D6D24003}" presName="Child" presStyleLbl="revTx" presStyleIdx="17" presStyleCnt="21">
+    <dgm:pt modelId="{3D3AC76A-F12C-419B-8A6A-479DEDD91A5E}" type="pres">
+      <dgm:prSet presAssocID="{29CF023A-9E50-48E8-9D3E-26B1D6D24003}" presName="Child" presStyleLbl="revTx" presStyleIdx="13" presStyleCnt="15">
         <dgm:presLayoutVars>
           <dgm:chMax val="0"/>
           <dgm:chPref val="0"/>
@@ -7419,7 +7568,7 @@
       <dgm:spPr/>
     </dgm:pt>
     <dgm:pt modelId="{605FBAFD-7EA1-4EA4-8B82-CD1C3234DEC5}" type="pres">
-      <dgm:prSet presAssocID="{E498BAAC-2368-4E0D-AB25-A24BD0B4C9C4}" presName="FirstChild" presStyleLbl="revTx" presStyleIdx="18" presStyleCnt="21">
+      <dgm:prSet presAssocID="{E498BAAC-2368-4E0D-AB25-A24BD0B4C9C4}" presName="FirstChild" presStyleLbl="revTx" presStyleIdx="14" presStyleCnt="15">
         <dgm:presLayoutVars>
           <dgm:chMax val="0"/>
           <dgm:chPref val="0"/>
@@ -7429,7 +7578,7 @@
       <dgm:spPr/>
     </dgm:pt>
     <dgm:pt modelId="{73050604-3250-4039-B6B4-21989449E22C}" type="pres">
-      <dgm:prSet presAssocID="{E498BAAC-2368-4E0D-AB25-A24BD0B4C9C4}" presName="Parent" presStyleLbl="alignNode1" presStyleIdx="9" presStyleCnt="11">
+      <dgm:prSet presAssocID="{E498BAAC-2368-4E0D-AB25-A24BD0B4C9C4}" presName="Parent" presStyleLbl="alignNode1" presStyleIdx="7" presStyleCnt="8">
         <dgm:presLayoutVars>
           <dgm:chMax val="3"/>
           <dgm:chPref val="3"/>
@@ -7439,180 +7588,104 @@
       <dgm:spPr/>
     </dgm:pt>
     <dgm:pt modelId="{CF7A2ACC-58E4-408D-87EF-89B2FDED944F}" type="pres">
-      <dgm:prSet presAssocID="{E498BAAC-2368-4E0D-AB25-A24BD0B4C9C4}" presName="Accent" presStyleLbl="parChTrans1D1" presStyleIdx="9" presStyleCnt="11"/>
-      <dgm:spPr/>
-    </dgm:pt>
-    <dgm:pt modelId="{A86A7049-486F-4F6D-B0E0-46DC545BD141}" type="pres">
-      <dgm:prSet presAssocID="{E498BAAC-2368-4E0D-AB25-A24BD0B4C9C4}" presName="Child" presStyleLbl="revTx" presStyleIdx="19" presStyleCnt="21">
-        <dgm:presLayoutVars>
-          <dgm:chMax val="0"/>
-          <dgm:chPref val="0"/>
-          <dgm:bulletEnabled val="1"/>
-        </dgm:presLayoutVars>
-      </dgm:prSet>
-      <dgm:spPr/>
-    </dgm:pt>
-    <dgm:pt modelId="{EF2A9862-3052-41C2-83CA-B5896123F60E}" type="pres">
-      <dgm:prSet presAssocID="{A0CC2E1C-71A7-45B7-9AF0-CBA38A964377}" presName="sibTrans" presStyleCnt="0"/>
-      <dgm:spPr/>
-    </dgm:pt>
-    <dgm:pt modelId="{FF181892-2B43-42A1-9C8D-CBDE7C21C2D7}" type="pres">
-      <dgm:prSet presAssocID="{9054D832-36F2-4A7E-8B41-3C8A4CD4DA57}" presName="composite" presStyleCnt="0"/>
-      <dgm:spPr/>
-    </dgm:pt>
-    <dgm:pt modelId="{3335CECF-89AF-4269-B52F-2B44089DF289}" type="pres">
-      <dgm:prSet presAssocID="{9054D832-36F2-4A7E-8B41-3C8A4CD4DA57}" presName="FirstChild" presStyleLbl="revTx" presStyleIdx="20" presStyleCnt="21">
-        <dgm:presLayoutVars>
-          <dgm:chMax val="0"/>
-          <dgm:chPref val="0"/>
-          <dgm:bulletEnabled val="1"/>
-        </dgm:presLayoutVars>
-      </dgm:prSet>
-      <dgm:spPr/>
-    </dgm:pt>
-    <dgm:pt modelId="{CCE21C9B-9066-4697-93E2-C88B2F4CB569}" type="pres">
-      <dgm:prSet presAssocID="{9054D832-36F2-4A7E-8B41-3C8A4CD4DA57}" presName="Parent" presStyleLbl="alignNode1" presStyleIdx="10" presStyleCnt="11">
-        <dgm:presLayoutVars>
-          <dgm:chMax val="3"/>
-          <dgm:chPref val="3"/>
-          <dgm:bulletEnabled val="1"/>
-        </dgm:presLayoutVars>
-      </dgm:prSet>
-      <dgm:spPr/>
-    </dgm:pt>
-    <dgm:pt modelId="{E55BF26C-8961-413C-BF13-CCFB7517F782}" type="pres">
-      <dgm:prSet presAssocID="{9054D832-36F2-4A7E-8B41-3C8A4CD4DA57}" presName="Accent" presStyleLbl="parChTrans1D1" presStyleIdx="10" presStyleCnt="11"/>
+      <dgm:prSet presAssocID="{E498BAAC-2368-4E0D-AB25-A24BD0B4C9C4}" presName="Accent" presStyleLbl="parChTrans1D1" presStyleIdx="7" presStyleCnt="8"/>
       <dgm:spPr/>
     </dgm:pt>
   </dgm:ptLst>
   <dgm:cxnLst>
-    <dgm:cxn modelId="{7C469F05-F46E-41D7-BB6D-B98FCD25748A}" srcId="{3624343E-7132-44FD-A0C7-B58ADBCB5F3D}" destId="{7716EE60-72F4-4D1C-90EE-3A821F0ABF91}" srcOrd="1" destOrd="0" parTransId="{09A623F8-6656-42C3-ADA8-2BA6571FB28D}" sibTransId="{D77C7524-9932-4779-B200-7D081D77C418}"/>
+    <dgm:cxn modelId="{A01C1208-32B9-45AE-A2E4-E6783390B0E2}" type="presOf" srcId="{EA065B4C-B31B-4194-90F8-74D4776CD405}" destId="{217AD732-8CA0-43F1-9ECF-04D0D5FA232D}" srcOrd="0" destOrd="0" presId="urn:microsoft.com/office/officeart/2011/layout/TabList"/>
     <dgm:cxn modelId="{5FD68F09-8CD3-4EF4-8B4F-7BBCD9224350}" type="presOf" srcId="{6F3541ED-F66E-4589-A47E-65DFA9D7D40B}" destId="{118E5681-A01F-48DA-B382-3C37E518C7D0}" srcOrd="0" destOrd="0" presId="urn:microsoft.com/office/officeart/2011/layout/TabList"/>
+    <dgm:cxn modelId="{A034470B-5E9F-4B10-ADEF-991649139DB4}" srcId="{29CF023A-9E50-48E8-9D3E-26B1D6D24003}" destId="{A6E35334-F5D6-452B-94CA-750A24E297F0}" srcOrd="0" destOrd="0" parTransId="{2BA2BE60-FDF7-4F7D-A844-C16206B62F78}" sibTransId="{A2E80228-0CE9-4D7B-A3DC-F23B31440778}"/>
+    <dgm:cxn modelId="{FD204F0B-7C7E-40F9-A5C0-2D40B3075358}" type="presOf" srcId="{DC4FB978-CD8C-4DFD-9C6A-45E81509FFED}" destId="{4A8B0C5B-C36D-4A9A-BDBF-2138A3AD6896}" srcOrd="0" destOrd="0" presId="urn:microsoft.com/office/officeart/2011/layout/TabList"/>
     <dgm:cxn modelId="{B4744916-F2A4-4BF6-8BAE-C8388EEF4BA2}" type="presOf" srcId="{B02C7BCD-7788-4C02-ACD4-5934A395B240}" destId="{465D6C46-099A-4807-9C35-16B46C52335D}" srcOrd="0" destOrd="0" presId="urn:microsoft.com/office/officeart/2011/layout/TabList"/>
-    <dgm:cxn modelId="{225E0320-3E02-471E-857F-CE20B5D7167A}" type="presOf" srcId="{D9CA069B-1747-4D35-9E47-48E45E091598}" destId="{1868F4D9-1C89-4118-8485-7DE0BE6CB50F}" srcOrd="0" destOrd="0" presId="urn:microsoft.com/office/officeart/2011/layout/TabList"/>
+    <dgm:cxn modelId="{B7488819-C448-446C-879E-10770B109617}" type="presOf" srcId="{2FF8908B-4CF2-4A69-A470-DDDD1CAFE3FC}" destId="{3D3AC76A-F12C-419B-8A6A-479DEDD91A5E}" srcOrd="0" destOrd="0" presId="urn:microsoft.com/office/officeart/2011/layout/TabList"/>
     <dgm:cxn modelId="{59AAFE28-3E22-4262-BA0C-9F1037C3FABA}" type="presOf" srcId="{3624343E-7132-44FD-A0C7-B58ADBCB5F3D}" destId="{3702427B-65FD-4B5E-979C-884E0D9FDFDB}" srcOrd="0" destOrd="0" presId="urn:microsoft.com/office/officeart/2011/layout/TabList"/>
     <dgm:cxn modelId="{5AD5472D-0D2A-4A3F-B9BE-2AE0AB02AA5B}" type="presOf" srcId="{E498BAAC-2368-4E0D-AB25-A24BD0B4C9C4}" destId="{73050604-3250-4039-B6B4-21989449E22C}" srcOrd="0" destOrd="0" presId="urn:microsoft.com/office/officeart/2011/layout/TabList"/>
-    <dgm:cxn modelId="{365A502D-1A1F-4D44-93CB-CBAD470CFECC}" type="presOf" srcId="{7F5141EE-4016-42CC-82F5-69EEC372C0EE}" destId="{12B15CF7-FE48-4F1B-84B8-AD7123298C2B}" srcOrd="0" destOrd="0" presId="urn:microsoft.com/office/officeart/2011/layout/TabList"/>
-    <dgm:cxn modelId="{A51C4433-6C35-420E-BE27-98E1D23C34FA}" type="presOf" srcId="{2FF8908B-4CF2-4A69-A470-DDDD1CAFE3FC}" destId="{D454878E-0E20-471D-8E9E-99F3CE89948C}" srcOrd="0" destOrd="0" presId="urn:microsoft.com/office/officeart/2011/layout/TabList"/>
-    <dgm:cxn modelId="{86FE4834-4DC1-469F-BA2E-EEBF533FF415}" srcId="{94BD86F8-B827-47CE-9ACB-6114BD158343}" destId="{C33C5555-70B5-420A-AA93-246C52F841A7}" srcOrd="0" destOrd="0" parTransId="{BF7214EA-A450-4B59-B831-03D8A3EBD171}" sibTransId="{9E7F877A-CEC2-4491-8C32-09CF94EB02C3}"/>
-    <dgm:cxn modelId="{9D9E6C35-46DA-412A-9C07-27D8C115097D}" type="presOf" srcId="{07CCCA9E-8AE9-4CFE-89A8-6E51EF5783A1}" destId="{E23D76BD-9B7B-4255-9A94-253A99336C15}" srcOrd="0" destOrd="0" presId="urn:microsoft.com/office/officeart/2011/layout/TabList"/>
-    <dgm:cxn modelId="{E49D9136-5C3E-45DA-8D89-50C84E1414DC}" srcId="{E1470464-0D0D-41E0-BF81-4ECF610F6492}" destId="{EB461B6C-720B-4580-8BA0-18616F181644}" srcOrd="7" destOrd="0" parTransId="{A17D1F72-0A54-4F5A-BA75-F6F0FAFE8442}" sibTransId="{EF4F7F47-FA0C-43A8-AE6A-DEA6F89832A0}"/>
+    <dgm:cxn modelId="{86FE4834-4DC1-469F-BA2E-EEBF533FF415}" srcId="{94BD86F8-B827-47CE-9ACB-6114BD158343}" destId="{C33C5555-70B5-420A-AA93-246C52F841A7}" srcOrd="1" destOrd="0" parTransId="{BF7214EA-A450-4B59-B831-03D8A3EBD171}" sibTransId="{9E7F877A-CEC2-4491-8C32-09CF94EB02C3}"/>
+    <dgm:cxn modelId="{B8330E36-478A-44C0-9C08-32D86E81552F}" type="presOf" srcId="{13CCBE73-FC91-471B-BC11-265F6FDBF13C}" destId="{2B8963A4-3F80-476E-BA4E-A2D705B3B4A3}" srcOrd="0" destOrd="0" presId="urn:microsoft.com/office/officeart/2011/layout/TabList"/>
+    <dgm:cxn modelId="{E49D9136-5C3E-45DA-8D89-50C84E1414DC}" srcId="{E1470464-0D0D-41E0-BF81-4ECF610F6492}" destId="{EB461B6C-720B-4580-8BA0-18616F181644}" srcOrd="5" destOrd="0" parTransId="{A17D1F72-0A54-4F5A-BA75-F6F0FAFE8442}" sibTransId="{EF4F7F47-FA0C-43A8-AE6A-DEA6F89832A0}"/>
+    <dgm:cxn modelId="{C2624639-6062-4140-91CA-CD04AA7D53B6}" srcId="{374F293C-0BEF-4F20-83B1-BB93BECAD7D0}" destId="{DC4FB978-CD8C-4DFD-9C6A-45E81509FFED}" srcOrd="1" destOrd="0" parTransId="{3F8E8C68-26FB-49C3-A65C-949BD0A1F0C3}" sibTransId="{03231A0E-26AF-49C0-9C05-0A79E0A1B5D4}"/>
     <dgm:cxn modelId="{FFE10F3C-EE8F-4726-8D5E-8EA7EDDCB0D1}" srcId="{B02C7BCD-7788-4C02-ACD4-5934A395B240}" destId="{6F3541ED-F66E-4589-A47E-65DFA9D7D40B}" srcOrd="0" destOrd="0" parTransId="{52158278-C8A5-4B10-B16A-6104077D22B2}" sibTransId="{E94275C9-C92C-4FD3-97BA-62451151E6EA}"/>
-    <dgm:cxn modelId="{0800F15D-DEFE-404B-A652-F960967EC655}" type="presOf" srcId="{7716EE60-72F4-4D1C-90EE-3A821F0ABF91}" destId="{B9177805-0EEA-4CA0-A4DA-A3DEDD5890CC}" srcOrd="0" destOrd="0" presId="urn:microsoft.com/office/officeart/2011/layout/TabList"/>
-    <dgm:cxn modelId="{D6558945-3B92-4C60-9373-56263442EA5E}" srcId="{C92E27EF-E0F1-4413-AF85-E10E532C8B55}" destId="{EA065B4C-B31B-4194-90F8-74D4776CD405}" srcOrd="0" destOrd="0" parTransId="{D8170FCE-833C-4BE4-B808-EB4AC0880C56}" sibTransId="{3F6AE7B8-6117-4400-8E55-8B12A6FF07F0}"/>
-    <dgm:cxn modelId="{94C94746-68DF-44B1-B110-2F8060A1E665}" srcId="{B02C7BCD-7788-4C02-ACD4-5934A395B240}" destId="{9369328A-E71E-4F3F-80AC-8FA99017F786}" srcOrd="1" destOrd="0" parTransId="{B9BA3E01-8EB7-401D-959C-F94B8E00E957}" sibTransId="{7532856B-2980-4746-BE32-5430B18D1363}"/>
-    <dgm:cxn modelId="{27315766-0783-474E-9F59-3CF5279AA84E}" srcId="{E1470464-0D0D-41E0-BF81-4ECF610F6492}" destId="{E498BAAC-2368-4E0D-AB25-A24BD0B4C9C4}" srcOrd="9" destOrd="0" parTransId="{F4483882-2EE3-40E8-916A-0201224AEBF8}" sibTransId="{A0CC2E1C-71A7-45B7-9AF0-CBA38A964377}"/>
-    <dgm:cxn modelId="{7F777B46-87E1-4DDC-9C71-DE85FCE3651A}" type="presOf" srcId="{9369328A-E71E-4F3F-80AC-8FA99017F786}" destId="{56E981E0-1351-4720-BC7F-4B4C5EFFDCEE}" srcOrd="0" destOrd="0" presId="urn:microsoft.com/office/officeart/2011/layout/TabList"/>
+    <dgm:cxn modelId="{F4910E5C-8156-45BA-A4BF-CA951A1D32C4}" type="presOf" srcId="{272DEDEB-AC5A-4162-A2CB-4219B96CC4C8}" destId="{E23D76BD-9B7B-4255-9A94-253A99336C15}" srcOrd="0" destOrd="0" presId="urn:microsoft.com/office/officeart/2011/layout/TabList"/>
+    <dgm:cxn modelId="{D6558945-3B92-4C60-9373-56263442EA5E}" srcId="{C92E27EF-E0F1-4413-AF85-E10E532C8B55}" destId="{EA065B4C-B31B-4194-90F8-74D4776CD405}" srcOrd="1" destOrd="0" parTransId="{D8170FCE-833C-4BE4-B808-EB4AC0880C56}" sibTransId="{3F6AE7B8-6117-4400-8E55-8B12A6FF07F0}"/>
+    <dgm:cxn modelId="{27315766-0783-474E-9F59-3CF5279AA84E}" srcId="{E1470464-0D0D-41E0-BF81-4ECF610F6492}" destId="{E498BAAC-2368-4E0D-AB25-A24BD0B4C9C4}" srcOrd="7" destOrd="0" parTransId="{F4483882-2EE3-40E8-916A-0201224AEBF8}" sibTransId="{A0CC2E1C-71A7-45B7-9AF0-CBA38A964377}"/>
+    <dgm:cxn modelId="{83DF0348-300F-4B7D-BB6D-798307EB4212}" srcId="{94BD86F8-B827-47CE-9ACB-6114BD158343}" destId="{D55EC38B-ECE6-4DE1-9474-C2CE93DEC505}" srcOrd="0" destOrd="0" parTransId="{B3BBCF58-51F6-4E50-9414-432FEAA70277}" sibTransId="{6DA8E855-F0F0-431E-A30C-862053946D70}"/>
     <dgm:cxn modelId="{54871B4B-9964-4FC9-A1E8-44C4DDBEFF9C}" type="presOf" srcId="{94BD86F8-B827-47CE-9ACB-6114BD158343}" destId="{DE2677DB-D70B-4D3E-8A29-A769C3568B51}" srcOrd="0" destOrd="0" presId="urn:microsoft.com/office/officeart/2011/layout/TabList"/>
-    <dgm:cxn modelId="{7C859A6B-07F2-47AB-974D-891D9C4BFCBB}" srcId="{E1470464-0D0D-41E0-BF81-4ECF610F6492}" destId="{3624343E-7132-44FD-A0C7-B58ADBCB5F3D}" srcOrd="5" destOrd="0" parTransId="{C6925454-94B6-44F7-B255-3C8740C4F82B}" sibTransId="{417E1063-16D7-4D87-B18F-C7AEFDC1E48B}"/>
-    <dgm:cxn modelId="{756A594C-D70B-4E60-90E6-6EF307197537}" type="presOf" srcId="{28055689-C33D-46BC-A0D8-5A4E14CA7C37}" destId="{D75E8FA6-B10D-45EE-A8CE-3A8CA659F85A}" srcOrd="0" destOrd="0" presId="urn:microsoft.com/office/officeart/2011/layout/TabList"/>
-    <dgm:cxn modelId="{0B387F6D-ED0F-4538-9382-09F5EC6AEC14}" srcId="{E1470464-0D0D-41E0-BF81-4ECF610F6492}" destId="{29CF023A-9E50-48E8-9D3E-26B1D6D24003}" srcOrd="8" destOrd="0" parTransId="{23C3253A-67B8-4A0F-92EF-603D32B6FD91}" sibTransId="{067A3DF4-4B0C-4344-9658-C4F99124027B}"/>
-    <dgm:cxn modelId="{0E62714E-9E3A-4130-992B-CC7E12C67DCB}" srcId="{C92E27EF-E0F1-4413-AF85-E10E532C8B55}" destId="{1BA90B6D-9FD2-4C49-B691-3F3949BCD033}" srcOrd="1" destOrd="0" parTransId="{D50769F4-5BA1-48A1-9FF5-EC2BA89F6019}" sibTransId="{1E975302-19B1-417F-BDAA-953C07403ECF}"/>
-    <dgm:cxn modelId="{05495952-BF10-4628-9E28-A587439EE15A}" srcId="{AC3A6B20-175D-491A-9C91-77C001B76FB9}" destId="{BFB07F2A-1E43-4D74-947C-44ED77FA2E65}" srcOrd="0" destOrd="0" parTransId="{3BE0B1C0-8174-45B3-936B-81EA3B85A86C}" sibTransId="{5E0E69EF-D562-4EC7-8A1E-90C8D484F4EA}"/>
+    <dgm:cxn modelId="{7C859A6B-07F2-47AB-974D-891D9C4BFCBB}" srcId="{E1470464-0D0D-41E0-BF81-4ECF610F6492}" destId="{3624343E-7132-44FD-A0C7-B58ADBCB5F3D}" srcOrd="3" destOrd="0" parTransId="{C6925454-94B6-44F7-B255-3C8740C4F82B}" sibTransId="{417E1063-16D7-4D87-B18F-C7AEFDC1E48B}"/>
+    <dgm:cxn modelId="{C10E424C-5874-4E42-B356-A050D74E4280}" type="presOf" srcId="{DDB6C138-B46A-43DC-8D4C-68782E897D3D}" destId="{91D9B644-7EA5-4262-9749-6B0E185D3352}" srcOrd="0" destOrd="0" presId="urn:microsoft.com/office/officeart/2011/layout/TabList"/>
+    <dgm:cxn modelId="{0B387F6D-ED0F-4538-9382-09F5EC6AEC14}" srcId="{E1470464-0D0D-41E0-BF81-4ECF610F6492}" destId="{29CF023A-9E50-48E8-9D3E-26B1D6D24003}" srcOrd="6" destOrd="0" parTransId="{23C3253A-67B8-4A0F-92EF-603D32B6FD91}" sibTransId="{067A3DF4-4B0C-4344-9658-C4F99124027B}"/>
+    <dgm:cxn modelId="{FE987770-D0BB-408F-A6D5-FBC0054A2670}" srcId="{3624343E-7132-44FD-A0C7-B58ADBCB5F3D}" destId="{272DEDEB-AC5A-4162-A2CB-4219B96CC4C8}" srcOrd="0" destOrd="0" parTransId="{32AF44EB-681C-478E-B11E-C9A277BD5B1D}" sibTransId="{1108AF76-784D-4FC8-B94C-DDEB27F978DF}"/>
     <dgm:cxn modelId="{0AD9CC72-334B-40B6-AA08-10C936AF7141}" type="presOf" srcId="{EB461B6C-720B-4580-8BA0-18616F181644}" destId="{CC2DBB29-65F7-40B6-B2EF-C74BC43B1881}" srcOrd="0" destOrd="0" presId="urn:microsoft.com/office/officeart/2011/layout/TabList"/>
-    <dgm:cxn modelId="{F37C1B55-D2B2-4BD3-9FBC-D983FBAA1005}" srcId="{374F293C-0BEF-4F20-83B1-BB93BECAD7D0}" destId="{27DBC861-7BEE-476F-A1D1-289ABAF60E6B}" srcOrd="1" destOrd="0" parTransId="{E7CCD5C6-3DD3-4D98-9826-604A71E77CF3}" sibTransId="{BB1745AE-6972-4918-802C-A56C27AC7B60}"/>
-    <dgm:cxn modelId="{A1765377-BA68-4228-9E8B-EDF453CB3A0F}" srcId="{E1470464-0D0D-41E0-BF81-4ECF610F6492}" destId="{9054D832-36F2-4A7E-8B41-3C8A4CD4DA57}" srcOrd="10" destOrd="0" parTransId="{CF843F6B-236D-42AD-8703-A62065D64D0C}" sibTransId="{4701C10E-2940-4F11-855D-D5D78C681E6A}"/>
-    <dgm:cxn modelId="{C5D86882-44C7-452A-8BAA-0734407F143E}" srcId="{29CF023A-9E50-48E8-9D3E-26B1D6D24003}" destId="{7F5141EE-4016-42CC-82F5-69EEC372C0EE}" srcOrd="1" destOrd="0" parTransId="{0569F97B-72D5-4778-AB0D-E411C830F7C0}" sibTransId="{9B0C0A17-8A3B-41FB-A64C-E45E66BF073B}"/>
-    <dgm:cxn modelId="{965A7982-8E37-48B6-ABE8-2A72B6964FC4}" srcId="{EB461B6C-720B-4580-8BA0-18616F181644}" destId="{A9A128A8-1919-4FB8-99B6-6176D052CE37}" srcOrd="0" destOrd="0" parTransId="{7143002C-1321-4AC7-A468-86FADF14DA7F}" sibTransId="{49C287DA-D212-4294-B294-D25D7C251A5C}"/>
-    <dgm:cxn modelId="{DE8AA882-F24E-44A3-8FA9-8A5494EA9554}" srcId="{E1470464-0D0D-41E0-BF81-4ECF610F6492}" destId="{B02C7BCD-7788-4C02-ACD4-5934A395B240}" srcOrd="2" destOrd="0" parTransId="{E7242D60-F393-49FA-9B3B-7DBCC34B3396}" sibTransId="{F2FE340E-8A79-4BFB-BF1E-AE804A0DDE12}"/>
-    <dgm:cxn modelId="{F3AE2686-FD71-4568-8862-4CF2FDFC5B0F}" type="presOf" srcId="{A9A128A8-1919-4FB8-99B6-6176D052CE37}" destId="{2B8963A4-3F80-476E-BA4E-A2D705B3B4A3}" srcOrd="0" destOrd="0" presId="urn:microsoft.com/office/officeart/2011/layout/TabList"/>
-    <dgm:cxn modelId="{BF3BE187-B25E-4680-B8A2-9C27298BE27A}" srcId="{29CF023A-9E50-48E8-9D3E-26B1D6D24003}" destId="{2FF8908B-4CF2-4A69-A470-DDDD1CAFE3FC}" srcOrd="0" destOrd="0" parTransId="{10483D2A-F914-4FA7-AD8B-D1BC980FE419}" sibTransId="{E5046965-E92B-4E32-BC23-3306FAB48672}"/>
-    <dgm:cxn modelId="{94B1F487-5E4A-4B7D-8DD2-4B8082049DB7}" srcId="{E1470464-0D0D-41E0-BF81-4ECF610F6492}" destId="{C92E27EF-E0F1-4413-AF85-E10E532C8B55}" srcOrd="4" destOrd="0" parTransId="{5EE3E2BE-D9FB-4BB2-87DB-17288778E4C7}" sibTransId="{C5AF481D-5A92-45FB-B511-7125D6500827}"/>
-    <dgm:cxn modelId="{A94F1F8A-C07D-40E4-8A54-3231C91941CD}" srcId="{EB461B6C-720B-4580-8BA0-18616F181644}" destId="{D9CA069B-1747-4D35-9E47-48E45E091598}" srcOrd="1" destOrd="0" parTransId="{2B5870FD-4572-45FF-9015-56E49D58B8F4}" sibTransId="{EABC52CC-DA59-4F0E-ADD8-9588F5BCC4DD}"/>
-    <dgm:cxn modelId="{F5A73598-4555-4DC8-9C84-1421A46ADABD}" srcId="{28055689-C33D-46BC-A0D8-5A4E14CA7C37}" destId="{D601C70B-858F-4F9F-A6CB-54D2AC5B73BC}" srcOrd="0" destOrd="0" parTransId="{E5B4677A-0926-4162-92D7-E517176CCC6A}" sibTransId="{E5FE353B-3451-4684-9E56-5C9884C3D1FE}"/>
+    <dgm:cxn modelId="{21673475-D165-4DFE-B577-FDEAA5364B35}" type="presOf" srcId="{07CCCA9E-8AE9-4CFE-89A8-6E51EF5783A1}" destId="{6A390EB7-1432-4B3E-A0FB-5D71D763BDC8}" srcOrd="0" destOrd="0" presId="urn:microsoft.com/office/officeart/2011/layout/TabList"/>
+    <dgm:cxn modelId="{965A7982-8E37-48B6-ABE8-2A72B6964FC4}" srcId="{EB461B6C-720B-4580-8BA0-18616F181644}" destId="{A9A128A8-1919-4FB8-99B6-6176D052CE37}" srcOrd="1" destOrd="0" parTransId="{7143002C-1321-4AC7-A468-86FADF14DA7F}" sibTransId="{49C287DA-D212-4294-B294-D25D7C251A5C}"/>
+    <dgm:cxn modelId="{DE8AA882-F24E-44A3-8FA9-8A5494EA9554}" srcId="{E1470464-0D0D-41E0-BF81-4ECF610F6492}" destId="{B02C7BCD-7788-4C02-ACD4-5934A395B240}" srcOrd="1" destOrd="0" parTransId="{E7242D60-F393-49FA-9B3B-7DBCC34B3396}" sibTransId="{F2FE340E-8A79-4BFB-BF1E-AE804A0DDE12}"/>
+    <dgm:cxn modelId="{BF3BE187-B25E-4680-B8A2-9C27298BE27A}" srcId="{29CF023A-9E50-48E8-9D3E-26B1D6D24003}" destId="{2FF8908B-4CF2-4A69-A470-DDDD1CAFE3FC}" srcOrd="1" destOrd="0" parTransId="{10483D2A-F914-4FA7-AD8B-D1BC980FE419}" sibTransId="{E5046965-E92B-4E32-BC23-3306FAB48672}"/>
+    <dgm:cxn modelId="{94B1F487-5E4A-4B7D-8DD2-4B8082049DB7}" srcId="{E1470464-0D0D-41E0-BF81-4ECF610F6492}" destId="{C92E27EF-E0F1-4413-AF85-E10E532C8B55}" srcOrd="2" destOrd="0" parTransId="{5EE3E2BE-D9FB-4BB2-87DB-17288778E4C7}" sibTransId="{C5AF481D-5A92-45FB-B511-7125D6500827}"/>
     <dgm:cxn modelId="{55527B99-F370-461B-AD61-9719BE5C7205}" type="presOf" srcId="{6396F99B-4FE8-4566-9818-243394F9F60F}" destId="{605FBAFD-7EA1-4EA4-8B82-CD1C3234DEC5}" srcOrd="0" destOrd="0" presId="urn:microsoft.com/office/officeart/2011/layout/TabList"/>
-    <dgm:cxn modelId="{4B358A99-E126-402C-A7D2-BFEABF4C4204}" type="presOf" srcId="{C33C5555-70B5-420A-AA93-246C52F841A7}" destId="{0EE58AFD-5D76-427B-A339-EEF7E88F102D}" srcOrd="0" destOrd="0" presId="urn:microsoft.com/office/officeart/2011/layout/TabList"/>
     <dgm:cxn modelId="{75EF629D-CFE5-4275-87F3-D3E40A95B75E}" srcId="{374F293C-0BEF-4F20-83B1-BB93BECAD7D0}" destId="{9D1C9E05-5EFF-4F49-AD96-672AB16710AE}" srcOrd="0" destOrd="0" parTransId="{44EC206E-7655-4B9C-8556-5D427E875958}" sibTransId="{E2FEBCD5-7A24-40FC-8002-4BACF3912DF4}"/>
-    <dgm:cxn modelId="{A210C29D-CEC5-4222-AF08-A5A2A996E6F0}" type="presOf" srcId="{AC3A6B20-175D-491A-9C91-77C001B76FB9}" destId="{6C0988BB-D61C-4204-86DC-481FCB2EFE91}" srcOrd="0" destOrd="0" presId="urn:microsoft.com/office/officeart/2011/layout/TabList"/>
-    <dgm:cxn modelId="{EF58A39E-5E5C-45EF-94DA-B08625305BE8}" srcId="{E1470464-0D0D-41E0-BF81-4ECF610F6492}" destId="{AC3A6B20-175D-491A-9C91-77C001B76FB9}" srcOrd="1" destOrd="0" parTransId="{19558296-5A55-4C40-800E-C50F7E9F7D15}" sibTransId="{742BDE98-C03F-4F44-B400-B301F27C4FFF}"/>
-    <dgm:cxn modelId="{1B2AFD9F-94A8-4CA0-AF42-5E39BA319566}" srcId="{E1470464-0D0D-41E0-BF81-4ECF610F6492}" destId="{94BD86F8-B827-47CE-9ACB-6114BD158343}" srcOrd="6" destOrd="0" parTransId="{7B5766E9-5E87-4846-A896-4EFC37B01336}" sibTransId="{B36A0206-7EFB-4549-8D45-02ED3EE5330A}"/>
+    <dgm:cxn modelId="{1B2AFD9F-94A8-4CA0-AF42-5E39BA319566}" srcId="{E1470464-0D0D-41E0-BF81-4ECF610F6492}" destId="{94BD86F8-B827-47CE-9ACB-6114BD158343}" srcOrd="4" destOrd="0" parTransId="{7B5766E9-5E87-4846-A896-4EFC37B01336}" sibTransId="{B36A0206-7EFB-4549-8D45-02ED3EE5330A}"/>
     <dgm:cxn modelId="{0C1856A0-0B50-4464-B1C5-6700374821F2}" type="presOf" srcId="{29CF023A-9E50-48E8-9D3E-26B1D6D24003}" destId="{8FE37526-D54B-475C-A1B1-5E20AE6E3E44}" srcOrd="0" destOrd="0" presId="urn:microsoft.com/office/officeart/2011/layout/TabList"/>
     <dgm:cxn modelId="{D10114A3-68A2-411D-AFED-5638BA2F7CBD}" type="presOf" srcId="{C92E27EF-E0F1-4413-AF85-E10E532C8B55}" destId="{84AE48BC-DA1D-40BA-8F88-E274C7CD9EF6}" srcOrd="0" destOrd="0" presId="urn:microsoft.com/office/officeart/2011/layout/TabList"/>
-    <dgm:cxn modelId="{3F03A4A3-95C8-44C8-B8AE-B8BC27257CC2}" type="presOf" srcId="{1BA90B6D-9FD2-4C49-B691-3F3949BCD033}" destId="{0EDA52D8-B2F3-49C3-91C1-650682A2A143}" srcOrd="0" destOrd="0" presId="urn:microsoft.com/office/officeart/2011/layout/TabList"/>
-    <dgm:cxn modelId="{5D374BA4-17DC-4CC4-ADD8-678C96C8C5D1}" type="presOf" srcId="{9054D832-36F2-4A7E-8B41-3C8A4CD4DA57}" destId="{CCE21C9B-9066-4697-93E2-C88B2F4CB569}" srcOrd="0" destOrd="0" presId="urn:microsoft.com/office/officeart/2011/layout/TabList"/>
-    <dgm:cxn modelId="{B5E071A4-36FF-4E1F-9D8E-9AF3EFBA380D}" type="presOf" srcId="{680135AC-C30D-43FC-913D-8DFAA7D0D898}" destId="{A86A7049-486F-4F6D-B0E0-46DC545BD141}" srcOrd="0" destOrd="0" presId="urn:microsoft.com/office/officeart/2011/layout/TabList"/>
-    <dgm:cxn modelId="{D59DF4A8-716A-48E9-931F-19CAB739F03B}" type="presOf" srcId="{F35E6A79-1C7F-416D-8442-D1230BB765BC}" destId="{0D2785ED-25DA-4F58-B8D7-482843FF44D5}" srcOrd="0" destOrd="0" presId="urn:microsoft.com/office/officeart/2011/layout/TabList"/>
-    <dgm:cxn modelId="{B1EFE4AF-9190-437C-A02A-7CF43E80386F}" type="presOf" srcId="{D601C70B-858F-4F9F-A6CB-54D2AC5B73BC}" destId="{D4C3DA9B-B2C3-4B2A-9886-DA80C30211A5}" srcOrd="0" destOrd="0" presId="urn:microsoft.com/office/officeart/2011/layout/TabList"/>
-    <dgm:cxn modelId="{CA81A2B2-0B06-4B22-BAF7-AC5BA5C37567}" srcId="{E498BAAC-2368-4E0D-AB25-A24BD0B4C9C4}" destId="{680135AC-C30D-43FC-913D-8DFAA7D0D898}" srcOrd="1" destOrd="0" parTransId="{5ECC075F-1201-45B0-B64E-06A5809AD49A}" sibTransId="{3DE93F00-2E04-4B9E-8449-CB9194A1DE23}"/>
-    <dgm:cxn modelId="{839E59B5-621C-4D43-BEAE-9CE949F60F22}" type="presOf" srcId="{BFB07F2A-1E43-4D74-947C-44ED77FA2E65}" destId="{DE36EA71-4325-4051-A2F4-6F627D3B39EC}" srcOrd="0" destOrd="0" presId="urn:microsoft.com/office/officeart/2011/layout/TabList"/>
-    <dgm:cxn modelId="{128BBEB5-CD98-46F0-B5DC-30409D3ACCD4}" type="presOf" srcId="{27DBC861-7BEE-476F-A1D1-289ABAF60E6B}" destId="{0A9CAE11-38A0-4551-A667-F114C644F6EA}" srcOrd="0" destOrd="0" presId="urn:microsoft.com/office/officeart/2011/layout/TabList"/>
-    <dgm:cxn modelId="{0407FDB5-1B2D-4322-A50B-492AF35FE1BD}" type="presOf" srcId="{1232A54E-D552-4586-8AC7-E3519FDBFC29}" destId="{C6EA8907-C88B-4206-B56B-698549A17776}" srcOrd="0" destOrd="0" presId="urn:microsoft.com/office/officeart/2011/layout/TabList"/>
-    <dgm:cxn modelId="{609B7ABA-A71E-4E39-B214-E0232FE424AD}" srcId="{94BD86F8-B827-47CE-9ACB-6114BD158343}" destId="{2D2B0F85-8C3E-4F93-8A9C-78E1DC994FE9}" srcOrd="1" destOrd="0" parTransId="{3D00E212-E358-4F79-AB84-2F4A30B0F969}" sibTransId="{285D4155-6020-4906-802A-43A21D0A944D}"/>
-    <dgm:cxn modelId="{69D41BD1-2477-4760-A2DB-E0494E35CCFD}" type="presOf" srcId="{EA065B4C-B31B-4194-90F8-74D4776CD405}" destId="{91D9B644-7EA5-4262-9749-6B0E185D3352}" srcOrd="0" destOrd="0" presId="urn:microsoft.com/office/officeart/2011/layout/TabList"/>
-    <dgm:cxn modelId="{650B1BD3-D58B-42E0-A4E6-3B3028C9D4AE}" srcId="{AC3A6B20-175D-491A-9C91-77C001B76FB9}" destId="{1232A54E-D552-4586-8AC7-E3519FDBFC29}" srcOrd="1" destOrd="0" parTransId="{1EF285C4-7F09-4378-A521-638E8CBF45A0}" sibTransId="{AF0A483D-DA2C-427E-9A69-63FC8724EBE4}"/>
+    <dgm:cxn modelId="{2C749CA3-BBF0-4D95-8685-1DAC4E620CC8}" type="presOf" srcId="{A6E35334-F5D6-452B-94CA-750A24E297F0}" destId="{D454878E-0E20-471D-8E9E-99F3CE89948C}" srcOrd="0" destOrd="0" presId="urn:microsoft.com/office/officeart/2011/layout/TabList"/>
+    <dgm:cxn modelId="{8A82BEBB-D9B1-4F38-A441-2EDB8125D7E4}" type="presOf" srcId="{A9A128A8-1919-4FB8-99B6-6176D052CE37}" destId="{CDF3D050-6784-48D6-94CF-6E6691096B81}" srcOrd="0" destOrd="0" presId="urn:microsoft.com/office/officeart/2011/layout/TabList"/>
+    <dgm:cxn modelId="{6B497BBD-897A-4D61-A2F8-27020E4ECC00}" srcId="{C92E27EF-E0F1-4413-AF85-E10E532C8B55}" destId="{DDB6C138-B46A-43DC-8D4C-68782E897D3D}" srcOrd="0" destOrd="0" parTransId="{BF24DD14-3ACB-4759-A1FD-7AC2C845F22B}" sibTransId="{935B4095-84DE-4792-BFB7-D2DC9B07B761}"/>
+    <dgm:cxn modelId="{39DC33CA-6AA2-4675-8197-B2D26CD284CF}" type="presOf" srcId="{D55EC38B-ECE6-4DE1-9474-C2CE93DEC505}" destId="{0EE58AFD-5D76-427B-A339-EEF7E88F102D}" srcOrd="0" destOrd="0" presId="urn:microsoft.com/office/officeart/2011/layout/TabList"/>
+    <dgm:cxn modelId="{F46141CA-4D61-4250-AB87-12A63868FAEE}" type="presOf" srcId="{313AA92B-A685-4FCC-A7CA-D63B8DD70703}" destId="{0BE76B25-5F2E-46FE-BAF9-2C71A27848BA}" srcOrd="0" destOrd="0" presId="urn:microsoft.com/office/officeart/2011/layout/TabList"/>
     <dgm:cxn modelId="{737A8CD4-69EC-43AA-9CE2-3CB752E7B6C9}" srcId="{E1470464-0D0D-41E0-BF81-4ECF610F6492}" destId="{374F293C-0BEF-4F20-83B1-BB93BECAD7D0}" srcOrd="0" destOrd="0" parTransId="{1CC6724E-9831-40F2-9A6F-7EDFD85D1CF0}" sibTransId="{68908B3B-5D7A-42CD-B19F-B62B8C3B9B71}"/>
-    <dgm:cxn modelId="{9D19CCDC-1C83-4371-BEE3-31E9D3E3CD47}" srcId="{3624343E-7132-44FD-A0C7-B58ADBCB5F3D}" destId="{07CCCA9E-8AE9-4CFE-89A8-6E51EF5783A1}" srcOrd="0" destOrd="0" parTransId="{AEB74B4B-5F09-4574-95DB-9FB22AEA0697}" sibTransId="{760FF737-188D-4BB4-9AFA-149AC0657416}"/>
+    <dgm:cxn modelId="{9D19CCDC-1C83-4371-BEE3-31E9D3E3CD47}" srcId="{3624343E-7132-44FD-A0C7-B58ADBCB5F3D}" destId="{07CCCA9E-8AE9-4CFE-89A8-6E51EF5783A1}" srcOrd="1" destOrd="0" parTransId="{AEB74B4B-5F09-4574-95DB-9FB22AEA0697}" sibTransId="{760FF737-188D-4BB4-9AFA-149AC0657416}"/>
     <dgm:cxn modelId="{13AB1EDD-7CA0-4B8A-AF35-D0F77117D247}" type="presOf" srcId="{374F293C-0BEF-4F20-83B1-BB93BECAD7D0}" destId="{E55967B5-2837-4CD0-96FC-63FBF986E964}" srcOrd="0" destOrd="0" presId="urn:microsoft.com/office/officeart/2011/layout/TabList"/>
     <dgm:cxn modelId="{DF09E1E1-A66A-4E71-B098-05D6D70D4AB1}" srcId="{E498BAAC-2368-4E0D-AB25-A24BD0B4C9C4}" destId="{6396F99B-4FE8-4566-9818-243394F9F60F}" srcOrd="0" destOrd="0" parTransId="{31718810-28B3-4EC0-AE94-1FB383CDD5B7}" sibTransId="{210EE711-7C2D-4EB3-9E44-88E90A0C1BF9}"/>
-    <dgm:cxn modelId="{4BD678E4-0C6C-4EC4-AEE2-DA96D8E35C74}" type="presOf" srcId="{2D2B0F85-8C3E-4F93-8A9C-78E1DC994FE9}" destId="{6C89E044-15C9-480C-812F-B9FFE4EC7A82}" srcOrd="0" destOrd="0" presId="urn:microsoft.com/office/officeart/2011/layout/TabList"/>
-    <dgm:cxn modelId="{52998CE4-618D-4F52-B374-E8EA626574AC}" srcId="{E1470464-0D0D-41E0-BF81-4ECF610F6492}" destId="{28055689-C33D-46BC-A0D8-5A4E14CA7C37}" srcOrd="3" destOrd="0" parTransId="{FFA02EC7-A893-4FB9-ADB2-9D53F49A1521}" sibTransId="{0B14F490-71D9-407E-B30F-A79BC19A9B7B}"/>
-    <dgm:cxn modelId="{1EE385E5-E977-43F0-A853-A13C9D0C7070}" srcId="{28055689-C33D-46BC-A0D8-5A4E14CA7C37}" destId="{F35E6A79-1C7F-416D-8442-D1230BB765BC}" srcOrd="1" destOrd="0" parTransId="{10F485D0-C14F-4AD9-AA56-F7C97F09022D}" sibTransId="{EA607062-ED89-45C7-A200-685C644061A4}"/>
+    <dgm:cxn modelId="{460DDBE7-E219-407C-B3A5-4E0E28A4329E}" srcId="{EB461B6C-720B-4580-8BA0-18616F181644}" destId="{13CCBE73-FC91-471B-BC11-265F6FDBF13C}" srcOrd="0" destOrd="0" parTransId="{ECD2A28F-3713-4C33-AEEF-1D8B341BABFC}" sibTransId="{1F138D56-80D3-4772-8FE0-74FF04DF1997}"/>
     <dgm:cxn modelId="{574025E8-F4F7-4357-9942-A54396F3E61E}" type="presOf" srcId="{E1470464-0D0D-41E0-BF81-4ECF610F6492}" destId="{D6B2318A-4DEA-4197-AA73-A3A400565DEF}" srcOrd="0" destOrd="0" presId="urn:microsoft.com/office/officeart/2011/layout/TabList"/>
+    <dgm:cxn modelId="{E0878AF1-2149-475D-A574-CCC5409DB640}" srcId="{B02C7BCD-7788-4C02-ACD4-5934A395B240}" destId="{313AA92B-A685-4FCC-A7CA-D63B8DD70703}" srcOrd="1" destOrd="0" parTransId="{461DCAB9-3082-4B1B-9E74-A5F5A3355C85}" sibTransId="{704FA259-1D98-45A1-940D-7F860AED9116}"/>
+    <dgm:cxn modelId="{597747F6-42AF-4316-8F41-6506D60A9990}" type="presOf" srcId="{C33C5555-70B5-420A-AA93-246C52F841A7}" destId="{EAD70D50-8109-4941-A13C-2B261DD10D12}" srcOrd="0" destOrd="0" presId="urn:microsoft.com/office/officeart/2011/layout/TabList"/>
     <dgm:cxn modelId="{B1326DF8-E6F6-4759-A613-CAA0FC49A244}" type="presOf" srcId="{9D1C9E05-5EFF-4F49-AD96-672AB16710AE}" destId="{97DBADAC-814F-47BB-A1DA-7DA778CAF45C}" srcOrd="0" destOrd="0" presId="urn:microsoft.com/office/officeart/2011/layout/TabList"/>
     <dgm:cxn modelId="{7DF80B03-8BC1-489B-87E4-827FE618A863}" type="presParOf" srcId="{D6B2318A-4DEA-4197-AA73-A3A400565DEF}" destId="{0CA14E4D-1E05-4328-992F-04A57B20FF61}" srcOrd="0" destOrd="0" presId="urn:microsoft.com/office/officeart/2011/layout/TabList"/>
     <dgm:cxn modelId="{B4585E94-5996-4064-BB4C-4CE13AC918B9}" type="presParOf" srcId="{0CA14E4D-1E05-4328-992F-04A57B20FF61}" destId="{97DBADAC-814F-47BB-A1DA-7DA778CAF45C}" srcOrd="0" destOrd="0" presId="urn:microsoft.com/office/officeart/2011/layout/TabList"/>
     <dgm:cxn modelId="{4AF91E90-920F-4C50-BAAB-000BE1E8B034}" type="presParOf" srcId="{0CA14E4D-1E05-4328-992F-04A57B20FF61}" destId="{E55967B5-2837-4CD0-96FC-63FBF986E964}" srcOrd="1" destOrd="0" presId="urn:microsoft.com/office/officeart/2011/layout/TabList"/>
     <dgm:cxn modelId="{1DB2BB6A-1E6A-454A-B26A-866D231BAC43}" type="presParOf" srcId="{0CA14E4D-1E05-4328-992F-04A57B20FF61}" destId="{3020A122-E8FE-42CB-A370-CCD5CAD3AF0A}" srcOrd="2" destOrd="0" presId="urn:microsoft.com/office/officeart/2011/layout/TabList"/>
-    <dgm:cxn modelId="{1C5B2D6D-DF2F-4391-8528-F86EB030E8F5}" type="presParOf" srcId="{D6B2318A-4DEA-4197-AA73-A3A400565DEF}" destId="{0A9CAE11-38A0-4551-A667-F114C644F6EA}" srcOrd="1" destOrd="0" presId="urn:microsoft.com/office/officeart/2011/layout/TabList"/>
+    <dgm:cxn modelId="{D1F1D8C0-DC98-4537-A375-F7F7FE798815}" type="presParOf" srcId="{D6B2318A-4DEA-4197-AA73-A3A400565DEF}" destId="{4A8B0C5B-C36D-4A9A-BDBF-2138A3AD6896}" srcOrd="1" destOrd="0" presId="urn:microsoft.com/office/officeart/2011/layout/TabList"/>
     <dgm:cxn modelId="{FAF9C67A-F074-4FE6-A643-32396B05F750}" type="presParOf" srcId="{D6B2318A-4DEA-4197-AA73-A3A400565DEF}" destId="{97A97919-4C1B-4372-B753-00C84668BA0F}" srcOrd="2" destOrd="0" presId="urn:microsoft.com/office/officeart/2011/layout/TabList"/>
-    <dgm:cxn modelId="{1B20FC02-7090-4E92-900E-B7CE0D03EA08}" type="presParOf" srcId="{D6B2318A-4DEA-4197-AA73-A3A400565DEF}" destId="{2FDD367A-AB15-4D8F-BBC6-725429547D6C}" srcOrd="3" destOrd="0" presId="urn:microsoft.com/office/officeart/2011/layout/TabList"/>
-    <dgm:cxn modelId="{F3663993-5CA2-49B0-846C-D3F1FCA6EC15}" type="presParOf" srcId="{2FDD367A-AB15-4D8F-BBC6-725429547D6C}" destId="{DE36EA71-4325-4051-A2F4-6F627D3B39EC}" srcOrd="0" destOrd="0" presId="urn:microsoft.com/office/officeart/2011/layout/TabList"/>
-    <dgm:cxn modelId="{5D1E0798-3F6C-4CA8-B965-64BF2BB476EE}" type="presParOf" srcId="{2FDD367A-AB15-4D8F-BBC6-725429547D6C}" destId="{6C0988BB-D61C-4204-86DC-481FCB2EFE91}" srcOrd="1" destOrd="0" presId="urn:microsoft.com/office/officeart/2011/layout/TabList"/>
-    <dgm:cxn modelId="{384D5C20-D24A-40B1-A6F3-2B229B426883}" type="presParOf" srcId="{2FDD367A-AB15-4D8F-BBC6-725429547D6C}" destId="{27C259DC-9B3F-4497-BA03-61F65DF29F38}" srcOrd="2" destOrd="0" presId="urn:microsoft.com/office/officeart/2011/layout/TabList"/>
-    <dgm:cxn modelId="{9E50F72B-7885-4ED5-8CB2-1F051A1708B2}" type="presParOf" srcId="{D6B2318A-4DEA-4197-AA73-A3A400565DEF}" destId="{C6EA8907-C88B-4206-B56B-698549A17776}" srcOrd="4" destOrd="0" presId="urn:microsoft.com/office/officeart/2011/layout/TabList"/>
-    <dgm:cxn modelId="{838A3239-AECB-4F50-A650-E699ECF4F43D}" type="presParOf" srcId="{D6B2318A-4DEA-4197-AA73-A3A400565DEF}" destId="{2592F0F5-9C54-4D22-94B8-17B21FABE932}" srcOrd="5" destOrd="0" presId="urn:microsoft.com/office/officeart/2011/layout/TabList"/>
-    <dgm:cxn modelId="{B21ABE32-C3D0-4712-ABBD-E96912D76EB8}" type="presParOf" srcId="{D6B2318A-4DEA-4197-AA73-A3A400565DEF}" destId="{3A39AE07-9BE7-48F4-B3C4-2DBA1E2F55E0}" srcOrd="6" destOrd="0" presId="urn:microsoft.com/office/officeart/2011/layout/TabList"/>
+    <dgm:cxn modelId="{B21ABE32-C3D0-4712-ABBD-E96912D76EB8}" type="presParOf" srcId="{D6B2318A-4DEA-4197-AA73-A3A400565DEF}" destId="{3A39AE07-9BE7-48F4-B3C4-2DBA1E2F55E0}" srcOrd="3" destOrd="0" presId="urn:microsoft.com/office/officeart/2011/layout/TabList"/>
     <dgm:cxn modelId="{C307C385-FB16-4982-AAE4-5A43D02EF5FA}" type="presParOf" srcId="{3A39AE07-9BE7-48F4-B3C4-2DBA1E2F55E0}" destId="{118E5681-A01F-48DA-B382-3C37E518C7D0}" srcOrd="0" destOrd="0" presId="urn:microsoft.com/office/officeart/2011/layout/TabList"/>
     <dgm:cxn modelId="{9B56E57C-1AC9-4129-BB64-B6683BC44FE1}" type="presParOf" srcId="{3A39AE07-9BE7-48F4-B3C4-2DBA1E2F55E0}" destId="{465D6C46-099A-4807-9C35-16B46C52335D}" srcOrd="1" destOrd="0" presId="urn:microsoft.com/office/officeart/2011/layout/TabList"/>
     <dgm:cxn modelId="{FF504AC5-4568-4C6C-AEA0-6F8DB930E9A0}" type="presParOf" srcId="{3A39AE07-9BE7-48F4-B3C4-2DBA1E2F55E0}" destId="{51243CD1-B84E-429E-916B-82BDECAECFE1}" srcOrd="2" destOrd="0" presId="urn:microsoft.com/office/officeart/2011/layout/TabList"/>
-    <dgm:cxn modelId="{5326C308-1313-45C4-A872-86FCA4D73292}" type="presParOf" srcId="{D6B2318A-4DEA-4197-AA73-A3A400565DEF}" destId="{56E981E0-1351-4720-BC7F-4B4C5EFFDCEE}" srcOrd="7" destOrd="0" presId="urn:microsoft.com/office/officeart/2011/layout/TabList"/>
-    <dgm:cxn modelId="{7BDBB7D7-5A4E-4AB4-B415-C321FC0F3A1D}" type="presParOf" srcId="{D6B2318A-4DEA-4197-AA73-A3A400565DEF}" destId="{7AB67F2C-AF48-49A5-A4A2-B305B336EA85}" srcOrd="8" destOrd="0" presId="urn:microsoft.com/office/officeart/2011/layout/TabList"/>
-    <dgm:cxn modelId="{E5D73FDE-A68F-4C3E-A4F3-18713A1A56F0}" type="presParOf" srcId="{D6B2318A-4DEA-4197-AA73-A3A400565DEF}" destId="{1F2000C7-C315-4F3F-B982-4A40EE333889}" srcOrd="9" destOrd="0" presId="urn:microsoft.com/office/officeart/2011/layout/TabList"/>
-    <dgm:cxn modelId="{E4CA5F83-3342-4D6E-AB97-11F6431C0BFE}" type="presParOf" srcId="{1F2000C7-C315-4F3F-B982-4A40EE333889}" destId="{D4C3DA9B-B2C3-4B2A-9886-DA80C30211A5}" srcOrd="0" destOrd="0" presId="urn:microsoft.com/office/officeart/2011/layout/TabList"/>
-    <dgm:cxn modelId="{E2BA4389-2A83-4DDF-8F70-2895E21EF0CA}" type="presParOf" srcId="{1F2000C7-C315-4F3F-B982-4A40EE333889}" destId="{D75E8FA6-B10D-45EE-A8CE-3A8CA659F85A}" srcOrd="1" destOrd="0" presId="urn:microsoft.com/office/officeart/2011/layout/TabList"/>
-    <dgm:cxn modelId="{FB778CAF-61E0-4504-94C9-7F2D1150B23A}" type="presParOf" srcId="{1F2000C7-C315-4F3F-B982-4A40EE333889}" destId="{958B5D1B-5822-43E0-BCA1-36F641F3C371}" srcOrd="2" destOrd="0" presId="urn:microsoft.com/office/officeart/2011/layout/TabList"/>
-    <dgm:cxn modelId="{356DAA1E-4182-4BFA-ABE9-DACC59DAF669}" type="presParOf" srcId="{D6B2318A-4DEA-4197-AA73-A3A400565DEF}" destId="{0D2785ED-25DA-4F58-B8D7-482843FF44D5}" srcOrd="10" destOrd="0" presId="urn:microsoft.com/office/officeart/2011/layout/TabList"/>
-    <dgm:cxn modelId="{5D557326-9C7D-4E61-8CA9-2B9491AEC725}" type="presParOf" srcId="{D6B2318A-4DEA-4197-AA73-A3A400565DEF}" destId="{6CB5847E-A727-43DB-BAFD-FD4254F73EB5}" srcOrd="11" destOrd="0" presId="urn:microsoft.com/office/officeart/2011/layout/TabList"/>
-    <dgm:cxn modelId="{83EBF926-002F-456E-B481-F15D572B9B51}" type="presParOf" srcId="{D6B2318A-4DEA-4197-AA73-A3A400565DEF}" destId="{72722F67-49FF-4EB4-8DCE-3A772008011E}" srcOrd="12" destOrd="0" presId="urn:microsoft.com/office/officeart/2011/layout/TabList"/>
+    <dgm:cxn modelId="{AC9CFD84-DFF9-4525-9325-7DE935EDB2EA}" type="presParOf" srcId="{D6B2318A-4DEA-4197-AA73-A3A400565DEF}" destId="{0BE76B25-5F2E-46FE-BAF9-2C71A27848BA}" srcOrd="4" destOrd="0" presId="urn:microsoft.com/office/officeart/2011/layout/TabList"/>
+    <dgm:cxn modelId="{7BDBB7D7-5A4E-4AB4-B415-C321FC0F3A1D}" type="presParOf" srcId="{D6B2318A-4DEA-4197-AA73-A3A400565DEF}" destId="{7AB67F2C-AF48-49A5-A4A2-B305B336EA85}" srcOrd="5" destOrd="0" presId="urn:microsoft.com/office/officeart/2011/layout/TabList"/>
+    <dgm:cxn modelId="{83EBF926-002F-456E-B481-F15D572B9B51}" type="presParOf" srcId="{D6B2318A-4DEA-4197-AA73-A3A400565DEF}" destId="{72722F67-49FF-4EB4-8DCE-3A772008011E}" srcOrd="6" destOrd="0" presId="urn:microsoft.com/office/officeart/2011/layout/TabList"/>
     <dgm:cxn modelId="{13DE4DDC-F75D-4683-8048-8E784F81D190}" type="presParOf" srcId="{72722F67-49FF-4EB4-8DCE-3A772008011E}" destId="{91D9B644-7EA5-4262-9749-6B0E185D3352}" srcOrd="0" destOrd="0" presId="urn:microsoft.com/office/officeart/2011/layout/TabList"/>
     <dgm:cxn modelId="{394D3E23-B908-461E-8F9E-0D70F9DD0605}" type="presParOf" srcId="{72722F67-49FF-4EB4-8DCE-3A772008011E}" destId="{84AE48BC-DA1D-40BA-8F88-E274C7CD9EF6}" srcOrd="1" destOrd="0" presId="urn:microsoft.com/office/officeart/2011/layout/TabList"/>
     <dgm:cxn modelId="{36142AB1-A1EF-4AD6-AA42-5304916A21A7}" type="presParOf" srcId="{72722F67-49FF-4EB4-8DCE-3A772008011E}" destId="{FD11AE15-B881-4656-85EE-DC9F38302029}" srcOrd="2" destOrd="0" presId="urn:microsoft.com/office/officeart/2011/layout/TabList"/>
-    <dgm:cxn modelId="{D2D39672-0C8B-4CD2-BBC1-C63A365853FB}" type="presParOf" srcId="{D6B2318A-4DEA-4197-AA73-A3A400565DEF}" destId="{0EDA52D8-B2F3-49C3-91C1-650682A2A143}" srcOrd="13" destOrd="0" presId="urn:microsoft.com/office/officeart/2011/layout/TabList"/>
-    <dgm:cxn modelId="{BC7E644E-0040-4878-97C8-393A4D0BF248}" type="presParOf" srcId="{D6B2318A-4DEA-4197-AA73-A3A400565DEF}" destId="{BDA0D586-C3E3-4A9B-A131-523655513716}" srcOrd="14" destOrd="0" presId="urn:microsoft.com/office/officeart/2011/layout/TabList"/>
-    <dgm:cxn modelId="{77FE9C5F-391D-4EFC-8D3D-746C2D5B89F9}" type="presParOf" srcId="{D6B2318A-4DEA-4197-AA73-A3A400565DEF}" destId="{AEA1D444-33DA-40F2-A6E8-63C1D09EAD82}" srcOrd="15" destOrd="0" presId="urn:microsoft.com/office/officeart/2011/layout/TabList"/>
+    <dgm:cxn modelId="{79207C27-6F97-4592-879E-1C0928FE1BEA}" type="presParOf" srcId="{D6B2318A-4DEA-4197-AA73-A3A400565DEF}" destId="{217AD732-8CA0-43F1-9ECF-04D0D5FA232D}" srcOrd="7" destOrd="0" presId="urn:microsoft.com/office/officeart/2011/layout/TabList"/>
+    <dgm:cxn modelId="{BC7E644E-0040-4878-97C8-393A4D0BF248}" type="presParOf" srcId="{D6B2318A-4DEA-4197-AA73-A3A400565DEF}" destId="{BDA0D586-C3E3-4A9B-A131-523655513716}" srcOrd="8" destOrd="0" presId="urn:microsoft.com/office/officeart/2011/layout/TabList"/>
+    <dgm:cxn modelId="{77FE9C5F-391D-4EFC-8D3D-746C2D5B89F9}" type="presParOf" srcId="{D6B2318A-4DEA-4197-AA73-A3A400565DEF}" destId="{AEA1D444-33DA-40F2-A6E8-63C1D09EAD82}" srcOrd="9" destOrd="0" presId="urn:microsoft.com/office/officeart/2011/layout/TabList"/>
     <dgm:cxn modelId="{4C504915-22A1-44E4-9AE4-202F8BA0A4AE}" type="presParOf" srcId="{AEA1D444-33DA-40F2-A6E8-63C1D09EAD82}" destId="{E23D76BD-9B7B-4255-9A94-253A99336C15}" srcOrd="0" destOrd="0" presId="urn:microsoft.com/office/officeart/2011/layout/TabList"/>
     <dgm:cxn modelId="{7C730F6B-6142-49A6-93FD-ACC75897AA88}" type="presParOf" srcId="{AEA1D444-33DA-40F2-A6E8-63C1D09EAD82}" destId="{3702427B-65FD-4B5E-979C-884E0D9FDFDB}" srcOrd="1" destOrd="0" presId="urn:microsoft.com/office/officeart/2011/layout/TabList"/>
     <dgm:cxn modelId="{2538AA1D-CDC3-4029-942C-5188110ACDC1}" type="presParOf" srcId="{AEA1D444-33DA-40F2-A6E8-63C1D09EAD82}" destId="{9F83BF5C-E022-49DD-8719-D4745C944F77}" srcOrd="2" destOrd="0" presId="urn:microsoft.com/office/officeart/2011/layout/TabList"/>
-    <dgm:cxn modelId="{AAF31B24-C08F-4A33-9649-A5C328D1D710}" type="presParOf" srcId="{D6B2318A-4DEA-4197-AA73-A3A400565DEF}" destId="{B9177805-0EEA-4CA0-A4DA-A3DEDD5890CC}" srcOrd="16" destOrd="0" presId="urn:microsoft.com/office/officeart/2011/layout/TabList"/>
-    <dgm:cxn modelId="{55276202-910A-4042-A0D2-46C10CBA02A8}" type="presParOf" srcId="{D6B2318A-4DEA-4197-AA73-A3A400565DEF}" destId="{01781B5A-33C6-4990-9DA6-E3B31394F25B}" srcOrd="17" destOrd="0" presId="urn:microsoft.com/office/officeart/2011/layout/TabList"/>
-    <dgm:cxn modelId="{D01F396F-4E8E-4F42-A5AB-2C7FDBD8CFC5}" type="presParOf" srcId="{D6B2318A-4DEA-4197-AA73-A3A400565DEF}" destId="{29ED39A1-F4EC-477D-BF8E-CABB2210FA7F}" srcOrd="18" destOrd="0" presId="urn:microsoft.com/office/officeart/2011/layout/TabList"/>
+    <dgm:cxn modelId="{17CF876B-A71C-4927-B5AD-E85D15B2B7ED}" type="presParOf" srcId="{D6B2318A-4DEA-4197-AA73-A3A400565DEF}" destId="{6A390EB7-1432-4B3E-A0FB-5D71D763BDC8}" srcOrd="10" destOrd="0" presId="urn:microsoft.com/office/officeart/2011/layout/TabList"/>
+    <dgm:cxn modelId="{55276202-910A-4042-A0D2-46C10CBA02A8}" type="presParOf" srcId="{D6B2318A-4DEA-4197-AA73-A3A400565DEF}" destId="{01781B5A-33C6-4990-9DA6-E3B31394F25B}" srcOrd="11" destOrd="0" presId="urn:microsoft.com/office/officeart/2011/layout/TabList"/>
+    <dgm:cxn modelId="{D01F396F-4E8E-4F42-A5AB-2C7FDBD8CFC5}" type="presParOf" srcId="{D6B2318A-4DEA-4197-AA73-A3A400565DEF}" destId="{29ED39A1-F4EC-477D-BF8E-CABB2210FA7F}" srcOrd="12" destOrd="0" presId="urn:microsoft.com/office/officeart/2011/layout/TabList"/>
     <dgm:cxn modelId="{23794333-B011-496D-BB25-7A79D8624818}" type="presParOf" srcId="{29ED39A1-F4EC-477D-BF8E-CABB2210FA7F}" destId="{0EE58AFD-5D76-427B-A339-EEF7E88F102D}" srcOrd="0" destOrd="0" presId="urn:microsoft.com/office/officeart/2011/layout/TabList"/>
     <dgm:cxn modelId="{04C41E9A-DC0A-452C-AA26-EF69F7AD38F7}" type="presParOf" srcId="{29ED39A1-F4EC-477D-BF8E-CABB2210FA7F}" destId="{DE2677DB-D70B-4D3E-8A29-A769C3568B51}" srcOrd="1" destOrd="0" presId="urn:microsoft.com/office/officeart/2011/layout/TabList"/>
     <dgm:cxn modelId="{F25753DA-5A2B-49DD-B1D9-D59802D4434B}" type="presParOf" srcId="{29ED39A1-F4EC-477D-BF8E-CABB2210FA7F}" destId="{295CC725-B06B-4C55-B4AE-D632DFB22198}" srcOrd="2" destOrd="0" presId="urn:microsoft.com/office/officeart/2011/layout/TabList"/>
-    <dgm:cxn modelId="{1F094A08-6526-4171-AF33-02353EA2C9B3}" type="presParOf" srcId="{D6B2318A-4DEA-4197-AA73-A3A400565DEF}" destId="{6C89E044-15C9-480C-812F-B9FFE4EC7A82}" srcOrd="19" destOrd="0" presId="urn:microsoft.com/office/officeart/2011/layout/TabList"/>
-    <dgm:cxn modelId="{6F1894D6-749A-436B-8B42-758708DD8EFD}" type="presParOf" srcId="{D6B2318A-4DEA-4197-AA73-A3A400565DEF}" destId="{E56F28D1-6163-4BE6-913F-72881DE20457}" srcOrd="20" destOrd="0" presId="urn:microsoft.com/office/officeart/2011/layout/TabList"/>
-    <dgm:cxn modelId="{C049D497-6761-4E82-98DA-ECF446103CF8}" type="presParOf" srcId="{D6B2318A-4DEA-4197-AA73-A3A400565DEF}" destId="{65E8B32D-1E0E-4C0A-80CA-D39176E4C21D}" srcOrd="21" destOrd="0" presId="urn:microsoft.com/office/officeart/2011/layout/TabList"/>
+    <dgm:cxn modelId="{5FBB8D3E-AA4A-4DD2-A1F0-B5431FD12CE0}" type="presParOf" srcId="{D6B2318A-4DEA-4197-AA73-A3A400565DEF}" destId="{EAD70D50-8109-4941-A13C-2B261DD10D12}" srcOrd="13" destOrd="0" presId="urn:microsoft.com/office/officeart/2011/layout/TabList"/>
+    <dgm:cxn modelId="{6F1894D6-749A-436B-8B42-758708DD8EFD}" type="presParOf" srcId="{D6B2318A-4DEA-4197-AA73-A3A400565DEF}" destId="{E56F28D1-6163-4BE6-913F-72881DE20457}" srcOrd="14" destOrd="0" presId="urn:microsoft.com/office/officeart/2011/layout/TabList"/>
+    <dgm:cxn modelId="{C049D497-6761-4E82-98DA-ECF446103CF8}" type="presParOf" srcId="{D6B2318A-4DEA-4197-AA73-A3A400565DEF}" destId="{65E8B32D-1E0E-4C0A-80CA-D39176E4C21D}" srcOrd="15" destOrd="0" presId="urn:microsoft.com/office/officeart/2011/layout/TabList"/>
     <dgm:cxn modelId="{2074827E-260B-418D-BA04-A5371BAD9813}" type="presParOf" srcId="{65E8B32D-1E0E-4C0A-80CA-D39176E4C21D}" destId="{2B8963A4-3F80-476E-BA4E-A2D705B3B4A3}" srcOrd="0" destOrd="0" presId="urn:microsoft.com/office/officeart/2011/layout/TabList"/>
     <dgm:cxn modelId="{AEA2D491-EC56-435B-B265-432EED3C2B3F}" type="presParOf" srcId="{65E8B32D-1E0E-4C0A-80CA-D39176E4C21D}" destId="{CC2DBB29-65F7-40B6-B2EF-C74BC43B1881}" srcOrd="1" destOrd="0" presId="urn:microsoft.com/office/officeart/2011/layout/TabList"/>
     <dgm:cxn modelId="{628F3476-6DBC-47C9-B0EC-CC85A7FA90A8}" type="presParOf" srcId="{65E8B32D-1E0E-4C0A-80CA-D39176E4C21D}" destId="{E2B24FF4-E210-44D5-9D9F-6A67397F2EC5}" srcOrd="2" destOrd="0" presId="urn:microsoft.com/office/officeart/2011/layout/TabList"/>
-    <dgm:cxn modelId="{303516A9-DC9A-42FE-80AC-75B3AC9DDC0A}" type="presParOf" srcId="{D6B2318A-4DEA-4197-AA73-A3A400565DEF}" destId="{1868F4D9-1C89-4118-8485-7DE0BE6CB50F}" srcOrd="22" destOrd="0" presId="urn:microsoft.com/office/officeart/2011/layout/TabList"/>
-    <dgm:cxn modelId="{70A49ED1-1605-4779-8E16-C773878FBA8C}" type="presParOf" srcId="{D6B2318A-4DEA-4197-AA73-A3A400565DEF}" destId="{E65DE533-BE41-412F-ADC2-38B4A2B29F3D}" srcOrd="23" destOrd="0" presId="urn:microsoft.com/office/officeart/2011/layout/TabList"/>
-    <dgm:cxn modelId="{E8135352-E198-40B8-A121-058ADFA0C0EF}" type="presParOf" srcId="{D6B2318A-4DEA-4197-AA73-A3A400565DEF}" destId="{03FE3C2C-FA34-4AF0-8F66-683A149C185F}" srcOrd="24" destOrd="0" presId="urn:microsoft.com/office/officeart/2011/layout/TabList"/>
+    <dgm:cxn modelId="{9F3FF607-B076-47F5-A047-64E657962EA6}" type="presParOf" srcId="{D6B2318A-4DEA-4197-AA73-A3A400565DEF}" destId="{CDF3D050-6784-48D6-94CF-6E6691096B81}" srcOrd="16" destOrd="0" presId="urn:microsoft.com/office/officeart/2011/layout/TabList"/>
+    <dgm:cxn modelId="{70A49ED1-1605-4779-8E16-C773878FBA8C}" type="presParOf" srcId="{D6B2318A-4DEA-4197-AA73-A3A400565DEF}" destId="{E65DE533-BE41-412F-ADC2-38B4A2B29F3D}" srcOrd="17" destOrd="0" presId="urn:microsoft.com/office/officeart/2011/layout/TabList"/>
+    <dgm:cxn modelId="{E8135352-E198-40B8-A121-058ADFA0C0EF}" type="presParOf" srcId="{D6B2318A-4DEA-4197-AA73-A3A400565DEF}" destId="{03FE3C2C-FA34-4AF0-8F66-683A149C185F}" srcOrd="18" destOrd="0" presId="urn:microsoft.com/office/officeart/2011/layout/TabList"/>
     <dgm:cxn modelId="{15BFE9B5-D1B6-4FF3-9EEF-989050D6424E}" type="presParOf" srcId="{03FE3C2C-FA34-4AF0-8F66-683A149C185F}" destId="{D454878E-0E20-471D-8E9E-99F3CE89948C}" srcOrd="0" destOrd="0" presId="urn:microsoft.com/office/officeart/2011/layout/TabList"/>
     <dgm:cxn modelId="{B3D25EC1-DE07-4A71-A433-243FAB72EEEB}" type="presParOf" srcId="{03FE3C2C-FA34-4AF0-8F66-683A149C185F}" destId="{8FE37526-D54B-475C-A1B1-5E20AE6E3E44}" srcOrd="1" destOrd="0" presId="urn:microsoft.com/office/officeart/2011/layout/TabList"/>
     <dgm:cxn modelId="{E554B729-6CB0-45DB-BC56-FC229396B27D}" type="presParOf" srcId="{03FE3C2C-FA34-4AF0-8F66-683A149C185F}" destId="{22F1F5BF-6A44-4242-A03B-8E2BC8DAADE7}" srcOrd="2" destOrd="0" presId="urn:microsoft.com/office/officeart/2011/layout/TabList"/>
-    <dgm:cxn modelId="{216BDDB6-291F-4F5E-8FEA-CE70E9C9D0B7}" type="presParOf" srcId="{D6B2318A-4DEA-4197-AA73-A3A400565DEF}" destId="{12B15CF7-FE48-4F1B-84B8-AD7123298C2B}" srcOrd="25" destOrd="0" presId="urn:microsoft.com/office/officeart/2011/layout/TabList"/>
-    <dgm:cxn modelId="{C4020556-7D13-4E14-905B-169F9FFBC331}" type="presParOf" srcId="{D6B2318A-4DEA-4197-AA73-A3A400565DEF}" destId="{21FA99D0-9820-4894-B2AC-46288427B06A}" srcOrd="26" destOrd="0" presId="urn:microsoft.com/office/officeart/2011/layout/TabList"/>
-    <dgm:cxn modelId="{C08A3038-54A6-42D4-B3B5-9C53189FE5EE}" type="presParOf" srcId="{D6B2318A-4DEA-4197-AA73-A3A400565DEF}" destId="{184B349D-A18D-42BA-B2AE-D2409393C34B}" srcOrd="27" destOrd="0" presId="urn:microsoft.com/office/officeart/2011/layout/TabList"/>
+    <dgm:cxn modelId="{0E8DD653-9417-460F-A7C3-B351FD1EE80D}" type="presParOf" srcId="{D6B2318A-4DEA-4197-AA73-A3A400565DEF}" destId="{3D3AC76A-F12C-419B-8A6A-479DEDD91A5E}" srcOrd="19" destOrd="0" presId="urn:microsoft.com/office/officeart/2011/layout/TabList"/>
+    <dgm:cxn modelId="{C4020556-7D13-4E14-905B-169F9FFBC331}" type="presParOf" srcId="{D6B2318A-4DEA-4197-AA73-A3A400565DEF}" destId="{21FA99D0-9820-4894-B2AC-46288427B06A}" srcOrd="20" destOrd="0" presId="urn:microsoft.com/office/officeart/2011/layout/TabList"/>
+    <dgm:cxn modelId="{C08A3038-54A6-42D4-B3B5-9C53189FE5EE}" type="presParOf" srcId="{D6B2318A-4DEA-4197-AA73-A3A400565DEF}" destId="{184B349D-A18D-42BA-B2AE-D2409393C34B}" srcOrd="21" destOrd="0" presId="urn:microsoft.com/office/officeart/2011/layout/TabList"/>
     <dgm:cxn modelId="{317C7566-E6C2-4A64-9A7C-8DDC2E4FF7D5}" type="presParOf" srcId="{184B349D-A18D-42BA-B2AE-D2409393C34B}" destId="{605FBAFD-7EA1-4EA4-8B82-CD1C3234DEC5}" srcOrd="0" destOrd="0" presId="urn:microsoft.com/office/officeart/2011/layout/TabList"/>
     <dgm:cxn modelId="{B2151C7E-F5A0-4B92-96E9-5338F45DCABF}" type="presParOf" srcId="{184B349D-A18D-42BA-B2AE-D2409393C34B}" destId="{73050604-3250-4039-B6B4-21989449E22C}" srcOrd="1" destOrd="0" presId="urn:microsoft.com/office/officeart/2011/layout/TabList"/>
     <dgm:cxn modelId="{8A1CDF11-8EA7-4D8F-B8B3-00C9F1CA9E7C}" type="presParOf" srcId="{184B349D-A18D-42BA-B2AE-D2409393C34B}" destId="{CF7A2ACC-58E4-408D-87EF-89B2FDED944F}" srcOrd="2" destOrd="0" presId="urn:microsoft.com/office/officeart/2011/layout/TabList"/>
-    <dgm:cxn modelId="{1B60C6ED-CD09-4782-9ECE-B1D6A9FBA77B}" type="presParOf" srcId="{D6B2318A-4DEA-4197-AA73-A3A400565DEF}" destId="{A86A7049-486F-4F6D-B0E0-46DC545BD141}" srcOrd="28" destOrd="0" presId="urn:microsoft.com/office/officeart/2011/layout/TabList"/>
-    <dgm:cxn modelId="{75DD1C00-840B-4EFD-84C6-BCD84EFB0675}" type="presParOf" srcId="{D6B2318A-4DEA-4197-AA73-A3A400565DEF}" destId="{EF2A9862-3052-41C2-83CA-B5896123F60E}" srcOrd="29" destOrd="0" presId="urn:microsoft.com/office/officeart/2011/layout/TabList"/>
-    <dgm:cxn modelId="{592CF23E-0C36-4B49-9805-9F141454668E}" type="presParOf" srcId="{D6B2318A-4DEA-4197-AA73-A3A400565DEF}" destId="{FF181892-2B43-42A1-9C8D-CBDE7C21C2D7}" srcOrd="30" destOrd="0" presId="urn:microsoft.com/office/officeart/2011/layout/TabList"/>
-    <dgm:cxn modelId="{8F7F784D-0564-4FFD-821E-DBE8D2531886}" type="presParOf" srcId="{FF181892-2B43-42A1-9C8D-CBDE7C21C2D7}" destId="{3335CECF-89AF-4269-B52F-2B44089DF289}" srcOrd="0" destOrd="0" presId="urn:microsoft.com/office/officeart/2011/layout/TabList"/>
-    <dgm:cxn modelId="{55FAA5F5-2B60-4939-9705-59A98F40873E}" type="presParOf" srcId="{FF181892-2B43-42A1-9C8D-CBDE7C21C2D7}" destId="{CCE21C9B-9066-4697-93E2-C88B2F4CB569}" srcOrd="1" destOrd="0" presId="urn:microsoft.com/office/officeart/2011/layout/TabList"/>
-    <dgm:cxn modelId="{2496ABA9-8FE9-4691-AFE3-02B621EEB7EE}" type="presParOf" srcId="{FF181892-2B43-42A1-9C8D-CBDE7C21C2D7}" destId="{E55BF26C-8961-413C-BF13-CCFB7517F782}" srcOrd="2" destOrd="0" presId="urn:microsoft.com/office/officeart/2011/layout/TabList"/>
   </dgm:cxnLst>
   <dgm:bg/>
   <dgm:whole/>
@@ -7632,47 +7705,6 @@
       <dsp:cNvGrpSpPr/>
     </dsp:nvGrpSpPr>
     <dsp:grpSpPr/>
-    <dsp:sp modelId="{E55BF26C-8961-413C-BF13-CCFB7517F782}">
-      <dsp:nvSpPr>
-        <dsp:cNvPr id="0" name=""/>
-        <dsp:cNvSpPr/>
-      </dsp:nvSpPr>
-      <dsp:spPr>
-        <a:xfrm>
-          <a:off x="0" y="5123812"/>
-          <a:ext cx="9658985" cy="0"/>
-        </a:xfrm>
-        <a:prstGeom prst="line">
-          <a:avLst/>
-        </a:prstGeom>
-        <a:noFill/>
-        <a:ln w="25400" cap="flat" cmpd="sng" algn="ctr">
-          <a:solidFill>
-            <a:schemeClr val="accent1">
-              <a:shade val="60000"/>
-              <a:hueOff val="0"/>
-              <a:satOff val="0"/>
-              <a:lumOff val="0"/>
-              <a:alphaOff val="0"/>
-            </a:schemeClr>
-          </a:solidFill>
-          <a:prstDash val="solid"/>
-        </a:ln>
-        <a:effectLst/>
-      </dsp:spPr>
-      <dsp:style>
-        <a:lnRef idx="2">
-          <a:scrgbClr r="0" g="0" b="0"/>
-        </a:lnRef>
-        <a:fillRef idx="0">
-          <a:scrgbClr r="0" g="0" b="0"/>
-        </a:fillRef>
-        <a:effectRef idx="0">
-          <a:scrgbClr r="0" g="0" b="0"/>
-        </a:effectRef>
-        <a:fontRef idx="minor"/>
-      </dsp:style>
-    </dsp:sp>
     <dsp:sp modelId="{CF7A2ACC-58E4-408D-87EF-89B2FDED944F}">
       <dsp:nvSpPr>
         <dsp:cNvPr id="0" name=""/>
@@ -7680,7 +7712,7 @@
       </dsp:nvSpPr>
       <dsp:spPr>
         <a:xfrm>
-          <a:off x="0" y="4627757"/>
+          <a:off x="0" y="5120712"/>
           <a:ext cx="9658985" cy="0"/>
         </a:xfrm>
         <a:prstGeom prst="line">
@@ -7721,7 +7753,7 @@
       </dsp:nvSpPr>
       <dsp:spPr>
         <a:xfrm>
-          <a:off x="0" y="4131702"/>
+          <a:off x="0" y="4422419"/>
           <a:ext cx="9658985" cy="0"/>
         </a:xfrm>
         <a:prstGeom prst="line">
@@ -7762,7 +7794,7 @@
       </dsp:nvSpPr>
       <dsp:spPr>
         <a:xfrm>
-          <a:off x="0" y="3635647"/>
+          <a:off x="0" y="3724127"/>
           <a:ext cx="9658985" cy="0"/>
         </a:xfrm>
         <a:prstGeom prst="line">
@@ -7803,7 +7835,7 @@
       </dsp:nvSpPr>
       <dsp:spPr>
         <a:xfrm>
-          <a:off x="0" y="3139592"/>
+          <a:off x="0" y="3025834"/>
           <a:ext cx="9658985" cy="0"/>
         </a:xfrm>
         <a:prstGeom prst="line">
@@ -7844,7 +7876,7 @@
       </dsp:nvSpPr>
       <dsp:spPr>
         <a:xfrm>
-          <a:off x="0" y="2643537"/>
+          <a:off x="0" y="2327541"/>
           <a:ext cx="9658985" cy="0"/>
         </a:xfrm>
         <a:prstGeom prst="line">
@@ -7885,48 +7917,7 @@
       </dsp:nvSpPr>
       <dsp:spPr>
         <a:xfrm>
-          <a:off x="0" y="2147482"/>
-          <a:ext cx="9658985" cy="0"/>
-        </a:xfrm>
-        <a:prstGeom prst="line">
-          <a:avLst/>
-        </a:prstGeom>
-        <a:noFill/>
-        <a:ln w="25400" cap="flat" cmpd="sng" algn="ctr">
-          <a:solidFill>
-            <a:schemeClr val="accent1">
-              <a:shade val="60000"/>
-              <a:hueOff val="0"/>
-              <a:satOff val="0"/>
-              <a:lumOff val="0"/>
-              <a:alphaOff val="0"/>
-            </a:schemeClr>
-          </a:solidFill>
-          <a:prstDash val="solid"/>
-        </a:ln>
-        <a:effectLst/>
-      </dsp:spPr>
-      <dsp:style>
-        <a:lnRef idx="2">
-          <a:scrgbClr r="0" g="0" b="0"/>
-        </a:lnRef>
-        <a:fillRef idx="0">
-          <a:scrgbClr r="0" g="0" b="0"/>
-        </a:fillRef>
-        <a:effectRef idx="0">
-          <a:scrgbClr r="0" g="0" b="0"/>
-        </a:effectRef>
-        <a:fontRef idx="minor"/>
-      </dsp:style>
-    </dsp:sp>
-    <dsp:sp modelId="{958B5D1B-5822-43E0-BCA1-36F641F3C371}">
-      <dsp:nvSpPr>
-        <dsp:cNvPr id="0" name=""/>
-        <dsp:cNvSpPr/>
-      </dsp:nvSpPr>
-      <dsp:spPr>
-        <a:xfrm>
-          <a:off x="0" y="1651427"/>
+          <a:off x="0" y="1629248"/>
           <a:ext cx="9658985" cy="0"/>
         </a:xfrm>
         <a:prstGeom prst="line">
@@ -7967,48 +7958,7 @@
       </dsp:nvSpPr>
       <dsp:spPr>
         <a:xfrm>
-          <a:off x="0" y="1155372"/>
-          <a:ext cx="9658985" cy="0"/>
-        </a:xfrm>
-        <a:prstGeom prst="line">
-          <a:avLst/>
-        </a:prstGeom>
-        <a:noFill/>
-        <a:ln w="25400" cap="flat" cmpd="sng" algn="ctr">
-          <a:solidFill>
-            <a:schemeClr val="accent1">
-              <a:shade val="60000"/>
-              <a:hueOff val="0"/>
-              <a:satOff val="0"/>
-              <a:lumOff val="0"/>
-              <a:alphaOff val="0"/>
-            </a:schemeClr>
-          </a:solidFill>
-          <a:prstDash val="solid"/>
-        </a:ln>
-        <a:effectLst/>
-      </dsp:spPr>
-      <dsp:style>
-        <a:lnRef idx="2">
-          <a:scrgbClr r="0" g="0" b="0"/>
-        </a:lnRef>
-        <a:fillRef idx="0">
-          <a:scrgbClr r="0" g="0" b="0"/>
-        </a:fillRef>
-        <a:effectRef idx="0">
-          <a:scrgbClr r="0" g="0" b="0"/>
-        </a:effectRef>
-        <a:fontRef idx="minor"/>
-      </dsp:style>
-    </dsp:sp>
-    <dsp:sp modelId="{27C259DC-9B3F-4497-BA03-61F65DF29F38}">
-      <dsp:nvSpPr>
-        <dsp:cNvPr id="0" name=""/>
-        <dsp:cNvSpPr/>
-      </dsp:nvSpPr>
-      <dsp:spPr>
-        <a:xfrm>
-          <a:off x="0" y="659317"/>
+          <a:off x="0" y="930956"/>
           <a:ext cx="9658985" cy="0"/>
         </a:xfrm>
         <a:prstGeom prst="line">
@@ -8049,7 +7999,7 @@
       </dsp:nvSpPr>
       <dsp:spPr>
         <a:xfrm>
-          <a:off x="0" y="163262"/>
+          <a:off x="0" y="232663"/>
           <a:ext cx="9658985" cy="0"/>
         </a:xfrm>
         <a:prstGeom prst="line">
@@ -8090,8 +8040,8 @@
       </dsp:nvSpPr>
       <dsp:spPr>
         <a:xfrm>
-          <a:off x="2511336" y="637"/>
-          <a:ext cx="7147648" cy="162624"/>
+          <a:off x="2511336" y="3737"/>
+          <a:ext cx="7147648" cy="228925"/>
         </a:xfrm>
         <a:prstGeom prst="rect">
           <a:avLst/>
@@ -8115,12 +8065,12 @@
         <a:fontRef idx="minor"/>
       </dsp:style>
       <dsp:txBody>
-        <a:bodyPr spcFirstLastPara="0" vert="horz" wrap="square" lIns="17145" tIns="17145" rIns="17145" bIns="17145" numCol="1" spcCol="1270" anchor="b" anchorCtr="0">
+        <a:bodyPr spcFirstLastPara="0" vert="horz" wrap="square" lIns="22860" tIns="22860" rIns="22860" bIns="22860" numCol="1" spcCol="1270" anchor="b" anchorCtr="0">
           <a:noAutofit/>
         </a:bodyPr>
         <a:lstStyle/>
         <a:p>
-          <a:pPr marL="0" lvl="0" indent="0" algn="l" defTabSz="400050">
+          <a:pPr marL="0" lvl="0" indent="0" algn="l" defTabSz="533400">
             <a:lnSpc>
               <a:spcPct val="90000"/>
             </a:lnSpc>
@@ -8133,14 +8083,14 @@
             <a:buNone/>
           </a:pPr>
           <a:r>
-            <a:rPr lang="nl-NL" sz="900" kern="1200"/>
+            <a:rPr lang="nl-NL" sz="1200" kern="1200"/>
             <a:t> </a:t>
           </a:r>
         </a:p>
       </dsp:txBody>
       <dsp:txXfrm>
-        <a:off x="2511336" y="637"/>
-        <a:ext cx="7147648" cy="162624"/>
+        <a:off x="2511336" y="3737"/>
+        <a:ext cx="7147648" cy="228925"/>
       </dsp:txXfrm>
     </dsp:sp>
     <dsp:sp modelId="{E55967B5-2837-4CD0-96FC-63FBF986E964}">
@@ -8150,8 +8100,8 @@
       </dsp:nvSpPr>
       <dsp:spPr>
         <a:xfrm>
-          <a:off x="0" y="637"/>
-          <a:ext cx="2511336" cy="162624"/>
+          <a:off x="0" y="3737"/>
+          <a:ext cx="2511336" cy="228925"/>
         </a:xfrm>
         <a:prstGeom prst="round2SameRect">
           <a:avLst>
@@ -8195,12 +8145,12 @@
         </a:fontRef>
       </dsp:style>
       <dsp:txBody>
-        <a:bodyPr spcFirstLastPara="0" vert="horz" wrap="square" lIns="17145" tIns="17145" rIns="17145" bIns="17145" numCol="1" spcCol="1270" anchor="ctr" anchorCtr="0">
+        <a:bodyPr spcFirstLastPara="0" vert="horz" wrap="square" lIns="22860" tIns="22860" rIns="22860" bIns="22860" numCol="1" spcCol="1270" anchor="ctr" anchorCtr="0">
           <a:noAutofit/>
         </a:bodyPr>
         <a:lstStyle/>
         <a:p>
-          <a:pPr marL="0" lvl="0" indent="0" algn="ctr" defTabSz="400050">
+          <a:pPr marL="0" lvl="0" indent="0" algn="ctr" defTabSz="533400">
             <a:lnSpc>
               <a:spcPct val="90000"/>
             </a:lnSpc>
@@ -8213,25 +8163,25 @@
             <a:buNone/>
           </a:pPr>
           <a:r>
-            <a:rPr lang="nl-NL" sz="900" kern="1200"/>
-            <a:t>Inleiding</a:t>
+            <a:rPr lang="nl-NL" sz="1200" kern="1200"/>
+            <a:t>Inleiding en theoretisch kader</a:t>
           </a:r>
         </a:p>
       </dsp:txBody>
       <dsp:txXfrm>
-        <a:off x="7940" y="8577"/>
-        <a:ext cx="2495456" cy="154684"/>
+        <a:off x="11177" y="14914"/>
+        <a:ext cx="2488982" cy="217748"/>
       </dsp:txXfrm>
     </dsp:sp>
-    <dsp:sp modelId="{0A9CAE11-38A0-4551-A667-F114C644F6EA}">
+    <dsp:sp modelId="{4A8B0C5B-C36D-4A9A-BDBF-2138A3AD6896}">
       <dsp:nvSpPr>
         <dsp:cNvPr id="0" name=""/>
         <dsp:cNvSpPr/>
       </dsp:nvSpPr>
       <dsp:spPr>
         <a:xfrm>
-          <a:off x="0" y="163262"/>
-          <a:ext cx="9658985" cy="325298"/>
+          <a:off x="0" y="232663"/>
+          <a:ext cx="9658985" cy="457920"/>
         </a:xfrm>
         <a:prstGeom prst="rect">
           <a:avLst/>
@@ -8255,12 +8205,12 @@
         <a:fontRef idx="minor"/>
       </dsp:style>
       <dsp:txBody>
-        <a:bodyPr spcFirstLastPara="0" vert="horz" wrap="square" lIns="17145" tIns="17145" rIns="17145" bIns="17145" numCol="1" spcCol="1270" anchor="t" anchorCtr="0">
+        <a:bodyPr spcFirstLastPara="0" vert="horz" wrap="square" lIns="22860" tIns="22860" rIns="22860" bIns="22860" numCol="1" spcCol="1270" anchor="t" anchorCtr="0">
           <a:noAutofit/>
         </a:bodyPr>
         <a:lstStyle/>
         <a:p>
-          <a:pPr marL="57150" lvl="1" indent="-57150" algn="l" defTabSz="311150">
+          <a:pPr marL="57150" lvl="1" indent="-57150" algn="l" defTabSz="400050">
             <a:lnSpc>
               <a:spcPct val="90000"/>
             </a:lnSpc>
@@ -8272,26 +8222,23 @@
             </a:spcAft>
             <a:buChar char="•"/>
           </a:pPr>
-          <a:r>
-            <a:rPr lang="nl-NL" sz="700" kern="1200"/>
-            <a:t>Over wat ik heb gedaan om de raket te maken</a:t>
-          </a:r>
+          <a:endParaRPr lang="nl-NL" sz="900" kern="1200"/>
         </a:p>
       </dsp:txBody>
       <dsp:txXfrm>
-        <a:off x="0" y="163262"/>
-        <a:ext cx="9658985" cy="325298"/>
+        <a:off x="0" y="232663"/>
+        <a:ext cx="9658985" cy="457920"/>
       </dsp:txXfrm>
     </dsp:sp>
-    <dsp:sp modelId="{DE36EA71-4325-4051-A2F4-6F627D3B39EC}">
+    <dsp:sp modelId="{118E5681-A01F-48DA-B382-3C37E518C7D0}">
       <dsp:nvSpPr>
         <dsp:cNvPr id="0" name=""/>
         <dsp:cNvSpPr/>
       </dsp:nvSpPr>
       <dsp:spPr>
         <a:xfrm>
-          <a:off x="2511336" y="496692"/>
-          <a:ext cx="7147648" cy="162624"/>
+          <a:off x="2511336" y="702030"/>
+          <a:ext cx="7147648" cy="228925"/>
         </a:xfrm>
         <a:prstGeom prst="rect">
           <a:avLst/>
@@ -8315,12 +8262,12 @@
         <a:fontRef idx="minor"/>
       </dsp:style>
       <dsp:txBody>
-        <a:bodyPr spcFirstLastPara="0" vert="horz" wrap="square" lIns="17145" tIns="17145" rIns="17145" bIns="17145" numCol="1" spcCol="1270" anchor="b" anchorCtr="0">
+        <a:bodyPr spcFirstLastPara="0" vert="horz" wrap="square" lIns="22860" tIns="22860" rIns="22860" bIns="22860" numCol="1" spcCol="1270" anchor="b" anchorCtr="0">
           <a:noAutofit/>
         </a:bodyPr>
         <a:lstStyle/>
         <a:p>
-          <a:pPr marL="0" lvl="0" indent="0" algn="l" defTabSz="400050">
+          <a:pPr marL="0" lvl="0" indent="0" algn="l" defTabSz="533400">
             <a:lnSpc>
               <a:spcPct val="90000"/>
             </a:lnSpc>
@@ -8333,25 +8280,25 @@
             <a:buNone/>
           </a:pPr>
           <a:r>
-            <a:rPr lang="nl-NL" sz="900" kern="1200"/>
+            <a:rPr lang="nl-NL" sz="1200" kern="1200"/>
             <a:t> </a:t>
           </a:r>
         </a:p>
       </dsp:txBody>
       <dsp:txXfrm>
-        <a:off x="2511336" y="496692"/>
-        <a:ext cx="7147648" cy="162624"/>
+        <a:off x="2511336" y="702030"/>
+        <a:ext cx="7147648" cy="228925"/>
       </dsp:txXfrm>
     </dsp:sp>
-    <dsp:sp modelId="{6C0988BB-D61C-4204-86DC-481FCB2EFE91}">
+    <dsp:sp modelId="{465D6C46-099A-4807-9C35-16B46C52335D}">
       <dsp:nvSpPr>
         <dsp:cNvPr id="0" name=""/>
         <dsp:cNvSpPr/>
       </dsp:nvSpPr>
       <dsp:spPr>
         <a:xfrm>
-          <a:off x="0" y="496692"/>
-          <a:ext cx="2511336" cy="162624"/>
+          <a:off x="0" y="702030"/>
+          <a:ext cx="2511336" cy="228925"/>
         </a:xfrm>
         <a:prstGeom prst="round2SameRect">
           <a:avLst>
@@ -8395,12 +8342,12 @@
         </a:fontRef>
       </dsp:style>
       <dsp:txBody>
-        <a:bodyPr spcFirstLastPara="0" vert="horz" wrap="square" lIns="17145" tIns="17145" rIns="17145" bIns="17145" numCol="1" spcCol="1270" anchor="ctr" anchorCtr="0">
+        <a:bodyPr spcFirstLastPara="0" vert="horz" wrap="square" lIns="22860" tIns="22860" rIns="22860" bIns="22860" numCol="1" spcCol="1270" anchor="ctr" anchorCtr="0">
           <a:noAutofit/>
         </a:bodyPr>
         <a:lstStyle/>
         <a:p>
-          <a:pPr marL="0" lvl="0" indent="0" algn="ctr" defTabSz="400050">
+          <a:pPr marL="0" lvl="0" indent="0" algn="ctr" defTabSz="533400">
             <a:lnSpc>
               <a:spcPct val="90000"/>
             </a:lnSpc>
@@ -8413,25 +8360,25 @@
             <a:buNone/>
           </a:pPr>
           <a:r>
-            <a:rPr lang="nl-NL" sz="900" kern="1200"/>
-            <a:t>Theoretisch kader</a:t>
+            <a:rPr lang="nl-NL" sz="1200" kern="1200"/>
+            <a:t>Onderzoeksvraag en hypothese</a:t>
           </a:r>
         </a:p>
       </dsp:txBody>
       <dsp:txXfrm>
-        <a:off x="7940" y="504632"/>
-        <a:ext cx="2495456" cy="154684"/>
+        <a:off x="11177" y="713207"/>
+        <a:ext cx="2488982" cy="217748"/>
       </dsp:txXfrm>
     </dsp:sp>
-    <dsp:sp modelId="{C6EA8907-C88B-4206-B56B-698549A17776}">
+    <dsp:sp modelId="{0BE76B25-5F2E-46FE-BAF9-2C71A27848BA}">
       <dsp:nvSpPr>
         <dsp:cNvPr id="0" name=""/>
         <dsp:cNvSpPr/>
       </dsp:nvSpPr>
       <dsp:spPr>
         <a:xfrm>
-          <a:off x="0" y="659317"/>
-          <a:ext cx="9658985" cy="325298"/>
+          <a:off x="0" y="930956"/>
+          <a:ext cx="9658985" cy="457920"/>
         </a:xfrm>
         <a:prstGeom prst="rect">
           <a:avLst/>
@@ -8455,12 +8402,12 @@
         <a:fontRef idx="minor"/>
       </dsp:style>
       <dsp:txBody>
-        <a:bodyPr spcFirstLastPara="0" vert="horz" wrap="square" lIns="17145" tIns="17145" rIns="17145" bIns="17145" numCol="1" spcCol="1270" anchor="t" anchorCtr="0">
+        <a:bodyPr spcFirstLastPara="0" vert="horz" wrap="square" lIns="22860" tIns="22860" rIns="22860" bIns="22860" numCol="1" spcCol="1270" anchor="t" anchorCtr="0">
           <a:noAutofit/>
         </a:bodyPr>
         <a:lstStyle/>
         <a:p>
-          <a:pPr marL="57150" lvl="1" indent="-57150" algn="l" defTabSz="311150">
+          <a:pPr marL="57150" lvl="1" indent="-57150" algn="l" defTabSz="400050">
             <a:lnSpc>
               <a:spcPct val="90000"/>
             </a:lnSpc>
@@ -8472,26 +8419,23 @@
             </a:spcAft>
             <a:buChar char="•"/>
           </a:pPr>
-          <a:r>
-            <a:rPr lang="nl-NL" sz="700" kern="1200"/>
-            <a:t>Over hoe de raket werkt</a:t>
-          </a:r>
+          <a:endParaRPr lang="nl-NL" sz="900" kern="1200"/>
         </a:p>
       </dsp:txBody>
       <dsp:txXfrm>
-        <a:off x="0" y="659317"/>
-        <a:ext cx="9658985" cy="325298"/>
+        <a:off x="0" y="930956"/>
+        <a:ext cx="9658985" cy="457920"/>
       </dsp:txXfrm>
     </dsp:sp>
-    <dsp:sp modelId="{118E5681-A01F-48DA-B382-3C37E518C7D0}">
+    <dsp:sp modelId="{91D9B644-7EA5-4262-9749-6B0E185D3352}">
       <dsp:nvSpPr>
         <dsp:cNvPr id="0" name=""/>
         <dsp:cNvSpPr/>
       </dsp:nvSpPr>
       <dsp:spPr>
         <a:xfrm>
-          <a:off x="2511336" y="992747"/>
-          <a:ext cx="7147648" cy="162624"/>
+          <a:off x="2511336" y="1400322"/>
+          <a:ext cx="7147648" cy="228925"/>
         </a:xfrm>
         <a:prstGeom prst="rect">
           <a:avLst/>
@@ -8515,12 +8459,12 @@
         <a:fontRef idx="minor"/>
       </dsp:style>
       <dsp:txBody>
-        <a:bodyPr spcFirstLastPara="0" vert="horz" wrap="square" lIns="17145" tIns="17145" rIns="17145" bIns="17145" numCol="1" spcCol="1270" anchor="b" anchorCtr="0">
+        <a:bodyPr spcFirstLastPara="0" vert="horz" wrap="square" lIns="22860" tIns="22860" rIns="22860" bIns="22860" numCol="1" spcCol="1270" anchor="b" anchorCtr="0">
           <a:noAutofit/>
         </a:bodyPr>
         <a:lstStyle/>
         <a:p>
-          <a:pPr marL="0" lvl="0" indent="0" algn="l" defTabSz="400050">
+          <a:pPr marL="0" lvl="0" indent="0" algn="l" defTabSz="533400">
             <a:lnSpc>
               <a:spcPct val="90000"/>
             </a:lnSpc>
@@ -8532,26 +8476,23 @@
             </a:spcAft>
             <a:buNone/>
           </a:pPr>
-          <a:r>
-            <a:rPr lang="nl-NL" sz="900" kern="1200"/>
-            <a:t> </a:t>
-          </a:r>
+          <a:endParaRPr lang="nl-NL" sz="1200" kern="1200"/>
         </a:p>
       </dsp:txBody>
       <dsp:txXfrm>
-        <a:off x="2511336" y="992747"/>
-        <a:ext cx="7147648" cy="162624"/>
+        <a:off x="2511336" y="1400322"/>
+        <a:ext cx="7147648" cy="228925"/>
       </dsp:txXfrm>
     </dsp:sp>
-    <dsp:sp modelId="{465D6C46-099A-4807-9C35-16B46C52335D}">
+    <dsp:sp modelId="{84AE48BC-DA1D-40BA-8F88-E274C7CD9EF6}">
       <dsp:nvSpPr>
         <dsp:cNvPr id="0" name=""/>
         <dsp:cNvSpPr/>
       </dsp:nvSpPr>
       <dsp:spPr>
         <a:xfrm>
-          <a:off x="0" y="992747"/>
-          <a:ext cx="2511336" cy="162624"/>
+          <a:off x="0" y="1400322"/>
+          <a:ext cx="2511336" cy="228925"/>
         </a:xfrm>
         <a:prstGeom prst="round2SameRect">
           <a:avLst>
@@ -8595,12 +8536,12 @@
         </a:fontRef>
       </dsp:style>
       <dsp:txBody>
-        <a:bodyPr spcFirstLastPara="0" vert="horz" wrap="square" lIns="17145" tIns="17145" rIns="17145" bIns="17145" numCol="1" spcCol="1270" anchor="ctr" anchorCtr="0">
+        <a:bodyPr spcFirstLastPara="0" vert="horz" wrap="square" lIns="22860" tIns="22860" rIns="22860" bIns="22860" numCol="1" spcCol="1270" anchor="ctr" anchorCtr="0">
           <a:noAutofit/>
         </a:bodyPr>
         <a:lstStyle/>
         <a:p>
-          <a:pPr marL="0" lvl="0" indent="0" algn="ctr" defTabSz="400050">
+          <a:pPr marL="0" lvl="0" indent="0" algn="ctr" defTabSz="533400">
             <a:lnSpc>
               <a:spcPct val="90000"/>
             </a:lnSpc>
@@ -8613,25 +8554,25 @@
             <a:buNone/>
           </a:pPr>
           <a:r>
-            <a:rPr lang="nl-NL" sz="900" kern="1200"/>
-            <a:t>Onderzoeksvraag</a:t>
+            <a:rPr lang="nl-NL" sz="1200" kern="1200"/>
+            <a:t>Materiaal</a:t>
           </a:r>
         </a:p>
       </dsp:txBody>
       <dsp:txXfrm>
-        <a:off x="7940" y="1000687"/>
-        <a:ext cx="2495456" cy="154684"/>
+        <a:off x="11177" y="1411499"/>
+        <a:ext cx="2488982" cy="217748"/>
       </dsp:txXfrm>
     </dsp:sp>
-    <dsp:sp modelId="{56E981E0-1351-4720-BC7F-4B4C5EFFDCEE}">
+    <dsp:sp modelId="{217AD732-8CA0-43F1-9ECF-04D0D5FA232D}">
       <dsp:nvSpPr>
         <dsp:cNvPr id="0" name=""/>
         <dsp:cNvSpPr/>
       </dsp:nvSpPr>
       <dsp:spPr>
         <a:xfrm>
-          <a:off x="0" y="1155372"/>
-          <a:ext cx="9658985" cy="325298"/>
+          <a:off x="0" y="1629248"/>
+          <a:ext cx="9658985" cy="457920"/>
         </a:xfrm>
         <a:prstGeom prst="rect">
           <a:avLst/>
@@ -8655,12 +8596,12 @@
         <a:fontRef idx="minor"/>
       </dsp:style>
       <dsp:txBody>
-        <a:bodyPr spcFirstLastPara="0" vert="horz" wrap="square" lIns="17145" tIns="17145" rIns="17145" bIns="17145" numCol="1" spcCol="1270" anchor="t" anchorCtr="0">
+        <a:bodyPr spcFirstLastPara="0" vert="horz" wrap="square" lIns="22860" tIns="22860" rIns="22860" bIns="22860" numCol="1" spcCol="1270" anchor="t" anchorCtr="0">
           <a:noAutofit/>
         </a:bodyPr>
         <a:lstStyle/>
         <a:p>
-          <a:pPr marL="57150" lvl="1" indent="-57150" algn="l" defTabSz="311150">
+          <a:pPr marL="57150" lvl="1" indent="-57150" algn="l" defTabSz="400050">
             <a:lnSpc>
               <a:spcPct val="90000"/>
             </a:lnSpc>
@@ -8672,26 +8613,23 @@
             </a:spcAft>
             <a:buChar char="•"/>
           </a:pPr>
-          <a:r>
-            <a:rPr lang="nl-NL" sz="700" kern="1200"/>
-            <a:t>Over mijn onderzoeksvraag</a:t>
-          </a:r>
+          <a:endParaRPr lang="nl-NL" sz="900" kern="1200"/>
         </a:p>
       </dsp:txBody>
       <dsp:txXfrm>
-        <a:off x="0" y="1155372"/>
-        <a:ext cx="9658985" cy="325298"/>
+        <a:off x="0" y="1629248"/>
+        <a:ext cx="9658985" cy="457920"/>
       </dsp:txXfrm>
     </dsp:sp>
-    <dsp:sp modelId="{D4C3DA9B-B2C3-4B2A-9886-DA80C30211A5}">
+    <dsp:sp modelId="{E23D76BD-9B7B-4255-9A94-253A99336C15}">
       <dsp:nvSpPr>
         <dsp:cNvPr id="0" name=""/>
         <dsp:cNvSpPr/>
       </dsp:nvSpPr>
       <dsp:spPr>
         <a:xfrm>
-          <a:off x="2511336" y="1488802"/>
-          <a:ext cx="7147648" cy="162624"/>
+          <a:off x="2511336" y="2098615"/>
+          <a:ext cx="7147648" cy="228925"/>
         </a:xfrm>
         <a:prstGeom prst="rect">
           <a:avLst/>
@@ -8715,12 +8653,12 @@
         <a:fontRef idx="minor"/>
       </dsp:style>
       <dsp:txBody>
-        <a:bodyPr spcFirstLastPara="0" vert="horz" wrap="square" lIns="17145" tIns="17145" rIns="17145" bIns="17145" numCol="1" spcCol="1270" anchor="b" anchorCtr="0">
+        <a:bodyPr spcFirstLastPara="0" vert="horz" wrap="square" lIns="22860" tIns="22860" rIns="22860" bIns="22860" numCol="1" spcCol="1270" anchor="b" anchorCtr="0">
           <a:noAutofit/>
         </a:bodyPr>
         <a:lstStyle/>
         <a:p>
-          <a:pPr marL="0" lvl="0" indent="0" algn="l" defTabSz="400050">
+          <a:pPr marL="0" lvl="0" indent="0" algn="l" defTabSz="533400">
             <a:lnSpc>
               <a:spcPct val="90000"/>
             </a:lnSpc>
@@ -8732,26 +8670,23 @@
             </a:spcAft>
             <a:buNone/>
           </a:pPr>
-          <a:r>
-            <a:rPr lang="nl-NL" sz="900" kern="1200"/>
-            <a:t> </a:t>
-          </a:r>
+          <a:endParaRPr lang="nl-NL" sz="1200" kern="1200"/>
         </a:p>
       </dsp:txBody>
       <dsp:txXfrm>
-        <a:off x="2511336" y="1488802"/>
-        <a:ext cx="7147648" cy="162624"/>
+        <a:off x="2511336" y="2098615"/>
+        <a:ext cx="7147648" cy="228925"/>
       </dsp:txXfrm>
     </dsp:sp>
-    <dsp:sp modelId="{D75E8FA6-B10D-45EE-A8CE-3A8CA659F85A}">
+    <dsp:sp modelId="{3702427B-65FD-4B5E-979C-884E0D9FDFDB}">
       <dsp:nvSpPr>
         <dsp:cNvPr id="0" name=""/>
         <dsp:cNvSpPr/>
       </dsp:nvSpPr>
       <dsp:spPr>
         <a:xfrm>
-          <a:off x="0" y="1488802"/>
-          <a:ext cx="2511336" cy="162624"/>
+          <a:off x="0" y="2098615"/>
+          <a:ext cx="2511336" cy="228925"/>
         </a:xfrm>
         <a:prstGeom prst="round2SameRect">
           <a:avLst>
@@ -8795,12 +8730,12 @@
         </a:fontRef>
       </dsp:style>
       <dsp:txBody>
-        <a:bodyPr spcFirstLastPara="0" vert="horz" wrap="square" lIns="17145" tIns="17145" rIns="17145" bIns="17145" numCol="1" spcCol="1270" anchor="ctr" anchorCtr="0">
+        <a:bodyPr spcFirstLastPara="0" vert="horz" wrap="square" lIns="22860" tIns="22860" rIns="22860" bIns="22860" numCol="1" spcCol="1270" anchor="ctr" anchorCtr="0">
           <a:noAutofit/>
         </a:bodyPr>
         <a:lstStyle/>
         <a:p>
-          <a:pPr marL="0" lvl="0" indent="0" algn="ctr" defTabSz="400050">
+          <a:pPr marL="0" lvl="0" indent="0" algn="ctr" defTabSz="533400">
             <a:lnSpc>
               <a:spcPct val="90000"/>
             </a:lnSpc>
@@ -8813,25 +8748,25 @@
             <a:buNone/>
           </a:pPr>
           <a:r>
-            <a:rPr lang="nl-NL" sz="900" kern="1200"/>
-            <a:t>Hypothese</a:t>
+            <a:rPr lang="nl-NL" sz="1200" kern="1200"/>
+            <a:t>Methode</a:t>
           </a:r>
         </a:p>
       </dsp:txBody>
       <dsp:txXfrm>
-        <a:off x="7940" y="1496742"/>
-        <a:ext cx="2495456" cy="154684"/>
+        <a:off x="11177" y="2109792"/>
+        <a:ext cx="2488982" cy="217748"/>
       </dsp:txXfrm>
     </dsp:sp>
-    <dsp:sp modelId="{0D2785ED-25DA-4F58-B8D7-482843FF44D5}">
+    <dsp:sp modelId="{6A390EB7-1432-4B3E-A0FB-5D71D763BDC8}">
       <dsp:nvSpPr>
         <dsp:cNvPr id="0" name=""/>
         <dsp:cNvSpPr/>
       </dsp:nvSpPr>
       <dsp:spPr>
         <a:xfrm>
-          <a:off x="0" y="1651427"/>
-          <a:ext cx="9658985" cy="325298"/>
+          <a:off x="0" y="2327541"/>
+          <a:ext cx="9658985" cy="457920"/>
         </a:xfrm>
         <a:prstGeom prst="rect">
           <a:avLst/>
@@ -8855,12 +8790,12 @@
         <a:fontRef idx="minor"/>
       </dsp:style>
       <dsp:txBody>
-        <a:bodyPr spcFirstLastPara="0" vert="horz" wrap="square" lIns="17145" tIns="17145" rIns="17145" bIns="17145" numCol="1" spcCol="1270" anchor="t" anchorCtr="0">
+        <a:bodyPr spcFirstLastPara="0" vert="horz" wrap="square" lIns="22860" tIns="22860" rIns="22860" bIns="22860" numCol="1" spcCol="1270" anchor="t" anchorCtr="0">
           <a:noAutofit/>
         </a:bodyPr>
         <a:lstStyle/>
         <a:p>
-          <a:pPr marL="57150" lvl="1" indent="-57150" algn="l" defTabSz="311150">
+          <a:pPr marL="57150" lvl="1" indent="-57150" algn="l" defTabSz="400050">
             <a:lnSpc>
               <a:spcPct val="90000"/>
             </a:lnSpc>
@@ -8872,26 +8807,23 @@
             </a:spcAft>
             <a:buChar char="•"/>
           </a:pPr>
-          <a:r>
-            <a:rPr lang="nl-NL" sz="700" kern="1200"/>
-            <a:t>Over wat ik denk dat er uit mijn onderzoek zal komen</a:t>
-          </a:r>
+          <a:endParaRPr lang="nl-NL" sz="900" kern="1200"/>
         </a:p>
       </dsp:txBody>
       <dsp:txXfrm>
-        <a:off x="0" y="1651427"/>
-        <a:ext cx="9658985" cy="325298"/>
+        <a:off x="0" y="2327541"/>
+        <a:ext cx="9658985" cy="457920"/>
       </dsp:txXfrm>
     </dsp:sp>
-    <dsp:sp modelId="{91D9B644-7EA5-4262-9749-6B0E185D3352}">
+    <dsp:sp modelId="{0EE58AFD-5D76-427B-A339-EEF7E88F102D}">
       <dsp:nvSpPr>
         <dsp:cNvPr id="0" name=""/>
         <dsp:cNvSpPr/>
       </dsp:nvSpPr>
       <dsp:spPr>
         <a:xfrm>
-          <a:off x="2511336" y="1984857"/>
-          <a:ext cx="7147648" cy="162624"/>
+          <a:off x="2511336" y="2796908"/>
+          <a:ext cx="7147648" cy="228925"/>
         </a:xfrm>
         <a:prstGeom prst="rect">
           <a:avLst/>
@@ -8915,12 +8847,12 @@
         <a:fontRef idx="minor"/>
       </dsp:style>
       <dsp:txBody>
-        <a:bodyPr spcFirstLastPara="0" vert="horz" wrap="square" lIns="17145" tIns="17145" rIns="17145" bIns="17145" numCol="1" spcCol="1270" anchor="b" anchorCtr="0">
+        <a:bodyPr spcFirstLastPara="0" vert="horz" wrap="square" lIns="22860" tIns="22860" rIns="22860" bIns="22860" numCol="1" spcCol="1270" anchor="b" anchorCtr="0">
           <a:noAutofit/>
         </a:bodyPr>
         <a:lstStyle/>
         <a:p>
-          <a:pPr marL="0" lvl="0" indent="0" algn="l" defTabSz="400050">
+          <a:pPr marL="0" lvl="0" indent="0" algn="l" defTabSz="533400">
             <a:lnSpc>
               <a:spcPct val="90000"/>
             </a:lnSpc>
@@ -8932,23 +8864,23 @@
             </a:spcAft>
             <a:buNone/>
           </a:pPr>
-          <a:endParaRPr lang="nl-NL" sz="900" kern="1200"/>
+          <a:endParaRPr lang="nl-NL" sz="1200" kern="1200"/>
         </a:p>
       </dsp:txBody>
       <dsp:txXfrm>
-        <a:off x="2511336" y="1984857"/>
-        <a:ext cx="7147648" cy="162624"/>
+        <a:off x="2511336" y="2796908"/>
+        <a:ext cx="7147648" cy="228925"/>
       </dsp:txXfrm>
     </dsp:sp>
-    <dsp:sp modelId="{84AE48BC-DA1D-40BA-8F88-E274C7CD9EF6}">
+    <dsp:sp modelId="{DE2677DB-D70B-4D3E-8A29-A769C3568B51}">
       <dsp:nvSpPr>
         <dsp:cNvPr id="0" name=""/>
         <dsp:cNvSpPr/>
       </dsp:nvSpPr>
       <dsp:spPr>
         <a:xfrm>
-          <a:off x="0" y="1984857"/>
-          <a:ext cx="2511336" cy="162624"/>
+          <a:off x="0" y="2796908"/>
+          <a:ext cx="2511336" cy="228925"/>
         </a:xfrm>
         <a:prstGeom prst="round2SameRect">
           <a:avLst>
@@ -8992,12 +8924,12 @@
         </a:fontRef>
       </dsp:style>
       <dsp:txBody>
-        <a:bodyPr spcFirstLastPara="0" vert="horz" wrap="square" lIns="17145" tIns="17145" rIns="17145" bIns="17145" numCol="1" spcCol="1270" anchor="ctr" anchorCtr="0">
+        <a:bodyPr spcFirstLastPara="0" vert="horz" wrap="square" lIns="22860" tIns="22860" rIns="22860" bIns="22860" numCol="1" spcCol="1270" anchor="ctr" anchorCtr="0">
           <a:noAutofit/>
         </a:bodyPr>
         <a:lstStyle/>
         <a:p>
-          <a:pPr marL="0" lvl="0" indent="0" algn="ctr" defTabSz="400050">
+          <a:pPr marL="0" lvl="0" indent="0" algn="ctr" defTabSz="533400">
             <a:lnSpc>
               <a:spcPct val="90000"/>
             </a:lnSpc>
@@ -9010,25 +8942,25 @@
             <a:buNone/>
           </a:pPr>
           <a:r>
-            <a:rPr lang="nl-NL" sz="900" kern="1200"/>
-            <a:t>Materiaal</a:t>
+            <a:rPr lang="nl-NL" sz="1200" kern="1200"/>
+            <a:t>Resultaten</a:t>
           </a:r>
         </a:p>
       </dsp:txBody>
       <dsp:txXfrm>
-        <a:off x="7940" y="1992797"/>
-        <a:ext cx="2495456" cy="154684"/>
+        <a:off x="11177" y="2808085"/>
+        <a:ext cx="2488982" cy="217748"/>
       </dsp:txXfrm>
     </dsp:sp>
-    <dsp:sp modelId="{0EDA52D8-B2F3-49C3-91C1-650682A2A143}">
+    <dsp:sp modelId="{EAD70D50-8109-4941-A13C-2B261DD10D12}">
       <dsp:nvSpPr>
         <dsp:cNvPr id="0" name=""/>
         <dsp:cNvSpPr/>
       </dsp:nvSpPr>
       <dsp:spPr>
         <a:xfrm>
-          <a:off x="0" y="2147482"/>
-          <a:ext cx="9658985" cy="325298"/>
+          <a:off x="0" y="3025834"/>
+          <a:ext cx="9658985" cy="457920"/>
         </a:xfrm>
         <a:prstGeom prst="rect">
           <a:avLst/>
@@ -9052,12 +8984,12 @@
         <a:fontRef idx="minor"/>
       </dsp:style>
       <dsp:txBody>
-        <a:bodyPr spcFirstLastPara="0" vert="horz" wrap="square" lIns="17145" tIns="17145" rIns="17145" bIns="17145" numCol="1" spcCol="1270" anchor="t" anchorCtr="0">
+        <a:bodyPr spcFirstLastPara="0" vert="horz" wrap="square" lIns="22860" tIns="22860" rIns="22860" bIns="22860" numCol="1" spcCol="1270" anchor="t" anchorCtr="0">
           <a:noAutofit/>
         </a:bodyPr>
         <a:lstStyle/>
         <a:p>
-          <a:pPr marL="57150" lvl="1" indent="-57150" algn="l" defTabSz="311150">
+          <a:pPr marL="57150" lvl="1" indent="-57150" algn="l" defTabSz="400050">
             <a:lnSpc>
               <a:spcPct val="90000"/>
             </a:lnSpc>
@@ -9069,26 +9001,23 @@
             </a:spcAft>
             <a:buChar char="•"/>
           </a:pPr>
-          <a:r>
-            <a:rPr lang="nl-NL" sz="700" kern="1200"/>
-            <a:t>Over waar de raket van gemaakt is</a:t>
-          </a:r>
+          <a:endParaRPr lang="nl-NL" sz="900" kern="1200"/>
         </a:p>
       </dsp:txBody>
       <dsp:txXfrm>
-        <a:off x="0" y="2147482"/>
-        <a:ext cx="9658985" cy="325298"/>
+        <a:off x="0" y="3025834"/>
+        <a:ext cx="9658985" cy="457920"/>
       </dsp:txXfrm>
     </dsp:sp>
-    <dsp:sp modelId="{E23D76BD-9B7B-4255-9A94-253A99336C15}">
+    <dsp:sp modelId="{2B8963A4-3F80-476E-BA4E-A2D705B3B4A3}">
       <dsp:nvSpPr>
         <dsp:cNvPr id="0" name=""/>
         <dsp:cNvSpPr/>
       </dsp:nvSpPr>
       <dsp:spPr>
         <a:xfrm>
-          <a:off x="2511336" y="2480912"/>
-          <a:ext cx="7147648" cy="162624"/>
+          <a:off x="2511336" y="3495201"/>
+          <a:ext cx="7147648" cy="228925"/>
         </a:xfrm>
         <a:prstGeom prst="rect">
           <a:avLst/>
@@ -9112,12 +9041,12 @@
         <a:fontRef idx="minor"/>
       </dsp:style>
       <dsp:txBody>
-        <a:bodyPr spcFirstLastPara="0" vert="horz" wrap="square" lIns="17145" tIns="17145" rIns="17145" bIns="17145" numCol="1" spcCol="1270" anchor="b" anchorCtr="0">
+        <a:bodyPr spcFirstLastPara="0" vert="horz" wrap="square" lIns="22860" tIns="22860" rIns="22860" bIns="22860" numCol="1" spcCol="1270" anchor="b" anchorCtr="0">
           <a:noAutofit/>
         </a:bodyPr>
         <a:lstStyle/>
         <a:p>
-          <a:pPr marL="0" lvl="0" indent="0" algn="l" defTabSz="400050">
+          <a:pPr marL="0" lvl="0" indent="0" algn="l" defTabSz="533400">
             <a:lnSpc>
               <a:spcPct val="90000"/>
             </a:lnSpc>
@@ -9129,23 +9058,23 @@
             </a:spcAft>
             <a:buNone/>
           </a:pPr>
-          <a:endParaRPr lang="nl-NL" sz="900" kern="1200"/>
+          <a:endParaRPr lang="nl-NL" sz="1200" kern="1200"/>
         </a:p>
       </dsp:txBody>
       <dsp:txXfrm>
-        <a:off x="2511336" y="2480912"/>
-        <a:ext cx="7147648" cy="162624"/>
+        <a:off x="2511336" y="3495201"/>
+        <a:ext cx="7147648" cy="228925"/>
       </dsp:txXfrm>
     </dsp:sp>
-    <dsp:sp modelId="{3702427B-65FD-4B5E-979C-884E0D9FDFDB}">
+    <dsp:sp modelId="{CC2DBB29-65F7-40B6-B2EF-C74BC43B1881}">
       <dsp:nvSpPr>
         <dsp:cNvPr id="0" name=""/>
         <dsp:cNvSpPr/>
       </dsp:nvSpPr>
       <dsp:spPr>
         <a:xfrm>
-          <a:off x="0" y="2480912"/>
-          <a:ext cx="2511336" cy="162624"/>
+          <a:off x="0" y="3495201"/>
+          <a:ext cx="2511336" cy="228925"/>
         </a:xfrm>
         <a:prstGeom prst="round2SameRect">
           <a:avLst>
@@ -9189,12 +9118,12 @@
         </a:fontRef>
       </dsp:style>
       <dsp:txBody>
-        <a:bodyPr spcFirstLastPara="0" vert="horz" wrap="square" lIns="17145" tIns="17145" rIns="17145" bIns="17145" numCol="1" spcCol="1270" anchor="ctr" anchorCtr="0">
+        <a:bodyPr spcFirstLastPara="0" vert="horz" wrap="square" lIns="22860" tIns="22860" rIns="22860" bIns="22860" numCol="1" spcCol="1270" anchor="ctr" anchorCtr="0">
           <a:noAutofit/>
         </a:bodyPr>
         <a:lstStyle/>
         <a:p>
-          <a:pPr marL="0" lvl="0" indent="0" algn="ctr" defTabSz="400050">
+          <a:pPr marL="0" lvl="0" indent="0" algn="ctr" defTabSz="533400">
             <a:lnSpc>
               <a:spcPct val="90000"/>
             </a:lnSpc>
@@ -9207,25 +9136,25 @@
             <a:buNone/>
           </a:pPr>
           <a:r>
-            <a:rPr lang="nl-NL" sz="900" kern="1200"/>
-            <a:t>Methode</a:t>
+            <a:rPr lang="nl-NL" sz="1200" kern="1200"/>
+            <a:t>Conclusie</a:t>
           </a:r>
         </a:p>
       </dsp:txBody>
       <dsp:txXfrm>
-        <a:off x="7940" y="2488852"/>
-        <a:ext cx="2495456" cy="154684"/>
+        <a:off x="11177" y="3506378"/>
+        <a:ext cx="2488982" cy="217748"/>
       </dsp:txXfrm>
     </dsp:sp>
-    <dsp:sp modelId="{B9177805-0EEA-4CA0-A4DA-A3DEDD5890CC}">
+    <dsp:sp modelId="{CDF3D050-6784-48D6-94CF-6E6691096B81}">
       <dsp:nvSpPr>
         <dsp:cNvPr id="0" name=""/>
         <dsp:cNvSpPr/>
       </dsp:nvSpPr>
       <dsp:spPr>
         <a:xfrm>
-          <a:off x="0" y="2643537"/>
-          <a:ext cx="9658985" cy="325298"/>
+          <a:off x="0" y="3724127"/>
+          <a:ext cx="9658985" cy="457920"/>
         </a:xfrm>
         <a:prstGeom prst="rect">
           <a:avLst/>
@@ -9249,12 +9178,12 @@
         <a:fontRef idx="minor"/>
       </dsp:style>
       <dsp:txBody>
-        <a:bodyPr spcFirstLastPara="0" vert="horz" wrap="square" lIns="17145" tIns="17145" rIns="17145" bIns="17145" numCol="1" spcCol="1270" anchor="t" anchorCtr="0">
+        <a:bodyPr spcFirstLastPara="0" vert="horz" wrap="square" lIns="22860" tIns="22860" rIns="22860" bIns="22860" numCol="1" spcCol="1270" anchor="t" anchorCtr="0">
           <a:noAutofit/>
         </a:bodyPr>
         <a:lstStyle/>
         <a:p>
-          <a:pPr marL="57150" lvl="1" indent="-57150" algn="l" defTabSz="311150">
+          <a:pPr marL="57150" lvl="1" indent="-57150" algn="l" defTabSz="400050">
             <a:lnSpc>
               <a:spcPct val="90000"/>
             </a:lnSpc>
@@ -9266,26 +9195,23 @@
             </a:spcAft>
             <a:buChar char="•"/>
           </a:pPr>
-          <a:r>
-            <a:rPr lang="nl-NL" sz="700" kern="1200"/>
-            <a:t>Over hoe ik het onderzoek PRECIES ga doen</a:t>
-          </a:r>
+          <a:endParaRPr lang="nl-NL" sz="900" kern="1200"/>
         </a:p>
       </dsp:txBody>
       <dsp:txXfrm>
-        <a:off x="0" y="2643537"/>
-        <a:ext cx="9658985" cy="325298"/>
+        <a:off x="0" y="3724127"/>
+        <a:ext cx="9658985" cy="457920"/>
       </dsp:txXfrm>
     </dsp:sp>
-    <dsp:sp modelId="{0EE58AFD-5D76-427B-A339-EEF7E88F102D}">
+    <dsp:sp modelId="{D454878E-0E20-471D-8E9E-99F3CE89948C}">
       <dsp:nvSpPr>
         <dsp:cNvPr id="0" name=""/>
         <dsp:cNvSpPr/>
       </dsp:nvSpPr>
       <dsp:spPr>
         <a:xfrm>
-          <a:off x="2511336" y="2976967"/>
-          <a:ext cx="7147648" cy="162624"/>
+          <a:off x="2511336" y="4193493"/>
+          <a:ext cx="7147648" cy="228925"/>
         </a:xfrm>
         <a:prstGeom prst="rect">
           <a:avLst/>
@@ -9309,12 +9235,12 @@
         <a:fontRef idx="minor"/>
       </dsp:style>
       <dsp:txBody>
-        <a:bodyPr spcFirstLastPara="0" vert="horz" wrap="square" lIns="17145" tIns="17145" rIns="17145" bIns="17145" numCol="1" spcCol="1270" anchor="b" anchorCtr="0">
+        <a:bodyPr spcFirstLastPara="0" vert="horz" wrap="square" lIns="22860" tIns="22860" rIns="22860" bIns="22860" numCol="1" spcCol="1270" anchor="b" anchorCtr="0">
           <a:noAutofit/>
         </a:bodyPr>
         <a:lstStyle/>
         <a:p>
-          <a:pPr marL="0" lvl="0" indent="0" algn="l" defTabSz="400050">
+          <a:pPr marL="0" lvl="0" indent="0" algn="l" defTabSz="533400">
             <a:lnSpc>
               <a:spcPct val="90000"/>
             </a:lnSpc>
@@ -9326,23 +9252,23 @@
             </a:spcAft>
             <a:buNone/>
           </a:pPr>
-          <a:endParaRPr lang="nl-NL" sz="900" kern="1200"/>
+          <a:endParaRPr lang="nl-NL" sz="1200" kern="1200"/>
         </a:p>
       </dsp:txBody>
       <dsp:txXfrm>
-        <a:off x="2511336" y="2976967"/>
-        <a:ext cx="7147648" cy="162624"/>
+        <a:off x="2511336" y="4193493"/>
+        <a:ext cx="7147648" cy="228925"/>
       </dsp:txXfrm>
     </dsp:sp>
-    <dsp:sp modelId="{DE2677DB-D70B-4D3E-8A29-A769C3568B51}">
+    <dsp:sp modelId="{8FE37526-D54B-475C-A1B1-5E20AE6E3E44}">
       <dsp:nvSpPr>
         <dsp:cNvPr id="0" name=""/>
         <dsp:cNvSpPr/>
       </dsp:nvSpPr>
       <dsp:spPr>
         <a:xfrm>
-          <a:off x="0" y="2976967"/>
-          <a:ext cx="2511336" cy="162624"/>
+          <a:off x="0" y="4193493"/>
+          <a:ext cx="2511336" cy="228925"/>
         </a:xfrm>
         <a:prstGeom prst="round2SameRect">
           <a:avLst>
@@ -9386,12 +9312,12 @@
         </a:fontRef>
       </dsp:style>
       <dsp:txBody>
-        <a:bodyPr spcFirstLastPara="0" vert="horz" wrap="square" lIns="17145" tIns="17145" rIns="17145" bIns="17145" numCol="1" spcCol="1270" anchor="ctr" anchorCtr="0">
+        <a:bodyPr spcFirstLastPara="0" vert="horz" wrap="square" lIns="22860" tIns="22860" rIns="22860" bIns="22860" numCol="1" spcCol="1270" anchor="ctr" anchorCtr="0">
           <a:noAutofit/>
         </a:bodyPr>
         <a:lstStyle/>
         <a:p>
-          <a:pPr marL="0" lvl="0" indent="0" algn="ctr" defTabSz="400050">
+          <a:pPr marL="0" lvl="0" indent="0" algn="ctr" defTabSz="533400">
             <a:lnSpc>
               <a:spcPct val="90000"/>
             </a:lnSpc>
@@ -9404,25 +9330,25 @@
             <a:buNone/>
           </a:pPr>
           <a:r>
-            <a:rPr lang="nl-NL" sz="900" kern="1200"/>
-            <a:t>Resultaat</a:t>
+            <a:rPr lang="nl-NL" sz="1200" kern="1200"/>
+            <a:t>Discussie</a:t>
           </a:r>
         </a:p>
       </dsp:txBody>
       <dsp:txXfrm>
-        <a:off x="7940" y="2984907"/>
-        <a:ext cx="2495456" cy="154684"/>
+        <a:off x="11177" y="4204670"/>
+        <a:ext cx="2488982" cy="217748"/>
       </dsp:txXfrm>
     </dsp:sp>
-    <dsp:sp modelId="{6C89E044-15C9-480C-812F-B9FFE4EC7A82}">
+    <dsp:sp modelId="{3D3AC76A-F12C-419B-8A6A-479DEDD91A5E}">
       <dsp:nvSpPr>
         <dsp:cNvPr id="0" name=""/>
         <dsp:cNvSpPr/>
       </dsp:nvSpPr>
       <dsp:spPr>
         <a:xfrm>
-          <a:off x="0" y="3139592"/>
-          <a:ext cx="9658985" cy="325298"/>
+          <a:off x="0" y="4422419"/>
+          <a:ext cx="9658985" cy="457920"/>
         </a:xfrm>
         <a:prstGeom prst="rect">
           <a:avLst/>
@@ -9446,12 +9372,12 @@
         <a:fontRef idx="minor"/>
       </dsp:style>
       <dsp:txBody>
-        <a:bodyPr spcFirstLastPara="0" vert="horz" wrap="square" lIns="17145" tIns="17145" rIns="17145" bIns="17145" numCol="1" spcCol="1270" anchor="t" anchorCtr="0">
+        <a:bodyPr spcFirstLastPara="0" vert="horz" wrap="square" lIns="22860" tIns="22860" rIns="22860" bIns="22860" numCol="1" spcCol="1270" anchor="t" anchorCtr="0">
           <a:noAutofit/>
         </a:bodyPr>
         <a:lstStyle/>
         <a:p>
-          <a:pPr marL="57150" lvl="1" indent="-57150" algn="l" defTabSz="311150">
+          <a:pPr marL="57150" lvl="1" indent="-57150" algn="l" defTabSz="400050">
             <a:lnSpc>
               <a:spcPct val="90000"/>
             </a:lnSpc>
@@ -9463,26 +9389,23 @@
             </a:spcAft>
             <a:buChar char="•"/>
           </a:pPr>
-          <a:r>
-            <a:rPr lang="nl-NL" sz="700" kern="1200"/>
-            <a:t>Over wat er uit mijn onderzoek is gekomen</a:t>
-          </a:r>
+          <a:endParaRPr lang="nl-NL" sz="900" kern="1200"/>
         </a:p>
       </dsp:txBody>
       <dsp:txXfrm>
-        <a:off x="0" y="3139592"/>
-        <a:ext cx="9658985" cy="325298"/>
+        <a:off x="0" y="4422419"/>
+        <a:ext cx="9658985" cy="457920"/>
       </dsp:txXfrm>
     </dsp:sp>
-    <dsp:sp modelId="{2B8963A4-3F80-476E-BA4E-A2D705B3B4A3}">
+    <dsp:sp modelId="{605FBAFD-7EA1-4EA4-8B82-CD1C3234DEC5}">
       <dsp:nvSpPr>
         <dsp:cNvPr id="0" name=""/>
         <dsp:cNvSpPr/>
       </dsp:nvSpPr>
       <dsp:spPr>
         <a:xfrm>
-          <a:off x="2511336" y="3473022"/>
-          <a:ext cx="7147648" cy="162624"/>
+          <a:off x="2511336" y="4891786"/>
+          <a:ext cx="7147648" cy="228925"/>
         </a:xfrm>
         <a:prstGeom prst="rect">
           <a:avLst/>
@@ -9506,12 +9429,12 @@
         <a:fontRef idx="minor"/>
       </dsp:style>
       <dsp:txBody>
-        <a:bodyPr spcFirstLastPara="0" vert="horz" wrap="square" lIns="17145" tIns="17145" rIns="17145" bIns="17145" numCol="1" spcCol="1270" anchor="b" anchorCtr="0">
+        <a:bodyPr spcFirstLastPara="0" vert="horz" wrap="square" lIns="22860" tIns="22860" rIns="22860" bIns="22860" numCol="1" spcCol="1270" anchor="b" anchorCtr="0">
           <a:noAutofit/>
         </a:bodyPr>
         <a:lstStyle/>
         <a:p>
-          <a:pPr marL="0" lvl="0" indent="0" algn="l" defTabSz="400050">
+          <a:pPr marL="0" lvl="0" indent="0" algn="l" defTabSz="533400">
             <a:lnSpc>
               <a:spcPct val="90000"/>
             </a:lnSpc>
@@ -9523,23 +9446,23 @@
             </a:spcAft>
             <a:buNone/>
           </a:pPr>
-          <a:endParaRPr lang="nl-NL" sz="900" kern="1200"/>
+          <a:endParaRPr lang="nl-NL" sz="1200" kern="1200"/>
         </a:p>
       </dsp:txBody>
       <dsp:txXfrm>
-        <a:off x="2511336" y="3473022"/>
-        <a:ext cx="7147648" cy="162624"/>
+        <a:off x="2511336" y="4891786"/>
+        <a:ext cx="7147648" cy="228925"/>
       </dsp:txXfrm>
     </dsp:sp>
-    <dsp:sp modelId="{CC2DBB29-65F7-40B6-B2EF-C74BC43B1881}">
+    <dsp:sp modelId="{73050604-3250-4039-B6B4-21989449E22C}">
       <dsp:nvSpPr>
         <dsp:cNvPr id="0" name=""/>
         <dsp:cNvSpPr/>
       </dsp:nvSpPr>
       <dsp:spPr>
         <a:xfrm>
-          <a:off x="0" y="3473022"/>
-          <a:ext cx="2511336" cy="162624"/>
+          <a:off x="0" y="4891786"/>
+          <a:ext cx="2511336" cy="228925"/>
         </a:xfrm>
         <a:prstGeom prst="round2SameRect">
           <a:avLst>
@@ -9583,12 +9506,12 @@
         </a:fontRef>
       </dsp:style>
       <dsp:txBody>
-        <a:bodyPr spcFirstLastPara="0" vert="horz" wrap="square" lIns="17145" tIns="17145" rIns="17145" bIns="17145" numCol="1" spcCol="1270" anchor="ctr" anchorCtr="0">
+        <a:bodyPr spcFirstLastPara="0" vert="horz" wrap="square" lIns="22860" tIns="22860" rIns="22860" bIns="22860" numCol="1" spcCol="1270" anchor="ctr" anchorCtr="0">
           <a:noAutofit/>
         </a:bodyPr>
         <a:lstStyle/>
         <a:p>
-          <a:pPr marL="0" lvl="0" indent="0" algn="ctr" defTabSz="400050">
+          <a:pPr marL="0" lvl="0" indent="0" algn="ctr" defTabSz="533400">
             <a:lnSpc>
               <a:spcPct val="90000"/>
             </a:lnSpc>
@@ -9601,577 +9524,14 @@
             <a:buNone/>
           </a:pPr>
           <a:r>
-            <a:rPr lang="nl-NL" sz="900" kern="1200"/>
-            <a:t>Conclusie</a:t>
-          </a:r>
-        </a:p>
-      </dsp:txBody>
-      <dsp:txXfrm>
-        <a:off x="7940" y="3480962"/>
-        <a:ext cx="2495456" cy="154684"/>
-      </dsp:txXfrm>
-    </dsp:sp>
-    <dsp:sp modelId="{1868F4D9-1C89-4118-8485-7DE0BE6CB50F}">
-      <dsp:nvSpPr>
-        <dsp:cNvPr id="0" name=""/>
-        <dsp:cNvSpPr/>
-      </dsp:nvSpPr>
-      <dsp:spPr>
-        <a:xfrm>
-          <a:off x="0" y="3635647"/>
-          <a:ext cx="9658985" cy="325298"/>
-        </a:xfrm>
-        <a:prstGeom prst="rect">
-          <a:avLst/>
-        </a:prstGeom>
-        <a:noFill/>
-        <a:ln>
-          <a:noFill/>
-        </a:ln>
-        <a:effectLst/>
-      </dsp:spPr>
-      <dsp:style>
-        <a:lnRef idx="0">
-          <a:scrgbClr r="0" g="0" b="0"/>
-        </a:lnRef>
-        <a:fillRef idx="0">
-          <a:scrgbClr r="0" g="0" b="0"/>
-        </a:fillRef>
-        <a:effectRef idx="0">
-          <a:scrgbClr r="0" g="0" b="0"/>
-        </a:effectRef>
-        <a:fontRef idx="minor"/>
-      </dsp:style>
-      <dsp:txBody>
-        <a:bodyPr spcFirstLastPara="0" vert="horz" wrap="square" lIns="17145" tIns="17145" rIns="17145" bIns="17145" numCol="1" spcCol="1270" anchor="t" anchorCtr="0">
-          <a:noAutofit/>
-        </a:bodyPr>
-        <a:lstStyle/>
-        <a:p>
-          <a:pPr marL="57150" lvl="1" indent="-57150" algn="l" defTabSz="311150">
-            <a:lnSpc>
-              <a:spcPct val="90000"/>
-            </a:lnSpc>
-            <a:spcBef>
-              <a:spcPct val="0"/>
-            </a:spcBef>
-            <a:spcAft>
-              <a:spcPct val="15000"/>
-            </a:spcAft>
-            <a:buChar char="•"/>
-          </a:pPr>
-          <a:r>
-            <a:rPr lang="nl-NL" sz="700" kern="1200"/>
-            <a:t>Over wat ik denk dat mijn resultaten betekenen</a:t>
-          </a:r>
-        </a:p>
-      </dsp:txBody>
-      <dsp:txXfrm>
-        <a:off x="0" y="3635647"/>
-        <a:ext cx="9658985" cy="325298"/>
-      </dsp:txXfrm>
-    </dsp:sp>
-    <dsp:sp modelId="{D454878E-0E20-471D-8E9E-99F3CE89948C}">
-      <dsp:nvSpPr>
-        <dsp:cNvPr id="0" name=""/>
-        <dsp:cNvSpPr/>
-      </dsp:nvSpPr>
-      <dsp:spPr>
-        <a:xfrm>
-          <a:off x="2511336" y="3969077"/>
-          <a:ext cx="7147648" cy="162624"/>
-        </a:xfrm>
-        <a:prstGeom prst="rect">
-          <a:avLst/>
-        </a:prstGeom>
-        <a:noFill/>
-        <a:ln>
-          <a:noFill/>
-        </a:ln>
-        <a:effectLst/>
-      </dsp:spPr>
-      <dsp:style>
-        <a:lnRef idx="0">
-          <a:scrgbClr r="0" g="0" b="0"/>
-        </a:lnRef>
-        <a:fillRef idx="0">
-          <a:scrgbClr r="0" g="0" b="0"/>
-        </a:fillRef>
-        <a:effectRef idx="0">
-          <a:scrgbClr r="0" g="0" b="0"/>
-        </a:effectRef>
-        <a:fontRef idx="minor"/>
-      </dsp:style>
-      <dsp:txBody>
-        <a:bodyPr spcFirstLastPara="0" vert="horz" wrap="square" lIns="17145" tIns="17145" rIns="17145" bIns="17145" numCol="1" spcCol="1270" anchor="b" anchorCtr="0">
-          <a:noAutofit/>
-        </a:bodyPr>
-        <a:lstStyle/>
-        <a:p>
-          <a:pPr marL="0" lvl="0" indent="0" algn="l" defTabSz="400050">
-            <a:lnSpc>
-              <a:spcPct val="90000"/>
-            </a:lnSpc>
-            <a:spcBef>
-              <a:spcPct val="0"/>
-            </a:spcBef>
-            <a:spcAft>
-              <a:spcPct val="35000"/>
-            </a:spcAft>
-            <a:buNone/>
-          </a:pPr>
-          <a:endParaRPr lang="nl-NL" sz="900" kern="1200"/>
-        </a:p>
-      </dsp:txBody>
-      <dsp:txXfrm>
-        <a:off x="2511336" y="3969077"/>
-        <a:ext cx="7147648" cy="162624"/>
-      </dsp:txXfrm>
-    </dsp:sp>
-    <dsp:sp modelId="{8FE37526-D54B-475C-A1B1-5E20AE6E3E44}">
-      <dsp:nvSpPr>
-        <dsp:cNvPr id="0" name=""/>
-        <dsp:cNvSpPr/>
-      </dsp:nvSpPr>
-      <dsp:spPr>
-        <a:xfrm>
-          <a:off x="0" y="3969077"/>
-          <a:ext cx="2511336" cy="162624"/>
-        </a:xfrm>
-        <a:prstGeom prst="round2SameRect">
-          <a:avLst>
-            <a:gd name="adj1" fmla="val 16670"/>
-            <a:gd name="adj2" fmla="val 0"/>
-          </a:avLst>
-        </a:prstGeom>
-        <a:solidFill>
-          <a:schemeClr val="accent1">
-            <a:hueOff val="0"/>
-            <a:satOff val="0"/>
-            <a:lumOff val="0"/>
-            <a:alphaOff val="0"/>
-          </a:schemeClr>
-        </a:solidFill>
-        <a:ln w="25400" cap="flat" cmpd="sng" algn="ctr">
-          <a:solidFill>
-            <a:schemeClr val="accent1">
-              <a:hueOff val="0"/>
-              <a:satOff val="0"/>
-              <a:lumOff val="0"/>
-              <a:alphaOff val="0"/>
-            </a:schemeClr>
-          </a:solidFill>
-          <a:prstDash val="solid"/>
-        </a:ln>
-        <a:effectLst/>
-      </dsp:spPr>
-      <dsp:style>
-        <a:lnRef idx="2">
-          <a:scrgbClr r="0" g="0" b="0"/>
-        </a:lnRef>
-        <a:fillRef idx="1">
-          <a:scrgbClr r="0" g="0" b="0"/>
-        </a:fillRef>
-        <a:effectRef idx="0">
-          <a:scrgbClr r="0" g="0" b="0"/>
-        </a:effectRef>
-        <a:fontRef idx="minor">
-          <a:schemeClr val="lt1"/>
-        </a:fontRef>
-      </dsp:style>
-      <dsp:txBody>
-        <a:bodyPr spcFirstLastPara="0" vert="horz" wrap="square" lIns="17145" tIns="17145" rIns="17145" bIns="17145" numCol="1" spcCol="1270" anchor="ctr" anchorCtr="0">
-          <a:noAutofit/>
-        </a:bodyPr>
-        <a:lstStyle/>
-        <a:p>
-          <a:pPr marL="0" lvl="0" indent="0" algn="ctr" defTabSz="400050">
-            <a:lnSpc>
-              <a:spcPct val="90000"/>
-            </a:lnSpc>
-            <a:spcBef>
-              <a:spcPct val="0"/>
-            </a:spcBef>
-            <a:spcAft>
-              <a:spcPct val="35000"/>
-            </a:spcAft>
-            <a:buNone/>
-          </a:pPr>
-          <a:r>
-            <a:rPr lang="nl-NL" sz="900" kern="1200"/>
-            <a:t>Discussie</a:t>
-          </a:r>
-        </a:p>
-      </dsp:txBody>
-      <dsp:txXfrm>
-        <a:off x="7940" y="3977017"/>
-        <a:ext cx="2495456" cy="154684"/>
-      </dsp:txXfrm>
-    </dsp:sp>
-    <dsp:sp modelId="{12B15CF7-FE48-4F1B-84B8-AD7123298C2B}">
-      <dsp:nvSpPr>
-        <dsp:cNvPr id="0" name=""/>
-        <dsp:cNvSpPr/>
-      </dsp:nvSpPr>
-      <dsp:spPr>
-        <a:xfrm>
-          <a:off x="0" y="4131702"/>
-          <a:ext cx="9658985" cy="325298"/>
-        </a:xfrm>
-        <a:prstGeom prst="rect">
-          <a:avLst/>
-        </a:prstGeom>
-        <a:noFill/>
-        <a:ln>
-          <a:noFill/>
-        </a:ln>
-        <a:effectLst/>
-      </dsp:spPr>
-      <dsp:style>
-        <a:lnRef idx="0">
-          <a:scrgbClr r="0" g="0" b="0"/>
-        </a:lnRef>
-        <a:fillRef idx="0">
-          <a:scrgbClr r="0" g="0" b="0"/>
-        </a:fillRef>
-        <a:effectRef idx="0">
-          <a:scrgbClr r="0" g="0" b="0"/>
-        </a:effectRef>
-        <a:fontRef idx="minor"/>
-      </dsp:style>
-      <dsp:txBody>
-        <a:bodyPr spcFirstLastPara="0" vert="horz" wrap="square" lIns="17145" tIns="17145" rIns="17145" bIns="17145" numCol="1" spcCol="1270" anchor="t" anchorCtr="0">
-          <a:noAutofit/>
-        </a:bodyPr>
-        <a:lstStyle/>
-        <a:p>
-          <a:pPr marL="57150" lvl="1" indent="-57150" algn="l" defTabSz="311150">
-            <a:lnSpc>
-              <a:spcPct val="90000"/>
-            </a:lnSpc>
-            <a:spcBef>
-              <a:spcPct val="0"/>
-            </a:spcBef>
-            <a:spcAft>
-              <a:spcPct val="15000"/>
-            </a:spcAft>
-            <a:buChar char="•"/>
-          </a:pPr>
-          <a:r>
-            <a:rPr lang="nl-NL" sz="700" kern="1200"/>
-            <a:t>Over waarom mijn conclusie fout zou kunnen zijn</a:t>
-          </a:r>
-        </a:p>
-      </dsp:txBody>
-      <dsp:txXfrm>
-        <a:off x="0" y="4131702"/>
-        <a:ext cx="9658985" cy="325298"/>
-      </dsp:txXfrm>
-    </dsp:sp>
-    <dsp:sp modelId="{605FBAFD-7EA1-4EA4-8B82-CD1C3234DEC5}">
-      <dsp:nvSpPr>
-        <dsp:cNvPr id="0" name=""/>
-        <dsp:cNvSpPr/>
-      </dsp:nvSpPr>
-      <dsp:spPr>
-        <a:xfrm>
-          <a:off x="2511336" y="4465132"/>
-          <a:ext cx="7147648" cy="162624"/>
-        </a:xfrm>
-        <a:prstGeom prst="rect">
-          <a:avLst/>
-        </a:prstGeom>
-        <a:noFill/>
-        <a:ln>
-          <a:noFill/>
-        </a:ln>
-        <a:effectLst/>
-      </dsp:spPr>
-      <dsp:style>
-        <a:lnRef idx="0">
-          <a:scrgbClr r="0" g="0" b="0"/>
-        </a:lnRef>
-        <a:fillRef idx="0">
-          <a:scrgbClr r="0" g="0" b="0"/>
-        </a:fillRef>
-        <a:effectRef idx="0">
-          <a:scrgbClr r="0" g="0" b="0"/>
-        </a:effectRef>
-        <a:fontRef idx="minor"/>
-      </dsp:style>
-      <dsp:txBody>
-        <a:bodyPr spcFirstLastPara="0" vert="horz" wrap="square" lIns="17145" tIns="17145" rIns="17145" bIns="17145" numCol="1" spcCol="1270" anchor="b" anchorCtr="0">
-          <a:noAutofit/>
-        </a:bodyPr>
-        <a:lstStyle/>
-        <a:p>
-          <a:pPr marL="0" lvl="0" indent="0" algn="l" defTabSz="400050">
-            <a:lnSpc>
-              <a:spcPct val="90000"/>
-            </a:lnSpc>
-            <a:spcBef>
-              <a:spcPct val="0"/>
-            </a:spcBef>
-            <a:spcAft>
-              <a:spcPct val="35000"/>
-            </a:spcAft>
-            <a:buNone/>
-          </a:pPr>
-          <a:endParaRPr lang="nl-NL" sz="900" kern="1200"/>
-        </a:p>
-      </dsp:txBody>
-      <dsp:txXfrm>
-        <a:off x="2511336" y="4465132"/>
-        <a:ext cx="7147648" cy="162624"/>
-      </dsp:txXfrm>
-    </dsp:sp>
-    <dsp:sp modelId="{73050604-3250-4039-B6B4-21989449E22C}">
-      <dsp:nvSpPr>
-        <dsp:cNvPr id="0" name=""/>
-        <dsp:cNvSpPr/>
-      </dsp:nvSpPr>
-      <dsp:spPr>
-        <a:xfrm>
-          <a:off x="0" y="4465132"/>
-          <a:ext cx="2511336" cy="162624"/>
-        </a:xfrm>
-        <a:prstGeom prst="round2SameRect">
-          <a:avLst>
-            <a:gd name="adj1" fmla="val 16670"/>
-            <a:gd name="adj2" fmla="val 0"/>
-          </a:avLst>
-        </a:prstGeom>
-        <a:solidFill>
-          <a:schemeClr val="accent1">
-            <a:hueOff val="0"/>
-            <a:satOff val="0"/>
-            <a:lumOff val="0"/>
-            <a:alphaOff val="0"/>
-          </a:schemeClr>
-        </a:solidFill>
-        <a:ln w="25400" cap="flat" cmpd="sng" algn="ctr">
-          <a:solidFill>
-            <a:schemeClr val="accent1">
-              <a:hueOff val="0"/>
-              <a:satOff val="0"/>
-              <a:lumOff val="0"/>
-              <a:alphaOff val="0"/>
-            </a:schemeClr>
-          </a:solidFill>
-          <a:prstDash val="solid"/>
-        </a:ln>
-        <a:effectLst/>
-      </dsp:spPr>
-      <dsp:style>
-        <a:lnRef idx="2">
-          <a:scrgbClr r="0" g="0" b="0"/>
-        </a:lnRef>
-        <a:fillRef idx="1">
-          <a:scrgbClr r="0" g="0" b="0"/>
-        </a:fillRef>
-        <a:effectRef idx="0">
-          <a:scrgbClr r="0" g="0" b="0"/>
-        </a:effectRef>
-        <a:fontRef idx="minor">
-          <a:schemeClr val="lt1"/>
-        </a:fontRef>
-      </dsp:style>
-      <dsp:txBody>
-        <a:bodyPr spcFirstLastPara="0" vert="horz" wrap="square" lIns="17145" tIns="17145" rIns="17145" bIns="17145" numCol="1" spcCol="1270" anchor="ctr" anchorCtr="0">
-          <a:noAutofit/>
-        </a:bodyPr>
-        <a:lstStyle/>
-        <a:p>
-          <a:pPr marL="0" lvl="0" indent="0" algn="ctr" defTabSz="400050">
-            <a:lnSpc>
-              <a:spcPct val="90000"/>
-            </a:lnSpc>
-            <a:spcBef>
-              <a:spcPct val="0"/>
-            </a:spcBef>
-            <a:spcAft>
-              <a:spcPct val="35000"/>
-            </a:spcAft>
-            <a:buNone/>
-          </a:pPr>
-          <a:r>
-            <a:rPr lang="nl-NL" sz="900" kern="1200"/>
+            <a:rPr lang="nl-NL" sz="1200" kern="1200"/>
             <a:t>Bronvermelding</a:t>
           </a:r>
         </a:p>
       </dsp:txBody>
       <dsp:txXfrm>
-        <a:off x="7940" y="4473072"/>
-        <a:ext cx="2495456" cy="154684"/>
-      </dsp:txXfrm>
-    </dsp:sp>
-    <dsp:sp modelId="{A86A7049-486F-4F6D-B0E0-46DC545BD141}">
-      <dsp:nvSpPr>
-        <dsp:cNvPr id="0" name=""/>
-        <dsp:cNvSpPr/>
-      </dsp:nvSpPr>
-      <dsp:spPr>
-        <a:xfrm>
-          <a:off x="0" y="4627757"/>
-          <a:ext cx="9658985" cy="325298"/>
-        </a:xfrm>
-        <a:prstGeom prst="rect">
-          <a:avLst/>
-        </a:prstGeom>
-        <a:noFill/>
-        <a:ln>
-          <a:noFill/>
-        </a:ln>
-        <a:effectLst/>
-      </dsp:spPr>
-      <dsp:style>
-        <a:lnRef idx="0">
-          <a:scrgbClr r="0" g="0" b="0"/>
-        </a:lnRef>
-        <a:fillRef idx="0">
-          <a:scrgbClr r="0" g="0" b="0"/>
-        </a:fillRef>
-        <a:effectRef idx="0">
-          <a:scrgbClr r="0" g="0" b="0"/>
-        </a:effectRef>
-        <a:fontRef idx="minor"/>
-      </dsp:style>
-      <dsp:txBody>
-        <a:bodyPr spcFirstLastPara="0" vert="horz" wrap="square" lIns="17145" tIns="17145" rIns="17145" bIns="17145" numCol="1" spcCol="1270" anchor="t" anchorCtr="0">
-          <a:noAutofit/>
-        </a:bodyPr>
-        <a:lstStyle/>
-        <a:p>
-          <a:pPr marL="57150" lvl="1" indent="-57150" algn="l" defTabSz="311150">
-            <a:lnSpc>
-              <a:spcPct val="90000"/>
-            </a:lnSpc>
-            <a:spcBef>
-              <a:spcPct val="0"/>
-            </a:spcBef>
-            <a:spcAft>
-              <a:spcPct val="15000"/>
-            </a:spcAft>
-            <a:buChar char="•"/>
-          </a:pPr>
-          <a:endParaRPr lang="nl-NL" sz="700" kern="1200"/>
-        </a:p>
-      </dsp:txBody>
-      <dsp:txXfrm>
-        <a:off x="0" y="4627757"/>
-        <a:ext cx="9658985" cy="325298"/>
-      </dsp:txXfrm>
-    </dsp:sp>
-    <dsp:sp modelId="{3335CECF-89AF-4269-B52F-2B44089DF289}">
-      <dsp:nvSpPr>
-        <dsp:cNvPr id="0" name=""/>
-        <dsp:cNvSpPr/>
-      </dsp:nvSpPr>
-      <dsp:spPr>
-        <a:xfrm>
-          <a:off x="2511336" y="4961187"/>
-          <a:ext cx="7147648" cy="162624"/>
-        </a:xfrm>
-        <a:prstGeom prst="rect">
-          <a:avLst/>
-        </a:prstGeom>
-        <a:noFill/>
-        <a:ln>
-          <a:noFill/>
-        </a:ln>
-        <a:effectLst/>
-      </dsp:spPr>
-      <dsp:style>
-        <a:lnRef idx="0">
-          <a:scrgbClr r="0" g="0" b="0"/>
-        </a:lnRef>
-        <a:fillRef idx="0">
-          <a:scrgbClr r="0" g="0" b="0"/>
-        </a:fillRef>
-        <a:effectRef idx="0">
-          <a:scrgbClr r="0" g="0" b="0"/>
-        </a:effectRef>
-        <a:fontRef idx="minor"/>
-      </dsp:style>
-    </dsp:sp>
-    <dsp:sp modelId="{CCE21C9B-9066-4697-93E2-C88B2F4CB569}">
-      <dsp:nvSpPr>
-        <dsp:cNvPr id="0" name=""/>
-        <dsp:cNvSpPr/>
-      </dsp:nvSpPr>
-      <dsp:spPr>
-        <a:xfrm>
-          <a:off x="0" y="4961187"/>
-          <a:ext cx="2511336" cy="162624"/>
-        </a:xfrm>
-        <a:prstGeom prst="round2SameRect">
-          <a:avLst>
-            <a:gd name="adj1" fmla="val 16670"/>
-            <a:gd name="adj2" fmla="val 0"/>
-          </a:avLst>
-        </a:prstGeom>
-        <a:solidFill>
-          <a:schemeClr val="accent1">
-            <a:hueOff val="0"/>
-            <a:satOff val="0"/>
-            <a:lumOff val="0"/>
-            <a:alphaOff val="0"/>
-          </a:schemeClr>
-        </a:solidFill>
-        <a:ln w="25400" cap="flat" cmpd="sng" algn="ctr">
-          <a:solidFill>
-            <a:schemeClr val="accent1">
-              <a:hueOff val="0"/>
-              <a:satOff val="0"/>
-              <a:lumOff val="0"/>
-              <a:alphaOff val="0"/>
-            </a:schemeClr>
-          </a:solidFill>
-          <a:prstDash val="solid"/>
-        </a:ln>
-        <a:effectLst/>
-      </dsp:spPr>
-      <dsp:style>
-        <a:lnRef idx="2">
-          <a:scrgbClr r="0" g="0" b="0"/>
-        </a:lnRef>
-        <a:fillRef idx="1">
-          <a:scrgbClr r="0" g="0" b="0"/>
-        </a:fillRef>
-        <a:effectRef idx="0">
-          <a:scrgbClr r="0" g="0" b="0"/>
-        </a:effectRef>
-        <a:fontRef idx="minor">
-          <a:schemeClr val="lt1"/>
-        </a:fontRef>
-      </dsp:style>
-      <dsp:txBody>
-        <a:bodyPr spcFirstLastPara="0" vert="horz" wrap="square" lIns="17145" tIns="17145" rIns="17145" bIns="17145" numCol="1" spcCol="1270" anchor="ctr" anchorCtr="0">
-          <a:noAutofit/>
-        </a:bodyPr>
-        <a:lstStyle/>
-        <a:p>
-          <a:pPr marL="0" lvl="0" indent="0" algn="ctr" defTabSz="400050">
-            <a:lnSpc>
-              <a:spcPct val="90000"/>
-            </a:lnSpc>
-            <a:spcBef>
-              <a:spcPct val="0"/>
-            </a:spcBef>
-            <a:spcAft>
-              <a:spcPct val="35000"/>
-            </a:spcAft>
-            <a:buNone/>
-          </a:pPr>
-          <a:r>
-            <a:rPr lang="nl-NL" sz="900" kern="1200"/>
-            <a:t>einde</a:t>
-          </a:r>
-        </a:p>
-      </dsp:txBody>
-      <dsp:txXfrm>
-        <a:off x="7940" y="4969127"/>
-        <a:ext cx="2495456" cy="154684"/>
+        <a:off x="11177" y="4902963"/>
+        <a:ext cx="2488982" cy="217748"/>
       </dsp:txXfrm>
     </dsp:sp>
   </dsp:spTree>
@@ -11725,6 +11085,7 @@
     <w:rsid w:val="00467931"/>
     <w:rsid w:val="00623858"/>
     <w:rsid w:val="008E4618"/>
+    <w:rsid w:val="009F1278"/>
     <w:rsid w:val="00A33029"/>
     <w:rsid w:val="00AB4DBD"/>
     <w:rsid w:val="00E365B9"/>
@@ -13428,6 +12789,94 @@
 </file>
 
 <file path=customXml/item1.xml><?xml version="1.0" encoding="utf-8"?>
+<b:Sources xmlns:b="http://schemas.openxmlformats.org/officeDocument/2006/bibliography" xmlns="http://schemas.openxmlformats.org/officeDocument/2006/bibliography" SelectedStyle="\APASixthEditionOfficeOnline.xsl" StyleName="APA" Version="6">
+  <b:Source>
+    <b:Tag>bri21</b:Tag>
+    <b:SourceType>InternetSite</b:SourceType>
+    <b:Guid>{ED1782FF-1F14-425F-BC6D-27919EE46022}</b:Guid>
+    <b:Title>Google search results</b:Title>
+    <b:Year>2021</b:Year>
+    <b:Author>
+      <b:Author>
+        <b:NameList>
+          <b:Person>
+            <b:Last>page</b:Last>
+            <b:First>larry</b:First>
+          </b:Person>
+          <b:Person>
+            <b:Last>brin</b:Last>
+            <b:First>sergey</b:First>
+          </b:Person>
+        </b:NameList>
+      </b:Author>
+    </b:Author>
+    <b:InternetSiteTitle>Google.com</b:InternetSiteTitle>
+    <b:Month>Maart</b:Month>
+    <b:Day>28</b:Day>
+    <b:URL>https://www.google.com/search?q=hoe+maak+je+een+waterraket</b:URL>
+    <b:LCID>nl-NL</b:LCID>
+    <b:RefOrder>1</b:RefOrder>
+  </b:Source>
+  <b:Source>
+    <b:Tag>que17</b:Tag>
+    <b:SourceType>InternetSite</b:SourceType>
+    <b:Guid>{131D1F80-FEA3-42C2-9DB6-4D20EBE9D49B}</b:Guid>
+    <b:Author>
+      <b:Author>
+        <b:NameList>
+          <b:Person>
+            <b:Last>questjunior</b:Last>
+          </b:Person>
+        </b:NameList>
+      </b:Author>
+    </b:Author>
+    <b:Title>Hoe kan je met een fles een raket bouwen?</b:Title>
+    <b:InternetSiteTitle>Youtube</b:InternetSiteTitle>
+    <b:Year>2017</b:Year>
+    <b:Month>october</b:Month>
+    <b:Day>18</b:Day>
+    <b:URL>https://www.youtube.com/watch?v=5el3Gz3C0UY</b:URL>
+    <b:RefOrder>2</b:RefOrder>
+  </b:Source>
+  <b:Source>
+    <b:Tag>wat21</b:Tag>
+    <b:SourceType>InternetSite</b:SourceType>
+    <b:Guid>{A8BB1D49-F80D-423A-BC1B-E2FC52F5DF2F}</b:Guid>
+    <b:Title>Wikipedia water rocket</b:Title>
+    <b:InternetSiteTitle>wikipedia</b:InternetSiteTitle>
+    <b:Year>2021</b:Year>
+    <b:Month>january</b:Month>
+    <b:Day>21</b:Day>
+    <b:URL>https://en.wikipedia.org/wiki/Water_rocket</b:URL>
+    <b:RefOrder>3</b:RefOrder>
+  </b:Source>
+  <b:Source>
+    <b:Tag>Ber21</b:Tag>
+    <b:SourceType>Film</b:SourceType>
+    <b:Guid>{9DC2D7EB-F92D-4402-8299-E06EAF2A302B}</b:Guid>
+    <b:Title>Mijn videos van de lanceringen en opnames van de druk in de fles</b:Title>
+    <b:Year>2021</b:Year>
+    <b:Author>
+      <b:Director>
+        <b:NameList>
+          <b:Person>
+            <b:Last>Berntsen</b:Last>
+            <b:First>Ronan</b:First>
+          </b:Person>
+          <b:Person>
+            <b:Last>Mcgeever</b:Last>
+            <b:First>Anna</b:First>
+          </b:Person>
+        </b:NameList>
+      </b:Director>
+    </b:Author>
+    <b:URL>https://drive.google.com/drive/folders/15EyA3YFQfywEcrgkhPjYxRFPICLKvjt7?usp=sharing</b:URL>
+    <b:RefOrder>4</b:RefOrder>
+  </b:Source>
+</b:Sources>
+</file>
+
+<file path=customXml/item2.xml><?xml version="1.0" encoding="utf-8"?>
 <ct:contentTypeSchema xmlns:ct="http://schemas.microsoft.com/office/2006/metadata/contentType" xmlns:ma="http://schemas.microsoft.com/office/2006/metadata/properties/metaAttributes" ct:_="" ma:_="" ma:contentTypeName="Document" ma:contentTypeID="0x01010079F111ED35F8CC479449609E8A0923A6" ma:contentTypeVersion="12" ma:contentTypeDescription="Create a new document." ma:contentTypeScope="" ma:versionID="fa6e671f1cd7e4d96ff9652be322dd5e">
   <xsd:schema xmlns:xsd="http://www.w3.org/2001/XMLSchema" xmlns:xs="http://www.w3.org/2001/XMLSchema" xmlns:p="http://schemas.microsoft.com/office/2006/metadata/properties" xmlns:ns2="71af3243-3dd4-4a8d-8c0d-dd76da1f02a5" xmlns:ns3="16c05727-aa75-4e4a-9b5f-8a80a1165891" targetNamespace="http://schemas.microsoft.com/office/2006/metadata/properties" ma:root="true" ma:fieldsID="4e2496f70b101db0b8013f30a071bbf7" ns2:_="" ns3:_="">
     <xsd:import namespace="71af3243-3dd4-4a8d-8c0d-dd76da1f02a5"/>
@@ -13648,95 +13097,16 @@
 </ct:contentTypeSchema>
 </file>
 
-<file path=customXml/item2.xml><?xml version="1.0" encoding="utf-8"?>
-<b:Sources xmlns:b="http://schemas.openxmlformats.org/officeDocument/2006/bibliography" xmlns="http://schemas.openxmlformats.org/officeDocument/2006/bibliography" SelectedStyle="\APASixthEditionOfficeOnline.xsl" StyleName="APA" Version="6">
-  <b:Source>
-    <b:Tag>bri21</b:Tag>
-    <b:SourceType>InternetSite</b:SourceType>
-    <b:Guid>{ED1782FF-1F14-425F-BC6D-27919EE46022}</b:Guid>
-    <b:Title>Google search results</b:Title>
-    <b:Year>2021</b:Year>
-    <b:Author>
-      <b:Author>
-        <b:NameList>
-          <b:Person>
-            <b:Last>page</b:Last>
-            <b:First>larry</b:First>
-          </b:Person>
-          <b:Person>
-            <b:Last>brin</b:Last>
-            <b:First>sergey</b:First>
-          </b:Person>
-        </b:NameList>
-      </b:Author>
-    </b:Author>
-    <b:InternetSiteTitle>Google.com</b:InternetSiteTitle>
-    <b:Month>Maart</b:Month>
-    <b:Day>28</b:Day>
-    <b:URL>https://www.google.com/search?q=hoe+maak+je+een+waterraket</b:URL>
-    <b:LCID>nl-NL</b:LCID>
-    <b:RefOrder>1</b:RefOrder>
-  </b:Source>
-  <b:Source>
-    <b:Tag>que17</b:Tag>
-    <b:SourceType>InternetSite</b:SourceType>
-    <b:Guid>{131D1F80-FEA3-42C2-9DB6-4D20EBE9D49B}</b:Guid>
-    <b:Author>
-      <b:Author>
-        <b:NameList>
-          <b:Person>
-            <b:Last>questjunior</b:Last>
-          </b:Person>
-        </b:NameList>
-      </b:Author>
-    </b:Author>
-    <b:Title>Hoe kan je met een fles een raket bouwen?</b:Title>
-    <b:InternetSiteTitle>Youtube</b:InternetSiteTitle>
-    <b:Year>2017</b:Year>
-    <b:Month>october</b:Month>
-    <b:Day>18</b:Day>
-    <b:URL>https://www.youtube.com/watch?v=5el3Gz3C0UY</b:URL>
-    <b:RefOrder>2</b:RefOrder>
-  </b:Source>
-  <b:Source>
-    <b:Tag>wat21</b:Tag>
-    <b:SourceType>InternetSite</b:SourceType>
-    <b:Guid>{A8BB1D49-F80D-423A-BC1B-E2FC52F5DF2F}</b:Guid>
-    <b:Title>Wikipedia water rocket</b:Title>
-    <b:InternetSiteTitle>wikipedia</b:InternetSiteTitle>
-    <b:Year>2021</b:Year>
-    <b:Month>january</b:Month>
-    <b:Day>21</b:Day>
-    <b:URL>https://en.wikipedia.org/wiki/Water_rocket</b:URL>
-    <b:RefOrder>3</b:RefOrder>
-  </b:Source>
-  <b:Source>
-    <b:Tag>Ber21</b:Tag>
-    <b:SourceType>Film</b:SourceType>
-    <b:Guid>{9DC2D7EB-F92D-4402-8299-E06EAF2A302B}</b:Guid>
-    <b:Title>Mijn videos van de lanceringen en opnames van de druk in de fles</b:Title>
-    <b:Year>2021</b:Year>
-    <b:Author>
-      <b:Director>
-        <b:NameList>
-          <b:Person>
-            <b:Last>Berntsen</b:Last>
-            <b:First>Ronan</b:First>
-          </b:Person>
-          <b:Person>
-            <b:Last>Mcgeever</b:Last>
-            <b:First>Anna</b:First>
-          </b:Person>
-        </b:NameList>
-      </b:Director>
-    </b:Author>
-    <b:URL>https://drive.google.com/drive/folders/15EyA3YFQfywEcrgkhPjYxRFPICLKvjt7?usp=sharing</b:URL>
-    <b:RefOrder>4</b:RefOrder>
-  </b:Source>
-</b:Sources>
+<file path=customXml/item3.xml><?xml version="1.0" encoding="utf-8"?>
+<p:properties xmlns:p="http://schemas.microsoft.com/office/2006/metadata/properties" xmlns:xsi="http://www.w3.org/2001/XMLSchema-instance" xmlns:pc="http://schemas.microsoft.com/office/infopath/2007/PartnerControls">
+  <documentManagement>
+    <Status xmlns="71af3243-3dd4-4a8d-8c0d-dd76da1f02a5">Not started</Status>
+    <MediaServiceKeyPoints xmlns="71af3243-3dd4-4a8d-8c0d-dd76da1f02a5" xsi:nil="true"/>
+  </documentManagement>
+</p:properties>
 </file>
 
-<file path=customXml/item3.xml><?xml version="1.0" encoding="utf-8"?>
+<file path=customXml/item4.xml><?xml version="1.0" encoding="utf-8"?>
 <?mso-contentType ?>
 <FormTemplates xmlns="http://schemas.microsoft.com/sharepoint/v3/contenttype/forms">
   <Display>DocumentLibraryForm</Display>
@@ -13745,16 +13115,15 @@
 </FormTemplates>
 </file>
 
-<file path=customXml/item4.xml><?xml version="1.0" encoding="utf-8"?>
-<p:properties xmlns:p="http://schemas.microsoft.com/office/2006/metadata/properties" xmlns:xsi="http://www.w3.org/2001/XMLSchema-instance" xmlns:pc="http://schemas.microsoft.com/office/infopath/2007/PartnerControls">
-  <documentManagement>
-    <Status xmlns="71af3243-3dd4-4a8d-8c0d-dd76da1f02a5">Not started</Status>
-    <MediaServiceKeyPoints xmlns="71af3243-3dd4-4a8d-8c0d-dd76da1f02a5" xsi:nil="true"/>
-  </documentManagement>
-</p:properties>
+<file path=customXml/itemProps1.xml><?xml version="1.0" encoding="utf-8"?>
+<ds:datastoreItem xmlns:ds="http://schemas.openxmlformats.org/officeDocument/2006/customXml" ds:itemID="{5A377DEF-C59E-41D3-8EEF-F8EE12F1FC5E}">
+  <ds:schemaRefs>
+    <ds:schemaRef ds:uri="http://schemas.openxmlformats.org/officeDocument/2006/bibliography"/>
+  </ds:schemaRefs>
+</ds:datastoreItem>
 </file>
 
-<file path=customXml/itemProps1.xml><?xml version="1.0" encoding="utf-8"?>
+<file path=customXml/itemProps2.xml><?xml version="1.0" encoding="utf-8"?>
 <ds:datastoreItem xmlns:ds="http://schemas.openxmlformats.org/officeDocument/2006/customXml" ds:itemID="{507D20CB-E94B-44E8-97C3-44BC9C1AF38A}">
   <ds:schemaRefs>
     <ds:schemaRef ds:uri="http://schemas.microsoft.com/office/2006/metadata/contentType"/>
@@ -13773,23 +13142,7 @@
 </ds:datastoreItem>
 </file>
 
-<file path=customXml/itemProps2.xml><?xml version="1.0" encoding="utf-8"?>
-<ds:datastoreItem xmlns:ds="http://schemas.openxmlformats.org/officeDocument/2006/customXml" ds:itemID="{5A377DEF-C59E-41D3-8EEF-F8EE12F1FC5E}">
-  <ds:schemaRefs>
-    <ds:schemaRef ds:uri="http://schemas.openxmlformats.org/officeDocument/2006/bibliography"/>
-  </ds:schemaRefs>
-</ds:datastoreItem>
-</file>
-
 <file path=customXml/itemProps3.xml><?xml version="1.0" encoding="utf-8"?>
-<ds:datastoreItem xmlns:ds="http://schemas.openxmlformats.org/officeDocument/2006/customXml" ds:itemID="{EF425F07-5221-4468-81DD-0F0C28E7FD98}">
-  <ds:schemaRefs>
-    <ds:schemaRef ds:uri="http://schemas.microsoft.com/sharepoint/v3/contenttype/forms"/>
-  </ds:schemaRefs>
-</ds:datastoreItem>
-</file>
-
-<file path=customXml/itemProps4.xml><?xml version="1.0" encoding="utf-8"?>
 <ds:datastoreItem xmlns:ds="http://schemas.openxmlformats.org/officeDocument/2006/customXml" ds:itemID="{57798B56-5215-4AD8-847F-8A1F1C10FD6F}">
   <ds:schemaRefs>
     <ds:schemaRef ds:uri="http://schemas.microsoft.com/office/2006/metadata/properties"/>
@@ -13797,4 +13150,12 @@
     <ds:schemaRef ds:uri="71af3243-3dd4-4a8d-8c0d-dd76da1f02a5"/>
   </ds:schemaRefs>
 </ds:datastoreItem>
+</file>
+
+<file path=customXml/itemProps4.xml><?xml version="1.0" encoding="utf-8"?>
+<ds:datastoreItem xmlns:ds="http://schemas.openxmlformats.org/officeDocument/2006/customXml" ds:itemID="{EF425F07-5221-4468-81DD-0F0C28E7FD98}">
+  <ds:schemaRefs>
+    <ds:schemaRef ds:uri="http://schemas.microsoft.com/sharepoint/v3/contenttype/forms"/>
+  </ds:schemaRefs>
+</ds:datastoreItem>
 </file>
</xml_diff>